<commit_message>
Agrega campos de contacto y plantillas de empresa
</commit_message>
<xml_diff>
--- a/src/main/resources/templates/docgen/1/1.- PROPUESTA DE NEGOCIACIÓN DE CONTRATO COLECTIVO DE TRABAJO.docx
+++ b/src/main/resources/templates/docgen/1/1.- PROPUESTA DE NEGOCIACIÓN DE CONTRATO COLECTIVO DE TRABAJO.docx
@@ -1,6 +1,6 @@
 
 <file path=word/document.xml><?xml version="1.0" encoding="utf-8"?>
-<w:document xmlns:wpc="http://schemas.microsoft.com/office/word/2010/wordprocessingCanvas" xmlns:cx="http://schemas.microsoft.com/office/drawing/2014/chartex" xmlns:cx1="http://schemas.microsoft.com/office/drawing/2015/9/8/chartex" xmlns:cx2="http://schemas.microsoft.com/office/drawing/2015/10/21/chartex" xmlns:cx3="http://schemas.microsoft.com/office/drawing/2016/5/9/chartex" xmlns:cx4="http://schemas.microsoft.com/office/drawing/2016/5/10/chartex" xmlns:cx5="http://schemas.microsoft.com/office/drawing/2016/5/11/chartex" xmlns:cx6="http://schemas.microsoft.com/office/drawing/2016/5/12/chartex" xmlns:cx7="http://schemas.microsoft.com/office/drawing/2016/5/13/chartex" xmlns:cx8="http://schemas.microsoft.com/office/drawing/2016/5/14/chartex" xmlns:mc="http://schemas.openxmlformats.org/markup-compatibility/2006" xmlns:aink="http://schemas.microsoft.com/office/drawing/2016/ink" xmlns:am3d="http://schemas.microsoft.com/office/drawing/2017/model3d" xmlns:o="urn:schemas-microsoft-com:office:office" xmlns:oel="http://schemas.microsoft.com/office/2019/extlst" xmlns:r="http://schemas.openxmlformats.org/officeDocument/2006/relationships" xmlns:m="http://schemas.openxmlformats.org/officeDocument/2006/math" xmlns:v="urn:schemas-microsoft-com:vml" xmlns:wp14="http://schemas.microsoft.com/office/word/2010/wordprocessingDrawing" xmlns:wp="http://schemas.openxmlformats.org/drawingml/2006/wordprocessingDrawing" xmlns:w10="urn:schemas-microsoft-com:office:word" xmlns:w="http://schemas.openxmlformats.org/wordprocessingml/2006/main" xmlns:w14="http://schemas.microsoft.com/office/word/2010/wordml" xmlns:w15="http://schemas.microsoft.com/office/word/2012/wordml" xmlns:w16cex="http://schemas.microsoft.com/office/word/2018/wordml/cex" xmlns:w16cid="http://schemas.microsoft.com/office/word/2016/wordml/cid" xmlns:w16="http://schemas.microsoft.com/office/word/2018/wordml" xmlns:w16du="http://schemas.microsoft.com/office/word/2023/wordml/word16du" xmlns:w16sdtdh="http://schemas.microsoft.com/office/word/2020/wordml/sdtdatahash" xmlns:w16sdtfl="http://schemas.microsoft.com/office/word/2024/wordml/sdtformatlock" xmlns:w16se="http://schemas.microsoft.com/office/word/2015/wordml/symex" xmlns:wpg="http://schemas.microsoft.com/office/word/2010/wordprocessingGroup" xmlns:wpi="http://schemas.microsoft.com/office/word/2010/wordprocessingInk" xmlns:wne="http://schemas.microsoft.com/office/word/2006/wordml" xmlns:wps="http://schemas.microsoft.com/office/word/2010/wordprocessingShape" mc:Ignorable="w14 w15 w16se w16cid w16 w16cex w16sdtdh w16sdtfl w16du wp14">
+<w:document xmlns:wpc="http://schemas.microsoft.com/office/word/2010/wordprocessingCanvas" xmlns:mc="http://schemas.openxmlformats.org/markup-compatibility/2006" xmlns:o="urn:schemas-microsoft-com:office:office" xmlns:r="http://schemas.openxmlformats.org/officeDocument/2006/relationships" xmlns:m="http://schemas.openxmlformats.org/officeDocument/2006/math" xmlns:v="urn:schemas-microsoft-com:vml" xmlns:wp14="http://schemas.microsoft.com/office/word/2010/wordprocessingDrawing" xmlns:wp="http://schemas.openxmlformats.org/drawingml/2006/wordprocessingDrawing" xmlns:w10="urn:schemas-microsoft-com:office:word" xmlns:w="http://schemas.openxmlformats.org/wordprocessingml/2006/main" xmlns:w14="http://schemas.microsoft.com/office/word/2010/wordml" xmlns:w15="http://schemas.microsoft.com/office/word/2012/wordml" xmlns:w16se="http://schemas.microsoft.com/office/word/2015/wordml/symex" xmlns:w16cid="http://schemas.microsoft.com/office/word/2016/wordml/cid" xmlns:w16="http://schemas.microsoft.com/office/word/2018/wordml" xmlns:w16cex="http://schemas.microsoft.com/office/word/2018/wordml/cex" xmlns:w16sdtdh="http://schemas.microsoft.com/office/word/2020/wordml/sdtdatahash" xmlns:wne="http://schemas.microsoft.com/office/word/2006/wordml" xmlns:wpg="http://schemas.microsoft.com/office/word/2010/wordprocessingGroup" xmlns:wps="http://schemas.microsoft.com/office/word/2010/wordprocessingShape" mc:Ignorable="w14 w15 w16se w16cid w16 w16cex w16sdtdh wp14">
   <w:body>
     <w:p>
       <w:pPr>
@@ -12,15 +12,23 @@
       </w:pPr>
       <w:r>
         <w:rPr>
-          <w:b/>
-          <w:bCs/>
+          <w:rFonts w:ascii="Calibri" w:hAnsi="Calibri" w:eastAsia="Calibri" w:cs="Calibri" w:asciiTheme="minorHAnsi" w:hAnsiTheme="minorHAnsi" w:eastAsiaTheme="minorHAnsi" w:csTheme="minorBidi"/>
+          <w:b/>
+          <w:bCs/>
+          <w:kern w:val="2"/>
+          <w:sz w:val="22"/>
+          <w:szCs w:val="22"/>
         </w:rPr>
         <w:t>PROPUESTA DE NEGOCIACIÓN DE CONTRATO COLECTIVO DE TRABAJO</w:t>
       </w:r>
       <w:r>
         <w:rPr>
-          <w:b/>
-          <w:bCs/>
+          <w:rFonts w:ascii="Calibri" w:hAnsi="Calibri" w:eastAsia="Calibri" w:cs="Calibri" w:asciiTheme="minorHAnsi" w:hAnsiTheme="minorHAnsi" w:eastAsiaTheme="minorHAnsi" w:csTheme="minorBidi"/>
+          <w:b/>
+          <w:bCs/>
+          <w:kern w:val="2"/>
+          <w:sz w:val="22"/>
+          <w:szCs w:val="22"/>
         </w:rPr>
         <w:t>.</w:t>
       </w:r>
@@ -33,458 +41,377 @@
       </w:pPr>
       <w:r>
         <w:rPr>
-          <w:rFonts w:cstheme="minorHAnsi"/>
-        </w:rPr>
-        <w:t>Sindicato de Trabajadores</w:t>
-      </w:r>
-      <w:r>
-        <w:rPr>
-          <w:rFonts w:cstheme="minorHAnsi"/>
-        </w:rPr>
-        <w:t xml:space="preserve"> (EN LO SUSECIVO EL SINDICATO)</w:t>
-      </w:r>
-      <w:r>
-        <w:rPr>
-          <w:rFonts w:cstheme="minorHAnsi"/>
-        </w:rPr>
-        <w:t xml:space="preserve"> En contraposición a: </w:t>
-      </w:r>
-      <w:r>
-        <w:rPr>
+          <w:rFonts w:ascii="Calibri" w:hAnsi="Calibri" w:eastAsia="Calibri" w:cs="Calibri" w:asciiTheme="minorHAnsi" w:hAnsiTheme="minorHAnsi" w:eastAsiaTheme="minorHAnsi"/>
           <w:color w:val="FF0000"/>
-        </w:rPr>
-        <w:t>{{</w:t>
-      </w:r>
-      <w:r>
-        <w:rPr>
+          <w:kern w:val="2"/>
+          <w:sz w:val="22"/>
+          <w:szCs w:val="22"/>
+        </w:rPr>
+        <w:t>{{SINDICATO}}</w:t>
+      </w:r>
+      <w:r>
+        <w:rPr>
+          <w:rFonts w:ascii="Calibri" w:hAnsi="Calibri" w:eastAsia="Calibri" w:cs="Calibri" w:asciiTheme="minorHAnsi" w:hAnsiTheme="minorHAnsi" w:eastAsiaTheme="minorHAnsi"/>
+          <w:kern w:val="2"/>
+          <w:sz w:val="22"/>
+          <w:szCs w:val="22"/>
+        </w:rPr>
+        <w:t xml:space="preserve"> (EN LO SUSECIVO EL SINDICATO) En contraposición a: </w:t>
+      </w:r>
+      <w:r>
+        <w:rPr>
+          <w:rFonts w:ascii="Calibri" w:hAnsi="Calibri" w:eastAsia="Calibri" w:cs="Calibri" w:asciiTheme="minorHAnsi" w:hAnsiTheme="minorHAnsi" w:eastAsiaTheme="minorHAnsi"/>
           <w:color w:val="FF0000"/>
-        </w:rPr>
-        <w:t>EN</w:t>
-      </w:r>
-      <w:r>
+          <w:kern w:val="2"/>
+          <w:sz w:val="22"/>
+          <w:szCs w:val="22"/>
+        </w:rPr>
+        <w:t xml:space="preserve">{{LA_PATRONAL}} </w:t>
+      </w:r>
+      <w:r>
+        <w:rPr>
+          <w:rFonts w:ascii="Calibri" w:hAnsi="Calibri" w:eastAsia="Calibri" w:cs="Calibri" w:asciiTheme="minorHAnsi" w:hAnsiTheme="minorHAnsi" w:eastAsiaTheme="minorHAnsi"/>
+          <w:kern w:val="2"/>
+          <w:sz w:val="22"/>
+          <w:szCs w:val="22"/>
+        </w:rPr>
+        <w:t>(EN LO SUSECIVO LA EMPRESA).</w:t>
+      </w:r>
+    </w:p>
+    <w:p>
+      <w:pPr>
+        <w:jc w:val="center"/>
+        <w:rPr>
+          <w:rFonts w:cs="Calibri" w:csTheme="minorHAnsi"/>
+          <w:b/>
+          <w:bCs/>
+        </w:rPr>
+      </w:pPr>
+      <w:r>
+        <w:rPr>
+          <w:rFonts w:ascii="Calibri" w:hAnsi="Calibri" w:eastAsia="Calibri" w:cs="Calibri" w:asciiTheme="minorHAnsi" w:hAnsiTheme="minorHAnsi" w:eastAsiaTheme="minorHAnsi" w:csTheme="minorHAnsi"/>
+          <w:b/>
+          <w:bCs/>
+          <w:kern w:val="2"/>
+          <w:sz w:val="22"/>
+          <w:szCs w:val="22"/>
+        </w:rPr>
+        <w:t>INTRODUCCIÓN</w:t>
+      </w:r>
+      <w:r>
+        <w:rPr>
+          <w:rFonts w:ascii="Calibri" w:hAnsi="Calibri" w:eastAsia="Calibri" w:cs="Calibri" w:asciiTheme="minorHAnsi" w:hAnsiTheme="minorHAnsi" w:eastAsiaTheme="minorHAnsi" w:csTheme="minorHAnsi"/>
+          <w:b/>
+          <w:bCs/>
+          <w:kern w:val="2"/>
+          <w:sz w:val="22"/>
+          <w:szCs w:val="22"/>
+        </w:rPr>
+        <w:t>:</w:t>
+      </w:r>
+    </w:p>
+    <w:p>
+      <w:pPr>
+        <w:jc w:val="both"/>
         <w:rPr>
           <w:color w:val="FF0000"/>
         </w:rPr>
-        <w:t>_</w:t>
-      </w:r>
-      <w:r>
-        <w:rPr>
+      </w:pPr>
+      <w:r>
+        <w:rPr>
+          <w:rFonts w:ascii="Calibri" w:hAnsi="Calibri" w:eastAsia="Calibri" w:cs="Calibri" w:asciiTheme="minorHAnsi" w:hAnsiTheme="minorHAnsi" w:eastAsiaTheme="minorHAnsi" w:csTheme="minorHAnsi"/>
+          <w:kern w:val="2"/>
+          <w:sz w:val="22"/>
+          <w:szCs w:val="22"/>
+        </w:rPr>
+        <w:t xml:space="preserve">El SINDICATO, con sede en </w:t>
+      </w:r>
+      <w:r>
+        <w:rPr>
+          <w:rFonts w:ascii="Calibri" w:hAnsi="Calibri" w:eastAsia="Calibri" w:cs="Calibri" w:asciiTheme="minorHAnsi" w:hAnsiTheme="minorHAnsi" w:eastAsiaTheme="minorHAnsi" w:csTheme="minorBidi"/>
           <w:color w:val="FF0000"/>
-        </w:rPr>
-        <w:t>CONTRAPOSIC</w:t>
-      </w:r>
-      <w:r>
-        <w:rPr>
+          <w:kern w:val="2"/>
+          <w:sz w:val="22"/>
+          <w:szCs w:val="22"/>
+        </w:rPr>
+        <w:t>{{CONSEDE_EN}}</w:t>
+      </w:r>
+      <w:r>
+        <w:rPr>
+          <w:rFonts w:ascii="Calibri" w:hAnsi="Calibri" w:eastAsia="Calibri" w:cs="Calibri" w:asciiTheme="minorHAnsi" w:hAnsiTheme="minorHAnsi" w:eastAsiaTheme="minorHAnsi" w:csTheme="minorHAnsi"/>
           <w:color w:val="FF0000"/>
-        </w:rPr>
-        <w:t>IO</w:t>
-      </w:r>
-      <w:r>
-        <w:rPr>
+          <w:kern w:val="2"/>
+          <w:sz w:val="22"/>
+          <w:szCs w:val="22"/>
+        </w:rPr>
+        <w:t xml:space="preserve"> </w:t>
+      </w:r>
+      <w:r>
+        <w:rPr>
+          <w:rFonts w:ascii="Calibri" w:hAnsi="Calibri" w:eastAsia="Calibri" w:cs="Calibri" w:asciiTheme="minorHAnsi" w:hAnsiTheme="minorHAnsi" w:eastAsiaTheme="minorHAnsi" w:csTheme="minorHAnsi"/>
+          <w:kern w:val="2"/>
+          <w:sz w:val="22"/>
+          <w:szCs w:val="22"/>
+        </w:rPr>
+        <w:t>se dirige a</w:t>
+      </w:r>
+      <w:r>
+        <w:rPr>
+          <w:rFonts w:ascii="Calibri" w:hAnsi="Calibri" w:eastAsia="Calibri" w:cs="Calibri" w:asciiTheme="minorHAnsi" w:hAnsiTheme="minorHAnsi" w:eastAsiaTheme="minorHAnsi" w:csTheme="minorHAnsi"/>
           <w:color w:val="FF0000"/>
-        </w:rPr>
-        <w:t>N</w:t>
-      </w:r>
-      <w:r>
-        <w:rPr>
+          <w:kern w:val="2"/>
+          <w:sz w:val="22"/>
+          <w:szCs w:val="22"/>
+        </w:rPr>
+        <w:t xml:space="preserve"> </w:t>
+      </w:r>
+      <w:r>
+        <w:rPr>
+          <w:rFonts w:ascii="Calibri" w:cs="Calibri"/>
           <w:color w:val="FF0000"/>
-        </w:rPr>
-        <w:t>_</w:t>
-      </w:r>
-      <w:r>
-        <w:rPr>
+          <w:kern w:val="2"/>
+          <w:sz w:val="22"/>
+          <w:szCs w:val="22"/>
+        </w:rPr>
+        <w:t>{{LA_PATRONAL}}</w:t>
+      </w:r>
+      <w:r>
+        <w:t xml:space="preserve"> </w:t>
+      </w:r>
+      <w:r>
+        <w:rPr>
+          <w:rFonts w:ascii="Calibri" w:hAnsi="Calibri" w:eastAsia="Calibri" w:cs="Calibri" w:asciiTheme="minorHAnsi" w:hAnsiTheme="minorHAnsi" w:eastAsiaTheme="minorHAnsi" w:csTheme="minorHAnsi"/>
+          <w:kern w:val="2"/>
+          <w:sz w:val="22"/>
+          <w:szCs w:val="22"/>
+        </w:rPr>
+        <w:t xml:space="preserve">con el fin de invitarla a negociar un nuevo contrato colectivo de trabajo. El SINDICATO representa a </w:t>
+      </w:r>
+      <w:r>
+        <w:rPr>
+          <w:rFonts w:ascii="Calibri" w:hAnsi="Calibri" w:eastAsia="Calibri" w:cs="Calibri" w:asciiTheme="minorHAnsi" w:hAnsiTheme="minorHAnsi" w:eastAsiaTheme="minorHAnsi" w:csTheme="minorHAnsi"/>
           <w:color w:val="FF0000"/>
-        </w:rPr>
-        <w:t>A</w:t>
-      </w:r>
-      <w:r>
-        <w:rPr>
+          <w:kern w:val="2"/>
+          <w:sz w:val="22"/>
+          <w:szCs w:val="22"/>
+        </w:rPr>
+        <w:t>[</w:t>
+      </w:r>
+      <w:r>
+        <w:rPr>
+          <w:rFonts w:ascii="Calibri" w:hAnsi="Calibri" w:eastAsia="Calibri" w:cs="Calibri" w:asciiTheme="minorHAnsi" w:hAnsiTheme="minorHAnsi" w:eastAsiaTheme="minorHAnsi" w:csTheme="minorBidi"/>
           <w:color w:val="FF0000"/>
-        </w:rPr>
-        <w:t>}}</w:t>
-      </w:r>
-      <w:r>
-        <w:rPr>
-          <w:rFonts w:cstheme="minorHAnsi"/>
+          <w:kern w:val="2"/>
+          <w:sz w:val="22"/>
+          <w:szCs w:val="22"/>
+        </w:rPr>
+        <w:t>{{NUM_TRAB}}</w:t>
+      </w:r>
+      <w:r>
+        <w:rPr>
+          <w:rFonts w:ascii="Calibri" w:hAnsi="Calibri" w:eastAsia="Calibri" w:cs="Calibri" w:asciiTheme="minorHAnsi" w:hAnsiTheme="minorHAnsi" w:eastAsiaTheme="minorHAnsi" w:csTheme="minorHAnsi"/>
           <w:color w:val="FF0000"/>
-        </w:rPr>
-        <w:t xml:space="preserve"> </w:t>
-      </w:r>
-      <w:r>
-        <w:rPr>
-          <w:rFonts w:cstheme="minorHAnsi"/>
-        </w:rPr>
-        <w:t>(EN LO SUSECIVO LA EMPRESA).</w:t>
+          <w:kern w:val="2"/>
+          <w:sz w:val="22"/>
+          <w:szCs w:val="22"/>
+        </w:rPr>
+        <w:t xml:space="preserve">] </w:t>
+      </w:r>
+      <w:r>
+        <w:rPr>
+          <w:rFonts w:ascii="Calibri" w:hAnsi="Calibri" w:eastAsia="Calibri" w:cs="Calibri" w:asciiTheme="minorHAnsi" w:hAnsiTheme="minorHAnsi" w:eastAsiaTheme="minorHAnsi" w:csTheme="minorHAnsi"/>
+          <w:kern w:val="2"/>
+          <w:sz w:val="22"/>
+          <w:szCs w:val="22"/>
+        </w:rPr>
+        <w:t>trabajadores de su empresa, quienes desempeñan una variedad de funciones esenciales para el éxito de la misma.</w:t>
+      </w:r>
+    </w:p>
+    <w:p>
+      <w:pPr>
+        <w:jc w:val="both"/>
+        <w:rPr>
+          <w:rFonts w:cs="Calibri" w:csTheme="minorHAnsi"/>
+        </w:rPr>
+      </w:pPr>
+      <w:r>
+        <w:rPr>
+          <w:rFonts w:ascii="Calibri" w:hAnsi="Calibri" w:eastAsia="Calibri" w:cs="Calibri" w:asciiTheme="minorHAnsi" w:hAnsiTheme="minorHAnsi" w:eastAsiaTheme="minorHAnsi" w:csTheme="minorHAnsi"/>
+          <w:kern w:val="2"/>
+          <w:sz w:val="22"/>
+          <w:szCs w:val="22"/>
+        </w:rPr>
+        <w:t>El SINDICATO está comprometido a representar y defender los derechos de los trabajadores de</w:t>
+      </w:r>
+      <w:r>
+        <w:rPr>
+          <w:rFonts w:ascii="Calibri" w:hAnsi="Calibri" w:eastAsia="Calibri" w:cs="Calibri" w:asciiTheme="minorHAnsi" w:hAnsiTheme="minorHAnsi" w:eastAsiaTheme="minorHAnsi" w:csTheme="minorHAnsi"/>
+          <w:kern w:val="2"/>
+          <w:sz w:val="22"/>
+          <w:szCs w:val="22"/>
+        </w:rPr>
+        <w:t xml:space="preserve"> LA EMPRESA</w:t>
+      </w:r>
+      <w:r>
+        <w:rPr>
+          <w:rFonts w:ascii="Calibri" w:hAnsi="Calibri" w:eastAsia="Calibri" w:cs="Calibri" w:asciiTheme="minorHAnsi" w:hAnsiTheme="minorHAnsi" w:eastAsiaTheme="minorHAnsi" w:csTheme="minorHAnsi"/>
+          <w:kern w:val="2"/>
+          <w:sz w:val="22"/>
+          <w:szCs w:val="22"/>
+        </w:rPr>
+        <w:t>. El sindicato tiene como objetivo garantizar que los trabajadores reciban un trato justo y equitativo en el lugar de trabajo.</w:t>
+      </w:r>
+    </w:p>
+    <w:p>
+      <w:pPr>
+        <w:jc w:val="both"/>
+        <w:rPr>
+          <w:rFonts w:cs="Calibri" w:csTheme="minorHAnsi"/>
+        </w:rPr>
+      </w:pPr>
+      <w:r>
+        <w:rPr>
+          <w:rFonts w:ascii="Calibri" w:hAnsi="Calibri" w:eastAsia="Calibri" w:cs="Calibri" w:asciiTheme="minorHAnsi" w:hAnsiTheme="minorHAnsi" w:eastAsiaTheme="minorHAnsi" w:csTheme="minorHAnsi"/>
+          <w:kern w:val="2"/>
+          <w:sz w:val="22"/>
+          <w:szCs w:val="22"/>
+        </w:rPr>
+        <w:t xml:space="preserve">El </w:t>
+      </w:r>
+      <w:r>
+        <w:rPr>
+          <w:rFonts w:ascii="Calibri" w:hAnsi="Calibri" w:eastAsia="Calibri" w:cs="Calibri" w:asciiTheme="minorHAnsi" w:hAnsiTheme="minorHAnsi" w:eastAsiaTheme="minorHAnsi" w:csTheme="minorHAnsi"/>
+          <w:kern w:val="2"/>
+          <w:sz w:val="22"/>
+          <w:szCs w:val="22"/>
+        </w:rPr>
+        <w:t>SINDICATO</w:t>
+      </w:r>
+      <w:r>
+        <w:rPr>
+          <w:rFonts w:ascii="Calibri" w:hAnsi="Calibri" w:eastAsia="Calibri" w:cs="Calibri" w:asciiTheme="minorHAnsi" w:hAnsiTheme="minorHAnsi" w:eastAsiaTheme="minorHAnsi" w:csTheme="minorHAnsi"/>
+          <w:kern w:val="2"/>
+          <w:sz w:val="22"/>
+          <w:szCs w:val="22"/>
+        </w:rPr>
+        <w:t xml:space="preserve"> cree que un nuevo contrato colectivo de trabajo es esencial para garantizar que los trabajadores de </w:t>
+      </w:r>
+      <w:r>
+        <w:rPr>
+          <w:rFonts w:ascii="Calibri" w:hAnsi="Calibri" w:eastAsia="Calibri" w:cs="Calibri" w:asciiTheme="minorHAnsi" w:hAnsiTheme="minorHAnsi" w:eastAsiaTheme="minorHAnsi" w:csTheme="minorHAnsi"/>
+          <w:kern w:val="2"/>
+          <w:sz w:val="22"/>
+          <w:szCs w:val="22"/>
+        </w:rPr>
+        <w:t xml:space="preserve">LA EMPRESA, </w:t>
+      </w:r>
+      <w:r>
+        <w:rPr>
+          <w:rFonts w:ascii="Calibri" w:hAnsi="Calibri" w:eastAsia="Calibri" w:cs="Calibri" w:asciiTheme="minorHAnsi" w:hAnsiTheme="minorHAnsi" w:eastAsiaTheme="minorHAnsi" w:csTheme="minorHAnsi"/>
+          <w:kern w:val="2"/>
+          <w:sz w:val="22"/>
+          <w:szCs w:val="22"/>
+        </w:rPr>
+        <w:t>tengan un lugar de trabajo seguro y saludable, así como un salario digno y prestaciones justas.</w:t>
+      </w:r>
+    </w:p>
+    <w:p>
+      <w:pPr>
+        <w:jc w:val="both"/>
+        <w:rPr>
+          <w:rFonts w:cs="Calibri" w:csTheme="minorHAnsi"/>
+        </w:rPr>
+      </w:pPr>
+      <w:r>
+        <w:rPr>
+          <w:rFonts w:ascii="Calibri" w:hAnsi="Calibri" w:eastAsia="Calibri" w:cs="Calibri" w:asciiTheme="minorHAnsi" w:hAnsiTheme="minorHAnsi" w:eastAsiaTheme="minorHAnsi" w:csTheme="minorHAnsi"/>
+          <w:kern w:val="2"/>
+          <w:sz w:val="22"/>
+          <w:szCs w:val="22"/>
+        </w:rPr>
+        <w:t xml:space="preserve">El </w:t>
+      </w:r>
+      <w:r>
+        <w:rPr>
+          <w:rFonts w:ascii="Calibri" w:hAnsi="Calibri" w:eastAsia="Calibri" w:cs="Calibri" w:asciiTheme="minorHAnsi" w:hAnsiTheme="minorHAnsi" w:eastAsiaTheme="minorHAnsi" w:csTheme="minorHAnsi"/>
+          <w:kern w:val="2"/>
+          <w:sz w:val="22"/>
+          <w:szCs w:val="22"/>
+        </w:rPr>
+        <w:t>SINDICATO</w:t>
+      </w:r>
+      <w:r>
+        <w:rPr>
+          <w:rFonts w:ascii="Calibri" w:hAnsi="Calibri" w:eastAsia="Calibri" w:cs="Calibri" w:asciiTheme="minorHAnsi" w:hAnsiTheme="minorHAnsi" w:eastAsiaTheme="minorHAnsi" w:csTheme="minorHAnsi"/>
+          <w:kern w:val="2"/>
+          <w:sz w:val="22"/>
+          <w:szCs w:val="22"/>
+        </w:rPr>
+        <w:t xml:space="preserve"> está dispuesto a trabajar en estrecha colaboración con</w:t>
+      </w:r>
+      <w:r>
+        <w:rPr>
+          <w:rFonts w:ascii="Calibri" w:hAnsi="Calibri" w:eastAsia="Calibri" w:cs="Calibri" w:asciiTheme="minorHAnsi" w:hAnsiTheme="minorHAnsi" w:eastAsiaTheme="minorHAnsi" w:csTheme="minorHAnsi"/>
+          <w:kern w:val="2"/>
+          <w:sz w:val="22"/>
+          <w:szCs w:val="22"/>
+        </w:rPr>
+        <w:t xml:space="preserve"> LA EMPRESA</w:t>
+      </w:r>
+      <w:r>
+        <w:rPr>
+          <w:rFonts w:ascii="Calibri" w:hAnsi="Calibri" w:eastAsia="Calibri" w:cs="Calibri" w:asciiTheme="minorHAnsi" w:hAnsiTheme="minorHAnsi" w:eastAsiaTheme="minorHAnsi" w:csTheme="minorHAnsi"/>
+          <w:kern w:val="2"/>
+          <w:sz w:val="22"/>
+          <w:szCs w:val="22"/>
+        </w:rPr>
+        <w:t xml:space="preserve"> para negociar un contrato colectivo de trabajo que beneficie a ambas partes.</w:t>
       </w:r>
     </w:p>
     <w:p>
       <w:pPr>
         <w:jc w:val="center"/>
         <w:rPr>
-          <w:rFonts w:cstheme="minorHAnsi"/>
-          <w:b/>
-          <w:bCs/>
-        </w:rPr>
-      </w:pPr>
-      <w:r>
-        <w:rPr>
-          <w:rFonts w:cstheme="minorHAnsi"/>
-          <w:b/>
-          <w:bCs/>
-        </w:rPr>
-        <w:t>INTRODUCCIÓN</w:t>
-      </w:r>
-      <w:r>
-        <w:rPr>
-          <w:rFonts w:cstheme="minorHAnsi"/>
-          <w:b/>
-          <w:bCs/>
+          <w:rFonts w:cs="Calibri" w:csTheme="minorHAnsi"/>
+          <w:b/>
+          <w:bCs/>
+        </w:rPr>
+      </w:pPr>
+      <w:r>
+        <w:rPr>
+          <w:rFonts w:ascii="Calibri" w:hAnsi="Calibri" w:eastAsia="Calibri" w:cs="Calibri" w:asciiTheme="minorHAnsi" w:hAnsiTheme="minorHAnsi" w:eastAsiaTheme="minorHAnsi" w:csTheme="minorHAnsi"/>
+          <w:b/>
+          <w:bCs/>
+          <w:kern w:val="2"/>
+          <w:sz w:val="22"/>
+          <w:szCs w:val="22"/>
+        </w:rPr>
+        <w:t>PROPUESTAS DEL SINDICATO</w:t>
+      </w:r>
+      <w:r>
+        <w:rPr>
+          <w:rFonts w:ascii="Calibri" w:hAnsi="Calibri" w:eastAsia="Calibri" w:cs="Calibri" w:asciiTheme="minorHAnsi" w:hAnsiTheme="minorHAnsi" w:eastAsiaTheme="minorHAnsi" w:csTheme="minorHAnsi"/>
+          <w:b/>
+          <w:bCs/>
+          <w:kern w:val="2"/>
+          <w:sz w:val="22"/>
+          <w:szCs w:val="22"/>
         </w:rPr>
         <w:t>:</w:t>
       </w:r>
     </w:p>
     <w:p>
       <w:pPr>
-        <w:jc w:val="both"/>
-        <w:rPr>
-          <w:color w:val="FF0000"/>
-        </w:rPr>
-      </w:pPr>
-      <w:r>
-        <w:rPr>
-          <w:rFonts w:cstheme="minorHAnsi"/>
-        </w:rPr>
-        <w:t xml:space="preserve">El </w:t>
-      </w:r>
-      <w:r>
-        <w:rPr>
-          <w:rFonts w:cstheme="minorHAnsi"/>
-        </w:rPr>
-        <w:t>SINDICATO</w:t>
-      </w:r>
-      <w:r>
-        <w:rPr>
-          <w:rFonts w:cstheme="minorHAnsi"/>
-        </w:rPr>
-        <w:t xml:space="preserve">, con sede en </w:t>
-      </w:r>
-      <w:r>
-        <w:rPr>
-          <w:color w:val="FF0000"/>
-        </w:rPr>
-        <w:t>{{</w:t>
-      </w:r>
-      <w:r>
-        <w:rPr>
-          <w:color w:val="FF0000"/>
-        </w:rPr>
-        <w:t>CONSEDE</w:t>
-      </w:r>
-      <w:r>
-        <w:rPr>
-          <w:color w:val="FF0000"/>
-        </w:rPr>
-        <w:t>_</w:t>
-      </w:r>
-      <w:r>
-        <w:rPr>
-          <w:color w:val="FF0000"/>
-        </w:rPr>
-        <w:t>EN</w:t>
-      </w:r>
-      <w:r>
-        <w:rPr>
-          <w:color w:val="FF0000"/>
-        </w:rPr>
-        <w:t>}}</w:t>
-      </w:r>
-      <w:r>
-        <w:rPr>
-          <w:rFonts w:cstheme="minorHAnsi"/>
-          <w:color w:val="FF0000"/>
-        </w:rPr>
-        <w:t xml:space="preserve"> </w:t>
-      </w:r>
-      <w:r>
-        <w:rPr>
-          <w:rFonts w:cstheme="minorHAnsi"/>
-        </w:rPr>
-        <w:t>se dirige a</w:t>
-      </w:r>
-      <w:r>
-        <w:rPr>
-          <w:rFonts w:cstheme="minorHAnsi"/>
-          <w:color w:val="FF0000"/>
-        </w:rPr>
-        <w:t xml:space="preserve"> </w:t>
-      </w:r>
-      <w:r>
-        <w:rPr>
-          <w:color w:val="FF0000"/>
-        </w:rPr>
-        <w:t>{{</w:t>
-      </w:r>
-      <w:r>
-        <w:rPr>
-          <w:color w:val="FF0000"/>
-        </w:rPr>
-        <w:t>SE</w:t>
-      </w:r>
-      <w:r>
-        <w:rPr>
-          <w:color w:val="FF0000"/>
-        </w:rPr>
-        <w:t>_</w:t>
-      </w:r>
-      <w:r>
-        <w:rPr>
-          <w:color w:val="FF0000"/>
-        </w:rPr>
-        <w:t>DIRIGE</w:t>
-      </w:r>
-      <w:r>
-        <w:rPr>
-          <w:color w:val="FF0000"/>
-        </w:rPr>
-        <w:t>_</w:t>
-      </w:r>
-      <w:r>
-        <w:rPr>
-          <w:color w:val="FF0000"/>
-        </w:rPr>
-        <w:t>A</w:t>
-      </w:r>
-      <w:r>
-        <w:rPr>
-          <w:color w:val="FF0000"/>
-        </w:rPr>
-        <w:t>}}</w:t>
-      </w:r>
-      <w:r>
-        <w:rPr>
-          <w:rFonts w:cstheme="minorHAnsi"/>
-          <w:color w:val="FF0000"/>
-        </w:rPr>
-        <w:t xml:space="preserve"> </w:t>
-      </w:r>
-      <w:r>
-        <w:rPr>
-          <w:rFonts w:cstheme="minorHAnsi"/>
-        </w:rPr>
-        <w:t xml:space="preserve">con el fin de invitarla a negociar un nuevo contrato colectivo de trabajo. El SINDICATO representa a </w:t>
-      </w:r>
-      <w:r>
-        <w:rPr>
-          <w:rFonts w:cstheme="minorHAnsi"/>
-          <w:color w:val="FF0000"/>
-        </w:rPr>
-        <w:t>[</w:t>
-      </w:r>
-      <w:r>
-        <w:rPr>
-          <w:color w:val="FF0000"/>
-        </w:rPr>
-        <w:t>{{</w:t>
-      </w:r>
-      <w:r>
-        <w:rPr>
-          <w:color w:val="FF0000"/>
-        </w:rPr>
-        <w:t>NUM</w:t>
-      </w:r>
-      <w:r>
-        <w:rPr>
-          <w:color w:val="FF0000"/>
-        </w:rPr>
-        <w:t>_</w:t>
-      </w:r>
-      <w:r>
-        <w:rPr>
-          <w:color w:val="FF0000"/>
-        </w:rPr>
-        <w:t>TRAB</w:t>
-      </w:r>
-      <w:r>
-        <w:rPr>
-          <w:color w:val="FF0000"/>
-        </w:rPr>
-        <w:t>}}</w:t>
-      </w:r>
-      <w:r>
-        <w:rPr>
-          <w:rFonts w:cstheme="minorHAnsi"/>
-          <w:color w:val="FF0000"/>
-        </w:rPr>
-        <w:t xml:space="preserve">] </w:t>
-      </w:r>
-      <w:r>
-        <w:rPr>
-          <w:rFonts w:cstheme="minorHAnsi"/>
-        </w:rPr>
-        <w:t>trabajadores de</w:t>
-      </w:r>
-      <w:r>
-        <w:rPr>
-          <w:rFonts w:cstheme="minorHAnsi"/>
-        </w:rPr>
-        <w:t xml:space="preserve"> su empresa</w:t>
-      </w:r>
-      <w:r>
-        <w:rPr>
-          <w:rFonts w:cstheme="minorHAnsi"/>
-        </w:rPr>
-        <w:t xml:space="preserve">, </w:t>
-      </w:r>
-      <w:r>
-        <w:rPr>
-          <w:rFonts w:cstheme="minorHAnsi"/>
-        </w:rPr>
-        <w:t xml:space="preserve">quienes desempeñan una variedad de funciones esenciales para el éxito de la </w:t>
-      </w:r>
-      <w:r>
-        <w:rPr>
-          <w:rFonts w:cstheme="minorHAnsi"/>
-        </w:rPr>
-        <w:t>misma.</w:t>
-      </w:r>
-    </w:p>
-    <w:p>
-      <w:pPr>
-        <w:jc w:val="both"/>
-        <w:rPr>
-          <w:rFonts w:cstheme="minorHAnsi"/>
-        </w:rPr>
-      </w:pPr>
-      <w:r>
-        <w:rPr>
-          <w:rFonts w:cstheme="minorHAnsi"/>
-        </w:rPr>
-        <w:t>El SINDICATO está comprometido a representar y defender los derechos de los trabajadores de</w:t>
-      </w:r>
-      <w:r>
-        <w:rPr>
-          <w:rFonts w:cstheme="minorHAnsi"/>
-        </w:rPr>
-        <w:t xml:space="preserve"> LA EMPRESA</w:t>
-      </w:r>
-      <w:r>
-        <w:rPr>
-          <w:rFonts w:cstheme="minorHAnsi"/>
-        </w:rPr>
-        <w:t>. El sindicato tiene como objetivo garantizar que los trabajadores reciban un trato justo y equitativo en el lugar de trabajo.</w:t>
-      </w:r>
-    </w:p>
-    <w:p>
-      <w:pPr>
-        <w:jc w:val="both"/>
-        <w:rPr>
-          <w:rFonts w:cstheme="minorHAnsi"/>
-        </w:rPr>
-      </w:pPr>
-      <w:r>
-        <w:rPr>
-          <w:rFonts w:cstheme="minorHAnsi"/>
-        </w:rPr>
-        <w:t xml:space="preserve">El </w:t>
-      </w:r>
-      <w:r>
-        <w:rPr>
-          <w:rFonts w:cstheme="minorHAnsi"/>
-        </w:rPr>
-        <w:t>SINDICATO</w:t>
-      </w:r>
-      <w:r>
-        <w:rPr>
-          <w:rFonts w:cstheme="minorHAnsi"/>
-        </w:rPr>
-        <w:t xml:space="preserve"> cree que un nuevo contrato colectivo de trabajo es esencial para garantizar que los trabajadores de </w:t>
-      </w:r>
-      <w:r>
-        <w:rPr>
-          <w:rFonts w:cstheme="minorHAnsi"/>
-        </w:rPr>
-        <w:t xml:space="preserve">LA EMPRESA, </w:t>
-      </w:r>
-      <w:r>
-        <w:rPr>
-          <w:rFonts w:cstheme="minorHAnsi"/>
-        </w:rPr>
-        <w:t>tengan un lugar de trabajo seguro y saludable, así como un salario digno y prestaciones justas.</w:t>
-      </w:r>
-    </w:p>
-    <w:p>
-      <w:pPr>
-        <w:jc w:val="both"/>
-        <w:rPr>
-          <w:rFonts w:cstheme="minorHAnsi"/>
-        </w:rPr>
-      </w:pPr>
-      <w:r>
-        <w:rPr>
-          <w:rFonts w:cstheme="minorHAnsi"/>
-        </w:rPr>
-        <w:t xml:space="preserve">El </w:t>
-      </w:r>
-      <w:r>
-        <w:rPr>
-          <w:rFonts w:cstheme="minorHAnsi"/>
-        </w:rPr>
-        <w:t>SINDICATO</w:t>
-      </w:r>
-      <w:r>
-        <w:rPr>
-          <w:rFonts w:cstheme="minorHAnsi"/>
-        </w:rPr>
-        <w:t xml:space="preserve"> está dispuesto a trabajar en estrecha colaboración con</w:t>
-      </w:r>
-      <w:r>
-        <w:rPr>
-          <w:rFonts w:cstheme="minorHAnsi"/>
-        </w:rPr>
-        <w:t xml:space="preserve"> LA EMPRESA</w:t>
-      </w:r>
-      <w:r>
-        <w:rPr>
-          <w:rFonts w:cstheme="minorHAnsi"/>
-        </w:rPr>
-        <w:t xml:space="preserve"> para negociar un contrato colectivo de trabajo que beneficie a ambas partes.</w:t>
-      </w:r>
-    </w:p>
-    <w:p>
-      <w:pPr>
-        <w:jc w:val="center"/>
-        <w:rPr>
-          <w:rFonts w:cstheme="minorHAnsi"/>
-          <w:b/>
-          <w:bCs/>
-        </w:rPr>
-      </w:pPr>
-      <w:r>
-        <w:rPr>
-          <w:rFonts w:cstheme="minorHAnsi"/>
-          <w:b/>
-          <w:bCs/>
-        </w:rPr>
-        <w:t>PROPUESTAS DEL SINDICATO</w:t>
-      </w:r>
-      <w:r>
-        <w:rPr>
-          <w:rFonts w:cstheme="minorHAnsi"/>
-          <w:b/>
-          <w:bCs/>
-        </w:rPr>
-        <w:t>:</w:t>
-      </w:r>
-    </w:p>
-    <w:p>
-      <w:pPr>
-        <w:rPr>
-          <w:rFonts w:cstheme="minorHAnsi"/>
-        </w:rPr>
-      </w:pPr>
-      <w:r>
-        <w:rPr>
-          <w:rFonts w:cstheme="minorHAnsi"/>
+        <w:rPr>
+          <w:rFonts w:cs="Calibri" w:csTheme="minorHAnsi"/>
+        </w:rPr>
+      </w:pPr>
+      <w:r>
+        <w:rPr>
+          <w:rFonts w:ascii="Calibri" w:hAnsi="Calibri" w:eastAsia="Calibri" w:cs="Calibri" w:asciiTheme="minorHAnsi" w:hAnsiTheme="minorHAnsi" w:eastAsiaTheme="minorHAnsi" w:csTheme="minorHAnsi"/>
+          <w:kern w:val="2"/>
+          <w:sz w:val="22"/>
+          <w:szCs w:val="22"/>
         </w:rPr>
         <w:t>El SINDICATO propone los siguientes términos y condiciones para el nuevo contrato colectivo de trabajo:</w:t>
       </w:r>
@@ -495,17 +422,21 @@
           <w:ilvl w:val="0"/>
           <w:numId w:val="1"/>
         </w:numPr>
-        <w:rPr>
-          <w:rFonts w:cstheme="minorHAnsi"/>
-          <w:b/>
-          <w:bCs/>
-        </w:rPr>
-      </w:pPr>
-      <w:r>
-        <w:rPr>
-          <w:rFonts w:cstheme="minorHAnsi"/>
-          <w:b/>
-          <w:bCs/>
+        <w:ind w:left="720" w:hanging="360"/>
+        <w:rPr>
+          <w:rFonts w:cs="Calibri" w:csTheme="minorHAnsi"/>
+          <w:b/>
+          <w:bCs/>
+        </w:rPr>
+      </w:pPr>
+      <w:r>
+        <w:rPr>
+          <w:rFonts w:ascii="Calibri" w:hAnsi="Calibri" w:eastAsia="Calibri" w:cs="Calibri" w:asciiTheme="minorHAnsi" w:hAnsiTheme="minorHAnsi" w:eastAsiaTheme="minorHAnsi" w:csTheme="minorHAnsi"/>
+          <w:b/>
+          <w:bCs/>
+          <w:kern w:val="2"/>
+          <w:sz w:val="22"/>
+          <w:szCs w:val="22"/>
         </w:rPr>
         <w:t>Salario:</w:t>
       </w:r>
@@ -516,13 +447,17 @@
           <w:ilvl w:val="1"/>
           <w:numId w:val="1"/>
         </w:numPr>
-        <w:rPr>
-          <w:rFonts w:cstheme="minorHAnsi"/>
-        </w:rPr>
-      </w:pPr>
-      <w:r>
-        <w:rPr>
-          <w:rFonts w:cstheme="minorHAnsi"/>
+        <w:ind w:left="1440" w:hanging="360"/>
+        <w:rPr>
+          <w:rFonts w:cs="Calibri" w:csTheme="minorHAnsi"/>
+        </w:rPr>
+      </w:pPr>
+      <w:r>
+        <w:rPr>
+          <w:rFonts w:ascii="Calibri" w:hAnsi="Calibri" w:eastAsia="Calibri" w:cs="Calibri" w:asciiTheme="minorHAnsi" w:hAnsiTheme="minorHAnsi" w:eastAsiaTheme="minorHAnsi" w:csTheme="minorHAnsi"/>
+          <w:kern w:val="2"/>
+          <w:sz w:val="22"/>
+          <w:szCs w:val="22"/>
         </w:rPr>
         <w:t>Se implementará una inspección anual, para que se establezcan los aumentos correspondientes que se fijen por ley.</w:t>
       </w:r>
@@ -533,17 +468,21 @@
           <w:ilvl w:val="0"/>
           <w:numId w:val="1"/>
         </w:numPr>
-        <w:rPr>
-          <w:rFonts w:cstheme="minorHAnsi"/>
-          <w:b/>
-          <w:bCs/>
-        </w:rPr>
-      </w:pPr>
-      <w:r>
-        <w:rPr>
-          <w:rFonts w:cstheme="minorHAnsi"/>
-          <w:b/>
-          <w:bCs/>
+        <w:ind w:left="720" w:hanging="360"/>
+        <w:rPr>
+          <w:rFonts w:cs="Calibri" w:csTheme="minorHAnsi"/>
+          <w:b/>
+          <w:bCs/>
+        </w:rPr>
+      </w:pPr>
+      <w:r>
+        <w:rPr>
+          <w:rFonts w:ascii="Calibri" w:hAnsi="Calibri" w:eastAsia="Calibri" w:cs="Calibri" w:asciiTheme="minorHAnsi" w:hAnsiTheme="minorHAnsi" w:eastAsiaTheme="minorHAnsi" w:csTheme="minorHAnsi"/>
+          <w:b/>
+          <w:bCs/>
+          <w:kern w:val="2"/>
+          <w:sz w:val="22"/>
+          <w:szCs w:val="22"/>
         </w:rPr>
         <w:t>Vacaciones:</w:t>
       </w:r>
@@ -552,12 +491,15 @@
       <w:pPr>
         <w:jc w:val="both"/>
         <w:rPr>
-          <w:rFonts w:cstheme="minorHAnsi"/>
-        </w:rPr>
-      </w:pPr>
-      <w:r>
-        <w:rPr>
-          <w:rFonts w:cstheme="minorHAnsi"/>
+          <w:rFonts w:cs="Calibri" w:csTheme="minorHAnsi"/>
+        </w:rPr>
+      </w:pPr>
+      <w:r>
+        <w:rPr>
+          <w:rFonts w:ascii="Calibri" w:hAnsi="Calibri" w:eastAsia="Calibri" w:cs="Calibri" w:asciiTheme="minorHAnsi" w:hAnsiTheme="minorHAnsi" w:eastAsiaTheme="minorHAnsi" w:csTheme="minorHAnsi"/>
+          <w:kern w:val="2"/>
+          <w:sz w:val="22"/>
+          <w:szCs w:val="22"/>
         </w:rPr>
         <w:t>Las personas trabajadoras con más de un año de servicios tienen derecho a disfrutar de un período anual de vacaciones pagadas, en ningún caso podrá ser inferior a doce días laborables, y que aumentará en dos días laborables, hasta llegar a veinte, por cada año subsecuente de servicios.</w:t>
       </w:r>
@@ -566,12 +508,15 @@
       <w:pPr>
         <w:jc w:val="both"/>
         <w:rPr>
-          <w:rFonts w:cstheme="minorHAnsi"/>
-        </w:rPr>
-      </w:pPr>
-      <w:r>
-        <w:rPr>
-          <w:rFonts w:cstheme="minorHAnsi"/>
+          <w:rFonts w:cs="Calibri" w:csTheme="minorHAnsi"/>
+        </w:rPr>
+      </w:pPr>
+      <w:r>
+        <w:rPr>
+          <w:rFonts w:ascii="Calibri" w:hAnsi="Calibri" w:eastAsia="Calibri" w:cs="Calibri" w:asciiTheme="minorHAnsi" w:hAnsiTheme="minorHAnsi" w:eastAsiaTheme="minorHAnsi" w:csTheme="minorHAnsi"/>
+          <w:kern w:val="2"/>
+          <w:sz w:val="22"/>
+          <w:szCs w:val="22"/>
         </w:rPr>
         <w:t>A partir del sexto año, el período de vacaciones aumentará en dos días por cada cinco años de servicio.</w:t>
       </w:r>
@@ -580,12 +525,15 @@
       <w:pPr>
         <w:jc w:val="both"/>
         <w:rPr>
-          <w:rFonts w:cstheme="minorHAnsi"/>
-        </w:rPr>
-      </w:pPr>
-      <w:r>
-        <w:rPr>
-          <w:rFonts w:cstheme="minorHAnsi"/>
+          <w:rFonts w:cs="Calibri" w:csTheme="minorHAnsi"/>
+        </w:rPr>
+      </w:pPr>
+      <w:r>
+        <w:rPr>
+          <w:rFonts w:ascii="Calibri" w:hAnsi="Calibri" w:eastAsia="Calibri" w:cs="Calibri" w:asciiTheme="minorHAnsi" w:hAnsiTheme="minorHAnsi" w:eastAsiaTheme="minorHAnsi" w:csTheme="minorHAnsi"/>
+          <w:kern w:val="2"/>
+          <w:sz w:val="22"/>
+          <w:szCs w:val="22"/>
         </w:rPr>
         <w:t>La siguiente tabla muestra la forma en que se deben otorgar los días de vacaciones:</w:t>
       </w:r>
@@ -594,12 +542,15 @@
       <w:pPr>
         <w:jc w:val="both"/>
         <w:rPr>
-          <w:rFonts w:cstheme="minorHAnsi"/>
-        </w:rPr>
-      </w:pPr>
-      <w:r>
-        <w:rPr>
-          <w:rFonts w:cstheme="minorHAnsi"/>
+          <w:rFonts w:cs="Calibri" w:csTheme="minorHAnsi"/>
+        </w:rPr>
+      </w:pPr>
+      <w:r>
+        <w:rPr>
+          <w:rFonts w:ascii="Calibri" w:hAnsi="Calibri" w:eastAsia="Calibri" w:cs="Calibri" w:asciiTheme="minorHAnsi" w:hAnsiTheme="minorHAnsi" w:eastAsiaTheme="minorHAnsi" w:csTheme="minorHAnsi"/>
+          <w:kern w:val="2"/>
+          <w:sz w:val="22"/>
+          <w:szCs w:val="22"/>
         </w:rPr>
         <w:t>Año 1: 12 días</w:t>
       </w:r>
@@ -608,12 +559,15 @@
       <w:pPr>
         <w:jc w:val="both"/>
         <w:rPr>
-          <w:rFonts w:cstheme="minorHAnsi"/>
-        </w:rPr>
-      </w:pPr>
-      <w:r>
-        <w:rPr>
-          <w:rFonts w:cstheme="minorHAnsi"/>
+          <w:rFonts w:cs="Calibri" w:csTheme="minorHAnsi"/>
+        </w:rPr>
+      </w:pPr>
+      <w:r>
+        <w:rPr>
+          <w:rFonts w:ascii="Calibri" w:hAnsi="Calibri" w:eastAsia="Calibri" w:cs="Calibri" w:asciiTheme="minorHAnsi" w:hAnsiTheme="minorHAnsi" w:eastAsiaTheme="minorHAnsi" w:csTheme="minorHAnsi"/>
+          <w:kern w:val="2"/>
+          <w:sz w:val="22"/>
+          <w:szCs w:val="22"/>
         </w:rPr>
         <w:t>Año 2: 14 días</w:t>
       </w:r>
@@ -622,12 +576,15 @@
       <w:pPr>
         <w:jc w:val="both"/>
         <w:rPr>
-          <w:rFonts w:cstheme="minorHAnsi"/>
-        </w:rPr>
-      </w:pPr>
-      <w:r>
-        <w:rPr>
-          <w:rFonts w:cstheme="minorHAnsi"/>
+          <w:rFonts w:cs="Calibri" w:csTheme="minorHAnsi"/>
+        </w:rPr>
+      </w:pPr>
+      <w:r>
+        <w:rPr>
+          <w:rFonts w:ascii="Calibri" w:hAnsi="Calibri" w:eastAsia="Calibri" w:cs="Calibri" w:asciiTheme="minorHAnsi" w:hAnsiTheme="minorHAnsi" w:eastAsiaTheme="minorHAnsi" w:csTheme="minorHAnsi"/>
+          <w:kern w:val="2"/>
+          <w:sz w:val="22"/>
+          <w:szCs w:val="22"/>
         </w:rPr>
         <w:t>Año 3: 16 días</w:t>
       </w:r>
@@ -636,12 +593,15 @@
       <w:pPr>
         <w:jc w:val="both"/>
         <w:rPr>
-          <w:rFonts w:cstheme="minorHAnsi"/>
-        </w:rPr>
-      </w:pPr>
-      <w:r>
-        <w:rPr>
-          <w:rFonts w:cstheme="minorHAnsi"/>
+          <w:rFonts w:cs="Calibri" w:csTheme="minorHAnsi"/>
+        </w:rPr>
+      </w:pPr>
+      <w:r>
+        <w:rPr>
+          <w:rFonts w:ascii="Calibri" w:hAnsi="Calibri" w:eastAsia="Calibri" w:cs="Calibri" w:asciiTheme="minorHAnsi" w:hAnsiTheme="minorHAnsi" w:eastAsiaTheme="minorHAnsi" w:csTheme="minorHAnsi"/>
+          <w:kern w:val="2"/>
+          <w:sz w:val="22"/>
+          <w:szCs w:val="22"/>
         </w:rPr>
         <w:t>Año 4: 18 días</w:t>
       </w:r>
@@ -650,12 +610,15 @@
       <w:pPr>
         <w:jc w:val="both"/>
         <w:rPr>
-          <w:rFonts w:cstheme="minorHAnsi"/>
-        </w:rPr>
-      </w:pPr>
-      <w:r>
-        <w:rPr>
-          <w:rFonts w:cstheme="minorHAnsi"/>
+          <w:rFonts w:cs="Calibri" w:csTheme="minorHAnsi"/>
+        </w:rPr>
+      </w:pPr>
+      <w:r>
+        <w:rPr>
+          <w:rFonts w:ascii="Calibri" w:hAnsi="Calibri" w:eastAsia="Calibri" w:cs="Calibri" w:asciiTheme="minorHAnsi" w:hAnsiTheme="minorHAnsi" w:eastAsiaTheme="minorHAnsi" w:csTheme="minorHAnsi"/>
+          <w:kern w:val="2"/>
+          <w:sz w:val="22"/>
+          <w:szCs w:val="22"/>
         </w:rPr>
         <w:t>Año 5: 20 días</w:t>
       </w:r>
@@ -664,14 +627,17 @@
       <w:pPr>
         <w:jc w:val="both"/>
         <w:rPr>
-          <w:rFonts w:cstheme="minorHAnsi"/>
-        </w:rPr>
-      </w:pPr>
-      <w:r>
-        <w:rPr>
-          <w:rFonts w:cstheme="minorHAnsi"/>
-        </w:rPr>
+          <w:rFonts w:cs="Calibri" w:csTheme="minorHAnsi"/>
+        </w:rPr>
+      </w:pPr>
+      <w:r>
         <w:lastRenderedPageBreak/>
+        <w:rPr>
+          <w:rFonts w:ascii="Calibri" w:hAnsi="Calibri" w:eastAsia="Calibri" w:cs="Calibri" w:asciiTheme="minorHAnsi" w:hAnsiTheme="minorHAnsi" w:eastAsiaTheme="minorHAnsi" w:csTheme="minorHAnsi"/>
+          <w:kern w:val="2"/>
+          <w:sz w:val="22"/>
+          <w:szCs w:val="22"/>
+        </w:rPr>
         <w:t>De 6 a 10 años: 22 días</w:t>
       </w:r>
     </w:p>
@@ -679,12 +645,15 @@
       <w:pPr>
         <w:jc w:val="both"/>
         <w:rPr>
-          <w:rFonts w:cstheme="minorHAnsi"/>
-        </w:rPr>
-      </w:pPr>
-      <w:r>
-        <w:rPr>
-          <w:rFonts w:cstheme="minorHAnsi"/>
+          <w:rFonts w:cs="Calibri" w:csTheme="minorHAnsi"/>
+        </w:rPr>
+      </w:pPr>
+      <w:r>
+        <w:rPr>
+          <w:rFonts w:ascii="Calibri" w:hAnsi="Calibri" w:eastAsia="Calibri" w:cs="Calibri" w:asciiTheme="minorHAnsi" w:hAnsiTheme="minorHAnsi" w:eastAsiaTheme="minorHAnsi" w:csTheme="minorHAnsi"/>
+          <w:kern w:val="2"/>
+          <w:sz w:val="22"/>
+          <w:szCs w:val="22"/>
         </w:rPr>
         <w:t>De 11 a 15 años: 24 días</w:t>
       </w:r>
@@ -693,12 +662,15 @@
       <w:pPr>
         <w:jc w:val="both"/>
         <w:rPr>
-          <w:rFonts w:cstheme="minorHAnsi"/>
-        </w:rPr>
-      </w:pPr>
-      <w:r>
-        <w:rPr>
-          <w:rFonts w:cstheme="minorHAnsi"/>
+          <w:rFonts w:cs="Calibri" w:csTheme="minorHAnsi"/>
+        </w:rPr>
+      </w:pPr>
+      <w:r>
+        <w:rPr>
+          <w:rFonts w:ascii="Calibri" w:hAnsi="Calibri" w:eastAsia="Calibri" w:cs="Calibri" w:asciiTheme="minorHAnsi" w:hAnsiTheme="minorHAnsi" w:eastAsiaTheme="minorHAnsi" w:csTheme="minorHAnsi"/>
+          <w:kern w:val="2"/>
+          <w:sz w:val="22"/>
+          <w:szCs w:val="22"/>
         </w:rPr>
         <w:t>De 16 a 20 años: 26 días</w:t>
       </w:r>
@@ -707,12 +679,15 @@
       <w:pPr>
         <w:jc w:val="both"/>
         <w:rPr>
-          <w:rFonts w:cstheme="minorHAnsi"/>
-        </w:rPr>
-      </w:pPr>
-      <w:r>
-        <w:rPr>
-          <w:rFonts w:cstheme="minorHAnsi"/>
+          <w:rFonts w:cs="Calibri" w:csTheme="minorHAnsi"/>
+        </w:rPr>
+      </w:pPr>
+      <w:r>
+        <w:rPr>
+          <w:rFonts w:ascii="Calibri" w:hAnsi="Calibri" w:eastAsia="Calibri" w:cs="Calibri" w:asciiTheme="minorHAnsi" w:hAnsiTheme="minorHAnsi" w:eastAsiaTheme="minorHAnsi" w:csTheme="minorHAnsi"/>
+          <w:kern w:val="2"/>
+          <w:sz w:val="22"/>
+          <w:szCs w:val="22"/>
         </w:rPr>
         <w:t>De 21 a 25 años: 28 días</w:t>
       </w:r>
@@ -721,12 +696,15 @@
       <w:pPr>
         <w:jc w:val="both"/>
         <w:rPr>
-          <w:rFonts w:cstheme="minorHAnsi"/>
-        </w:rPr>
-      </w:pPr>
-      <w:r>
-        <w:rPr>
-          <w:rFonts w:cstheme="minorHAnsi"/>
+          <w:rFonts w:cs="Calibri" w:csTheme="minorHAnsi"/>
+        </w:rPr>
+      </w:pPr>
+      <w:r>
+        <w:rPr>
+          <w:rFonts w:ascii="Calibri" w:hAnsi="Calibri" w:eastAsia="Calibri" w:cs="Calibri" w:asciiTheme="minorHAnsi" w:hAnsiTheme="minorHAnsi" w:eastAsiaTheme="minorHAnsi" w:csTheme="minorHAnsi"/>
+          <w:kern w:val="2"/>
+          <w:sz w:val="22"/>
+          <w:szCs w:val="22"/>
         </w:rPr>
         <w:t>De 26 a 30 años: 30 días</w:t>
       </w:r>
@@ -737,17 +715,21 @@
           <w:ilvl w:val="0"/>
           <w:numId w:val="1"/>
         </w:numPr>
-        <w:rPr>
-          <w:rFonts w:cstheme="minorHAnsi"/>
-          <w:b/>
-          <w:bCs/>
-        </w:rPr>
-      </w:pPr>
-      <w:r>
-        <w:rPr>
-          <w:rFonts w:cstheme="minorHAnsi"/>
-          <w:b/>
-          <w:bCs/>
+        <w:ind w:left="720" w:hanging="360"/>
+        <w:rPr>
+          <w:rFonts w:cs="Calibri" w:csTheme="minorHAnsi"/>
+          <w:b/>
+          <w:bCs/>
+        </w:rPr>
+      </w:pPr>
+      <w:r>
+        <w:rPr>
+          <w:rFonts w:ascii="Calibri" w:hAnsi="Calibri" w:eastAsia="Calibri" w:cs="Calibri" w:asciiTheme="minorHAnsi" w:hAnsiTheme="minorHAnsi" w:eastAsiaTheme="minorHAnsi" w:csTheme="minorHAnsi"/>
+          <w:b/>
+          <w:bCs/>
+          <w:kern w:val="2"/>
+          <w:sz w:val="22"/>
+          <w:szCs w:val="22"/>
         </w:rPr>
         <w:t>Prima vacacional:</w:t>
       </w:r>
@@ -758,14 +740,18 @@
           <w:ilvl w:val="1"/>
           <w:numId w:val="1"/>
         </w:numPr>
-        <w:jc w:val="both"/>
-        <w:rPr>
-          <w:rFonts w:cstheme="minorHAnsi"/>
-        </w:rPr>
-      </w:pPr>
-      <w:r>
-        <w:rPr>
-          <w:rFonts w:cstheme="minorHAnsi"/>
+        <w:ind w:left="1440" w:hanging="360"/>
+        <w:jc w:val="both"/>
+        <w:rPr>
+          <w:rFonts w:cs="Calibri" w:csTheme="minorHAnsi"/>
+        </w:rPr>
+      </w:pPr>
+      <w:r>
+        <w:rPr>
+          <w:rFonts w:ascii="Calibri" w:hAnsi="Calibri" w:eastAsia="Calibri" w:cs="Calibri" w:asciiTheme="minorHAnsi" w:hAnsiTheme="minorHAnsi" w:eastAsiaTheme="minorHAnsi" w:csTheme="minorHAnsi"/>
+          <w:kern w:val="2"/>
+          <w:sz w:val="22"/>
+          <w:szCs w:val="22"/>
         </w:rPr>
         <w:t>Se acordarán con base al mandato constitucional y al porcentaje que se fije en la Ley Federal del trabajo, por lo que se vigilará el cumplimiento del pago correspondiente.</w:t>
       </w:r>
@@ -776,17 +762,21 @@
           <w:ilvl w:val="0"/>
           <w:numId w:val="1"/>
         </w:numPr>
-        <w:rPr>
-          <w:rFonts w:cstheme="minorHAnsi"/>
-          <w:b/>
-          <w:bCs/>
-        </w:rPr>
-      </w:pPr>
-      <w:r>
-        <w:rPr>
-          <w:rFonts w:cstheme="minorHAnsi"/>
-          <w:b/>
-          <w:bCs/>
+        <w:ind w:left="720" w:hanging="360"/>
+        <w:rPr>
+          <w:rFonts w:cs="Calibri" w:csTheme="minorHAnsi"/>
+          <w:b/>
+          <w:bCs/>
+        </w:rPr>
+      </w:pPr>
+      <w:r>
+        <w:rPr>
+          <w:rFonts w:ascii="Calibri" w:hAnsi="Calibri" w:eastAsia="Calibri" w:cs="Calibri" w:asciiTheme="minorHAnsi" w:hAnsiTheme="minorHAnsi" w:eastAsiaTheme="minorHAnsi" w:csTheme="minorHAnsi"/>
+          <w:b/>
+          <w:bCs/>
+          <w:kern w:val="2"/>
+          <w:sz w:val="22"/>
+          <w:szCs w:val="22"/>
         </w:rPr>
         <w:t>PRIMA DOMINICAL:</w:t>
       </w:r>
@@ -797,14 +787,18 @@
           <w:ilvl w:val="1"/>
           <w:numId w:val="1"/>
         </w:numPr>
-        <w:jc w:val="both"/>
-        <w:rPr>
-          <w:rFonts w:cstheme="minorHAnsi"/>
-        </w:rPr>
-      </w:pPr>
-      <w:r>
-        <w:rPr>
-          <w:rFonts w:cstheme="minorHAnsi"/>
+        <w:ind w:left="1440" w:hanging="360"/>
+        <w:jc w:val="both"/>
+        <w:rPr>
+          <w:rFonts w:cs="Calibri" w:csTheme="minorHAnsi"/>
+        </w:rPr>
+      </w:pPr>
+      <w:r>
+        <w:rPr>
+          <w:rFonts w:ascii="Calibri" w:hAnsi="Calibri" w:eastAsia="Calibri" w:cs="Calibri" w:asciiTheme="minorHAnsi" w:hAnsiTheme="minorHAnsi" w:eastAsiaTheme="minorHAnsi" w:csTheme="minorHAnsi"/>
+          <w:kern w:val="2"/>
+          <w:sz w:val="22"/>
+          <w:szCs w:val="22"/>
         </w:rPr>
         <w:t>Se acordarán con base al mandato constitucional y al porcentaje que se fije en la Ley Federal del trabajo, por lo que se vigilará el cumplimiento del pago correspondiente.</w:t>
       </w:r>
@@ -815,17 +809,21 @@
           <w:ilvl w:val="0"/>
           <w:numId w:val="1"/>
         </w:numPr>
-        <w:rPr>
-          <w:rFonts w:cstheme="minorHAnsi"/>
-          <w:b/>
-          <w:bCs/>
-        </w:rPr>
-      </w:pPr>
-      <w:r>
-        <w:rPr>
-          <w:rFonts w:cstheme="minorHAnsi"/>
-          <w:b/>
-          <w:bCs/>
+        <w:ind w:left="720" w:hanging="360"/>
+        <w:rPr>
+          <w:rFonts w:cs="Calibri" w:csTheme="minorHAnsi"/>
+          <w:b/>
+          <w:bCs/>
+        </w:rPr>
+      </w:pPr>
+      <w:r>
+        <w:rPr>
+          <w:rFonts w:ascii="Calibri" w:hAnsi="Calibri" w:eastAsia="Calibri" w:cs="Calibri" w:asciiTheme="minorHAnsi" w:hAnsiTheme="minorHAnsi" w:eastAsiaTheme="minorHAnsi" w:csTheme="minorHAnsi"/>
+          <w:b/>
+          <w:bCs/>
+          <w:kern w:val="2"/>
+          <w:sz w:val="22"/>
+          <w:szCs w:val="22"/>
         </w:rPr>
         <w:t>AGUINALDO:</w:t>
       </w:r>
@@ -836,20 +834,24 @@
           <w:ilvl w:val="1"/>
           <w:numId w:val="1"/>
         </w:numPr>
-        <w:jc w:val="both"/>
-        <w:rPr>
-          <w:rFonts w:cstheme="minorHAnsi"/>
+        <w:ind w:left="1440" w:hanging="360"/>
+        <w:jc w:val="both"/>
+        <w:rPr>
+          <w:rFonts w:cs="Calibri" w:csTheme="minorHAnsi"/>
         </w:rPr>
       </w:pPr>
       <w:bookmarkStart w:id="0" w:name="_Hlk156215886"/>
       <w:r>
         <w:rPr>
-          <w:rFonts w:cstheme="minorHAnsi"/>
+          <w:rFonts w:ascii="Calibri" w:hAnsi="Calibri" w:eastAsia="Calibri" w:cs="Calibri" w:asciiTheme="minorHAnsi" w:hAnsiTheme="minorHAnsi" w:eastAsiaTheme="minorHAnsi" w:csTheme="minorHAnsi"/>
+          <w:kern w:val="2"/>
+          <w:sz w:val="22"/>
+          <w:szCs w:val="22"/>
         </w:rPr>
         <w:t>Se acordarán con base al mandato constitucional y a los días que se fije en la Ley Federal del trabajo, por lo que se vigilará el cumplimiento del pago correspondiente.</w:t>
       </w:r>
-    </w:p>
-    <w:bookmarkEnd w:id="0"/>
+      <w:bookmarkEnd w:id="0"/>
+    </w:p>
     <w:p>
       <w:pPr>
         <w:pStyle w:val="Prrafodelista"/>
@@ -857,17 +859,21 @@
           <w:ilvl w:val="0"/>
           <w:numId w:val="1"/>
         </w:numPr>
-        <w:rPr>
-          <w:rFonts w:cstheme="minorHAnsi"/>
-          <w:b/>
-          <w:bCs/>
-        </w:rPr>
-      </w:pPr>
-      <w:r>
-        <w:rPr>
-          <w:rFonts w:cstheme="minorHAnsi"/>
-          <w:b/>
-          <w:bCs/>
+        <w:ind w:left="720" w:hanging="360"/>
+        <w:rPr>
+          <w:rFonts w:cs="Calibri" w:csTheme="minorHAnsi"/>
+          <w:b/>
+          <w:bCs/>
+        </w:rPr>
+      </w:pPr>
+      <w:r>
+        <w:rPr>
+          <w:rFonts w:ascii="Calibri" w:hAnsi="Calibri" w:eastAsia="Calibri" w:cs="Calibri" w:asciiTheme="minorHAnsi" w:hAnsiTheme="minorHAnsi" w:eastAsiaTheme="minorHAnsi" w:csTheme="minorHAnsi"/>
+          <w:b/>
+          <w:bCs/>
+          <w:kern w:val="2"/>
+          <w:sz w:val="22"/>
+          <w:szCs w:val="22"/>
         </w:rPr>
         <w:t>JORNADA LABORAL:</w:t>
       </w:r>
@@ -879,13 +885,17 @@
           <w:ilvl w:val="0"/>
           <w:numId w:val="5"/>
         </w:numPr>
-        <w:rPr>
-          <w:rFonts w:cstheme="minorHAnsi"/>
-        </w:rPr>
-      </w:pPr>
-      <w:r>
-        <w:rPr>
-          <w:rFonts w:cstheme="minorHAnsi"/>
+        <w:ind w:left="1440" w:hanging="360"/>
+        <w:rPr>
+          <w:rFonts w:cs="Calibri" w:csTheme="minorHAnsi"/>
+        </w:rPr>
+      </w:pPr>
+      <w:r>
+        <w:rPr>
+          <w:rFonts w:ascii="Calibri" w:hAnsi="Calibri" w:eastAsia="Calibri" w:cs="Calibri" w:asciiTheme="minorHAnsi" w:hAnsiTheme="minorHAnsi" w:eastAsiaTheme="minorHAnsi" w:csTheme="minorHAnsi"/>
+          <w:kern w:val="2"/>
+          <w:sz w:val="22"/>
+          <w:szCs w:val="22"/>
         </w:rPr>
         <w:t>Vigilaremos el cumplimiento de las jornadas laborales establecidas en la LFT.</w:t>
       </w:r>
@@ -895,7 +905,7 @@
         <w:pStyle w:val="Prrafodelista"/>
         <w:ind w:left="1440"/>
         <w:rPr>
-          <w:rFonts w:cstheme="minorHAnsi"/>
+          <w:rFonts w:cs="Calibri" w:csTheme="minorHAnsi"/>
         </w:rPr>
       </w:pPr>
     </w:p>
@@ -906,25 +916,32 @@
           <w:ilvl w:val="0"/>
           <w:numId w:val="6"/>
         </w:numPr>
-        <w:rPr>
-          <w:rFonts w:cstheme="minorHAnsi"/>
-          <w:b/>
-          <w:bCs/>
-        </w:rPr>
-      </w:pPr>
-      <w:r>
-        <w:rPr>
-          <w:rFonts w:cstheme="minorHAnsi"/>
-          <w:b/>
-          <w:bCs/>
+        <w:ind w:left="720" w:hanging="360"/>
+        <w:rPr>
+          <w:rFonts w:cs="Calibri" w:csTheme="minorHAnsi"/>
+          <w:b/>
+          <w:bCs/>
+        </w:rPr>
+      </w:pPr>
+      <w:r>
+        <w:rPr>
+          <w:rFonts w:ascii="Calibri" w:hAnsi="Calibri" w:eastAsia="Calibri" w:cs="Calibri" w:asciiTheme="minorHAnsi" w:hAnsiTheme="minorHAnsi" w:eastAsiaTheme="minorHAnsi" w:csTheme="minorHAnsi"/>
+          <w:b/>
+          <w:bCs/>
+          <w:kern w:val="2"/>
+          <w:sz w:val="22"/>
+          <w:szCs w:val="22"/>
         </w:rPr>
         <w:t xml:space="preserve">LOS DÍAS DE DESCANSO </w:t>
       </w:r>
       <w:r>
         <w:rPr>
-          <w:rFonts w:cstheme="minorHAnsi"/>
-          <w:b/>
-          <w:bCs/>
+          <w:rFonts w:ascii="Calibri" w:hAnsi="Calibri" w:eastAsia="Calibri" w:cs="Calibri" w:asciiTheme="minorHAnsi" w:hAnsiTheme="minorHAnsi" w:eastAsiaTheme="minorHAnsi" w:csTheme="minorHAnsi"/>
+          <w:b/>
+          <w:bCs/>
+          <w:kern w:val="2"/>
+          <w:sz w:val="22"/>
+          <w:szCs w:val="22"/>
         </w:rPr>
         <w:t>OBLIGATORIO ESTABLECIDOS:</w:t>
       </w:r>
@@ -933,12 +950,15 @@
       <w:pPr>
         <w:ind w:left="360"/>
         <w:rPr>
-          <w:rFonts w:cstheme="minorHAnsi"/>
-        </w:rPr>
-      </w:pPr>
-      <w:r>
-        <w:rPr>
-          <w:rFonts w:cstheme="minorHAnsi"/>
+          <w:rFonts w:cs="Calibri" w:csTheme="minorHAnsi"/>
+        </w:rPr>
+      </w:pPr>
+      <w:r>
+        <w:rPr>
+          <w:rFonts w:ascii="Calibri" w:hAnsi="Calibri" w:eastAsia="Calibri" w:cs="Calibri" w:asciiTheme="minorHAnsi" w:hAnsiTheme="minorHAnsi" w:eastAsiaTheme="minorHAnsi" w:csTheme="minorHAnsi"/>
+          <w:kern w:val="2"/>
+          <w:sz w:val="22"/>
+          <w:szCs w:val="22"/>
         </w:rPr>
         <w:t>Los días de descanso obligatorio se encuentran señalados en el artículo 74 de la LFT, siendo estos:</w:t>
       </w:r>
@@ -949,12 +969,15 @@
         <w:ind w:left="1440"/>
         <w:jc w:val="both"/>
         <w:rPr>
-          <w:rFonts w:cstheme="minorHAnsi"/>
-        </w:rPr>
-      </w:pPr>
-      <w:r>
-        <w:rPr>
-          <w:rFonts w:cstheme="minorHAnsi"/>
+          <w:rFonts w:cs="Calibri" w:csTheme="minorHAnsi"/>
+        </w:rPr>
+      </w:pPr>
+      <w:r>
+        <w:rPr>
+          <w:rFonts w:ascii="Calibri" w:hAnsi="Calibri" w:eastAsia="Calibri" w:cs="Calibri" w:asciiTheme="minorHAnsi" w:hAnsiTheme="minorHAnsi" w:eastAsiaTheme="minorHAnsi" w:csTheme="minorHAnsi"/>
+          <w:kern w:val="2"/>
+          <w:sz w:val="22"/>
+          <w:szCs w:val="22"/>
         </w:rPr>
         <w:t>I. El 1o. de enero;</w:t>
       </w:r>
@@ -965,12 +988,15 @@
         <w:ind w:left="1440"/>
         <w:jc w:val="both"/>
         <w:rPr>
-          <w:rFonts w:cstheme="minorHAnsi"/>
-        </w:rPr>
-      </w:pPr>
-      <w:r>
-        <w:rPr>
-          <w:rFonts w:cstheme="minorHAnsi"/>
+          <w:rFonts w:cs="Calibri" w:csTheme="minorHAnsi"/>
+        </w:rPr>
+      </w:pPr>
+      <w:r>
+        <w:rPr>
+          <w:rFonts w:ascii="Calibri" w:hAnsi="Calibri" w:eastAsia="Calibri" w:cs="Calibri" w:asciiTheme="minorHAnsi" w:hAnsiTheme="minorHAnsi" w:eastAsiaTheme="minorHAnsi" w:csTheme="minorHAnsi"/>
+          <w:kern w:val="2"/>
+          <w:sz w:val="22"/>
+          <w:szCs w:val="22"/>
         </w:rPr>
         <w:t>II. El primer lunes de febrero en conmemoración del 5 de febrero;</w:t>
       </w:r>
@@ -981,12 +1007,15 @@
         <w:ind w:left="1440"/>
         <w:jc w:val="both"/>
         <w:rPr>
-          <w:rFonts w:cstheme="minorHAnsi"/>
-        </w:rPr>
-      </w:pPr>
-      <w:r>
-        <w:rPr>
-          <w:rFonts w:cstheme="minorHAnsi"/>
+          <w:rFonts w:cs="Calibri" w:csTheme="minorHAnsi"/>
+        </w:rPr>
+      </w:pPr>
+      <w:r>
+        <w:rPr>
+          <w:rFonts w:ascii="Calibri" w:hAnsi="Calibri" w:eastAsia="Calibri" w:cs="Calibri" w:asciiTheme="minorHAnsi" w:hAnsiTheme="minorHAnsi" w:eastAsiaTheme="minorHAnsi" w:csTheme="minorHAnsi"/>
+          <w:kern w:val="2"/>
+          <w:sz w:val="22"/>
+          <w:szCs w:val="22"/>
         </w:rPr>
         <w:t>III. El tercer lunes de marzo en conmemoración del 21 de marzo;</w:t>
       </w:r>
@@ -997,12 +1026,15 @@
         <w:ind w:left="1440"/>
         <w:jc w:val="both"/>
         <w:rPr>
-          <w:rFonts w:cstheme="minorHAnsi"/>
-        </w:rPr>
-      </w:pPr>
-      <w:r>
-        <w:rPr>
-          <w:rFonts w:cstheme="minorHAnsi"/>
+          <w:rFonts w:cs="Calibri" w:csTheme="minorHAnsi"/>
+        </w:rPr>
+      </w:pPr>
+      <w:r>
+        <w:rPr>
+          <w:rFonts w:ascii="Calibri" w:hAnsi="Calibri" w:eastAsia="Calibri" w:cs="Calibri" w:asciiTheme="minorHAnsi" w:hAnsiTheme="minorHAnsi" w:eastAsiaTheme="minorHAnsi" w:csTheme="minorHAnsi"/>
+          <w:kern w:val="2"/>
+          <w:sz w:val="22"/>
+          <w:szCs w:val="22"/>
         </w:rPr>
         <w:t>IV. El 1o. de mayo;</w:t>
       </w:r>
@@ -1013,12 +1045,15 @@
         <w:ind w:left="1440"/>
         <w:jc w:val="both"/>
         <w:rPr>
-          <w:rFonts w:cstheme="minorHAnsi"/>
-        </w:rPr>
-      </w:pPr>
-      <w:r>
-        <w:rPr>
-          <w:rFonts w:cstheme="minorHAnsi"/>
+          <w:rFonts w:cs="Calibri" w:csTheme="minorHAnsi"/>
+        </w:rPr>
+      </w:pPr>
+      <w:r>
+        <w:rPr>
+          <w:rFonts w:ascii="Calibri" w:hAnsi="Calibri" w:eastAsia="Calibri" w:cs="Calibri" w:asciiTheme="minorHAnsi" w:hAnsiTheme="minorHAnsi" w:eastAsiaTheme="minorHAnsi" w:csTheme="minorHAnsi"/>
+          <w:kern w:val="2"/>
+          <w:sz w:val="22"/>
+          <w:szCs w:val="22"/>
         </w:rPr>
         <w:t>V. El 16 de septiembre</w:t>
       </w:r>
@@ -1029,12 +1064,15 @@
         <w:ind w:left="1440"/>
         <w:jc w:val="both"/>
         <w:rPr>
-          <w:rFonts w:cstheme="minorHAnsi"/>
-        </w:rPr>
-      </w:pPr>
-      <w:r>
-        <w:rPr>
-          <w:rFonts w:cstheme="minorHAnsi"/>
+          <w:rFonts w:cs="Calibri" w:csTheme="minorHAnsi"/>
+        </w:rPr>
+      </w:pPr>
+      <w:r>
+        <w:rPr>
+          <w:rFonts w:ascii="Calibri" w:hAnsi="Calibri" w:eastAsia="Calibri" w:cs="Calibri" w:asciiTheme="minorHAnsi" w:hAnsiTheme="minorHAnsi" w:eastAsiaTheme="minorHAnsi" w:csTheme="minorHAnsi"/>
+          <w:kern w:val="2"/>
+          <w:sz w:val="22"/>
+          <w:szCs w:val="22"/>
         </w:rPr>
         <w:t>VI. El tercer lunes de noviembre en conmemoración del 20 de noviembre;</w:t>
       </w:r>
@@ -1045,12 +1083,15 @@
         <w:ind w:left="1440"/>
         <w:jc w:val="both"/>
         <w:rPr>
-          <w:rFonts w:cstheme="minorHAnsi"/>
-        </w:rPr>
-      </w:pPr>
-      <w:r>
-        <w:rPr>
-          <w:rFonts w:cstheme="minorHAnsi"/>
+          <w:rFonts w:cs="Calibri" w:csTheme="minorHAnsi"/>
+        </w:rPr>
+      </w:pPr>
+      <w:r>
+        <w:rPr>
+          <w:rFonts w:ascii="Calibri" w:hAnsi="Calibri" w:eastAsia="Calibri" w:cs="Calibri" w:asciiTheme="minorHAnsi" w:hAnsiTheme="minorHAnsi" w:eastAsiaTheme="minorHAnsi" w:csTheme="minorHAnsi"/>
+          <w:kern w:val="2"/>
+          <w:sz w:val="22"/>
+          <w:szCs w:val="22"/>
         </w:rPr>
         <w:t>VII. El 1o. de diciembre de cada seis años, cuando corresponda a la transmisión del Poder Ejecutivo Federal;</w:t>
       </w:r>
@@ -1061,12 +1102,15 @@
         <w:ind w:left="1440"/>
         <w:jc w:val="both"/>
         <w:rPr>
-          <w:rFonts w:cstheme="minorHAnsi"/>
-        </w:rPr>
-      </w:pPr>
-      <w:r>
-        <w:rPr>
-          <w:rFonts w:cstheme="minorHAnsi"/>
+          <w:rFonts w:cs="Calibri" w:csTheme="minorHAnsi"/>
+        </w:rPr>
+      </w:pPr>
+      <w:r>
+        <w:rPr>
+          <w:rFonts w:ascii="Calibri" w:hAnsi="Calibri" w:eastAsia="Calibri" w:cs="Calibri" w:asciiTheme="minorHAnsi" w:hAnsiTheme="minorHAnsi" w:eastAsiaTheme="minorHAnsi" w:csTheme="minorHAnsi"/>
+          <w:kern w:val="2"/>
+          <w:sz w:val="22"/>
+          <w:szCs w:val="22"/>
         </w:rPr>
         <w:t>VIII. El 25 de diciembre,</w:t>
       </w:r>
@@ -1075,12 +1119,15 @@
       <w:pPr>
         <w:jc w:val="both"/>
         <w:rPr>
-          <w:rFonts w:cstheme="minorHAnsi"/>
-        </w:rPr>
-      </w:pPr>
-      <w:r>
-        <w:rPr>
-          <w:rFonts w:cstheme="minorHAnsi"/>
+          <w:rFonts w:cs="Calibri" w:csTheme="minorHAnsi"/>
+        </w:rPr>
+      </w:pPr>
+      <w:r>
+        <w:rPr>
+          <w:rFonts w:ascii="Calibri" w:hAnsi="Calibri" w:eastAsia="Calibri" w:cs="Calibri" w:asciiTheme="minorHAnsi" w:hAnsiTheme="minorHAnsi" w:eastAsiaTheme="minorHAnsi" w:csTheme="minorHAnsi"/>
+          <w:kern w:val="2"/>
+          <w:sz w:val="22"/>
+          <w:szCs w:val="22"/>
         </w:rPr>
         <w:t>En primera instancia las y los trabajadores y las y los patrones deberán determinar el número de trabajadores(as) que deban prestar sus servicios. Los trabajadores(as) quedarán obligados a prestar los servicios y tendrán derecho a que se les pague, independientemente del salario que les corresponda por el descanso obligatorio, un salario doble por el servicio prestado, es decir, se les deberá de cubrir el salario diario normal más el doble.</w:t>
       </w:r>
@@ -1089,20 +1136,25 @@
       <w:pPr>
         <w:jc w:val="both"/>
         <w:rPr>
-          <w:rFonts w:cstheme="minorHAnsi"/>
-        </w:rPr>
-      </w:pPr>
-      <w:r>
-        <w:rPr>
-          <w:rFonts w:cstheme="minorHAnsi"/>
+          <w:rFonts w:cs="Calibri" w:csTheme="minorHAnsi"/>
+        </w:rPr>
+      </w:pPr>
+      <w:r>
+        <w:rPr>
+          <w:rFonts w:ascii="Calibri" w:hAnsi="Calibri" w:eastAsia="Calibri" w:cs="Calibri" w:asciiTheme="minorHAnsi" w:hAnsiTheme="minorHAnsi" w:eastAsiaTheme="minorHAnsi" w:csTheme="minorHAnsi"/>
+          <w:kern w:val="2"/>
+          <w:sz w:val="22"/>
+          <w:szCs w:val="22"/>
         </w:rPr>
         <w:t xml:space="preserve">Adicional a lo anterior, si de acuerdo al calendario el día de descanso obligatorio llegará a coincidir con el día de descanso semanal, es decir el día domingo, la o el patrón deberá de cubrirle </w:t>
       </w:r>
       <w:r>
         <w:rPr>
-          <w:rFonts w:cstheme="minorHAnsi"/>
-        </w:rPr>
-        <w:lastRenderedPageBreak/>
+          <w:rFonts w:ascii="Calibri" w:hAnsi="Calibri" w:eastAsia="Calibri" w:cs="Calibri" w:asciiTheme="minorHAnsi" w:hAnsiTheme="minorHAnsi" w:eastAsiaTheme="minorHAnsi" w:csTheme="minorHAnsi"/>
+          <w:kern w:val="2"/>
+          <w:sz w:val="22"/>
+          <w:szCs w:val="22"/>
+        </w:rPr>
         <w:t>al  trabajador(a) el pago de la prima dominical que marca el artículo 71 de la Ley Federal del Trabajo el cual señala: Las y los trabajadores que presten servicio en día domingo tendrán derecho a una prima adicional de un veinticinco por ciento, por lo menos, sobre el salario de los días ordinarios de trabajo.</w:t>
       </w:r>
     </w:p>
@@ -1113,17 +1165,21 @@
           <w:ilvl w:val="0"/>
           <w:numId w:val="6"/>
         </w:numPr>
-        <w:rPr>
-          <w:rFonts w:cstheme="minorHAnsi"/>
-          <w:b/>
-          <w:bCs/>
-        </w:rPr>
-      </w:pPr>
-      <w:r>
-        <w:rPr>
-          <w:rFonts w:cstheme="minorHAnsi"/>
-          <w:b/>
-          <w:bCs/>
+        <w:ind w:left="720" w:hanging="360"/>
+        <w:rPr>
+          <w:rFonts w:cs="Calibri" w:csTheme="minorHAnsi"/>
+          <w:b/>
+          <w:bCs/>
+        </w:rPr>
+      </w:pPr>
+      <w:r>
+        <w:rPr>
+          <w:rFonts w:ascii="Calibri" w:hAnsi="Calibri" w:eastAsia="Calibri" w:cs="Calibri" w:asciiTheme="minorHAnsi" w:hAnsiTheme="minorHAnsi" w:eastAsiaTheme="minorHAnsi" w:csTheme="minorHAnsi"/>
+          <w:b/>
+          <w:bCs/>
+          <w:kern w:val="2"/>
+          <w:sz w:val="22"/>
+          <w:szCs w:val="22"/>
         </w:rPr>
         <w:t>CLÁUSULAS RELATIVAS A LA CAPACITACIÓN O ADIESTRAMIENTO:</w:t>
       </w:r>
@@ -1132,7 +1188,7 @@
       <w:pPr>
         <w:pStyle w:val="Prrafodelista"/>
         <w:rPr>
-          <w:rFonts w:cstheme="minorHAnsi"/>
+          <w:rFonts w:cs="Calibri" w:csTheme="minorHAnsi"/>
           <w:b/>
           <w:bCs/>
         </w:rPr>
@@ -1145,14 +1201,18 @@
           <w:ilvl w:val="0"/>
           <w:numId w:val="5"/>
         </w:numPr>
-        <w:rPr>
-          <w:rFonts w:cstheme="minorHAnsi"/>
+        <w:ind w:left="1440" w:hanging="360"/>
+        <w:rPr>
+          <w:rFonts w:cs="Calibri" w:csTheme="minorHAnsi"/>
           <w:color w:val="C00000"/>
         </w:rPr>
       </w:pPr>
       <w:r>
         <w:rPr>
-          <w:rFonts w:cstheme="minorHAnsi"/>
+          <w:rFonts w:ascii="Calibri" w:hAnsi="Calibri" w:eastAsia="Calibri" w:cs="Calibri" w:asciiTheme="minorHAnsi" w:hAnsiTheme="minorHAnsi" w:eastAsiaTheme="minorHAnsi" w:csTheme="minorHAnsi"/>
+          <w:kern w:val="2"/>
+          <w:sz w:val="22"/>
+          <w:szCs w:val="22"/>
         </w:rPr>
         <w:t>Periodos de capacitación y temas referentes a las necesidades de los trabajadores.</w:t>
       </w:r>
@@ -1162,7 +1222,7 @@
         <w:pStyle w:val="Prrafodelista"/>
         <w:ind w:left="1440"/>
         <w:rPr>
-          <w:rFonts w:cstheme="minorHAnsi"/>
+          <w:rFonts w:cs="Calibri" w:csTheme="minorHAnsi"/>
         </w:rPr>
       </w:pPr>
     </w:p>
@@ -1173,17 +1233,21 @@
           <w:ilvl w:val="0"/>
           <w:numId w:val="6"/>
         </w:numPr>
-        <w:rPr>
-          <w:rFonts w:cstheme="minorHAnsi"/>
-          <w:b/>
-          <w:bCs/>
-        </w:rPr>
-      </w:pPr>
-      <w:r>
-        <w:rPr>
-          <w:rFonts w:cstheme="minorHAnsi"/>
-          <w:b/>
-          <w:bCs/>
+        <w:ind w:left="720" w:hanging="360"/>
+        <w:rPr>
+          <w:rFonts w:cs="Calibri" w:csTheme="minorHAnsi"/>
+          <w:b/>
+          <w:bCs/>
+        </w:rPr>
+      </w:pPr>
+      <w:r>
+        <w:rPr>
+          <w:rFonts w:ascii="Calibri" w:hAnsi="Calibri" w:eastAsia="Calibri" w:cs="Calibri" w:asciiTheme="minorHAnsi" w:hAnsiTheme="minorHAnsi" w:eastAsiaTheme="minorHAnsi" w:csTheme="minorHAnsi"/>
+          <w:b/>
+          <w:bCs/>
+          <w:kern w:val="2"/>
+          <w:sz w:val="22"/>
+          <w:szCs w:val="22"/>
         </w:rPr>
         <w:t>INTEGRACIÓN Y FUNCIONAMIENTO DE LAS COMISIONES.</w:t>
       </w:r>
@@ -1195,14 +1259,18 @@
           <w:ilvl w:val="0"/>
           <w:numId w:val="5"/>
         </w:numPr>
-        <w:jc w:val="both"/>
-        <w:rPr>
-          <w:rFonts w:cstheme="minorHAnsi"/>
-        </w:rPr>
-      </w:pPr>
-      <w:r>
-        <w:rPr>
-          <w:rFonts w:cstheme="minorHAnsi"/>
+        <w:ind w:left="1440" w:hanging="360"/>
+        <w:jc w:val="both"/>
+        <w:rPr>
+          <w:rFonts w:cs="Calibri" w:csTheme="minorHAnsi"/>
+        </w:rPr>
+      </w:pPr>
+      <w:r>
+        <w:rPr>
+          <w:rFonts w:ascii="Calibri" w:hAnsi="Calibri" w:eastAsia="Calibri" w:cs="Calibri" w:asciiTheme="minorHAnsi" w:hAnsiTheme="minorHAnsi" w:eastAsiaTheme="minorHAnsi" w:csTheme="minorHAnsi"/>
+          <w:kern w:val="2"/>
+          <w:sz w:val="22"/>
+          <w:szCs w:val="22"/>
         </w:rPr>
         <w:t>Comisión Mixta de Productividad, Capacitación y Adiestramiento. (Fundamento Legal: CPEUM: art. 123 apartado A, fracción XII. LFT: artículos 39 A, 39 B, 132 fracción XV, 155 A, 153 E, 153 F, 155, I).</w:t>
       </w:r>
@@ -1214,20 +1282,27 @@
           <w:ilvl w:val="0"/>
           <w:numId w:val="5"/>
         </w:numPr>
-        <w:jc w:val="both"/>
-        <w:rPr>
-          <w:rFonts w:cstheme="minorHAnsi"/>
-        </w:rPr>
-      </w:pPr>
-      <w:r>
-        <w:rPr>
-          <w:rFonts w:cstheme="minorHAnsi"/>
+        <w:ind w:left="1440" w:hanging="360"/>
+        <w:jc w:val="both"/>
+        <w:rPr>
+          <w:rFonts w:cs="Calibri" w:csTheme="minorHAnsi"/>
+        </w:rPr>
+      </w:pPr>
+      <w:r>
+        <w:rPr>
+          <w:rFonts w:ascii="Calibri" w:hAnsi="Calibri" w:eastAsia="Calibri" w:cs="Calibri" w:asciiTheme="minorHAnsi" w:hAnsiTheme="minorHAnsi" w:eastAsiaTheme="minorHAnsi" w:csTheme="minorHAnsi"/>
+          <w:kern w:val="2"/>
+          <w:sz w:val="22"/>
+          <w:szCs w:val="22"/>
         </w:rPr>
         <w:t xml:space="preserve">Comisión Mixta para la Elaboración del Reglamento Interior de Trabajo. </w:t>
       </w:r>
       <w:r>
         <w:rPr>
-          <w:rFonts w:cstheme="minorHAnsi"/>
+          <w:rFonts w:ascii="Calibri" w:hAnsi="Calibri" w:eastAsia="Calibri" w:cs="Calibri" w:asciiTheme="minorHAnsi" w:hAnsiTheme="minorHAnsi" w:eastAsiaTheme="minorHAnsi" w:csTheme="minorHAnsi"/>
+          <w:kern w:val="2"/>
+          <w:sz w:val="22"/>
+          <w:szCs w:val="22"/>
         </w:rPr>
         <w:t>(Fundamento Legal: LFT: artículos 134 IX, 424 I y 425).</w:t>
       </w:r>
@@ -1239,14 +1314,18 @@
           <w:ilvl w:val="0"/>
           <w:numId w:val="5"/>
         </w:numPr>
-        <w:jc w:val="both"/>
-        <w:rPr>
-          <w:rFonts w:cstheme="minorHAnsi"/>
-        </w:rPr>
-      </w:pPr>
-      <w:r>
-        <w:rPr>
-          <w:rFonts w:cstheme="minorHAnsi"/>
+        <w:ind w:left="1440" w:hanging="360"/>
+        <w:jc w:val="both"/>
+        <w:rPr>
+          <w:rFonts w:cs="Calibri" w:csTheme="minorHAnsi"/>
+        </w:rPr>
+      </w:pPr>
+      <w:r>
+        <w:rPr>
+          <w:rFonts w:ascii="Calibri" w:hAnsi="Calibri" w:eastAsia="Calibri" w:cs="Calibri" w:asciiTheme="minorHAnsi" w:hAnsiTheme="minorHAnsi" w:eastAsiaTheme="minorHAnsi" w:csTheme="minorHAnsi"/>
+          <w:kern w:val="2"/>
+          <w:sz w:val="22"/>
+          <w:szCs w:val="22"/>
         </w:rPr>
         <w:t>Comisión Mixta para la Elaboración del Cuadro General de Antigüedades. (Fundamento Legal: LFT: artículos 134 IX y 158).</w:t>
       </w:r>
@@ -1258,14 +1337,18 @@
           <w:ilvl w:val="0"/>
           <w:numId w:val="5"/>
         </w:numPr>
-        <w:jc w:val="both"/>
-        <w:rPr>
-          <w:rFonts w:cstheme="minorHAnsi"/>
-        </w:rPr>
-      </w:pPr>
-      <w:r>
-        <w:rPr>
-          <w:rFonts w:cstheme="minorHAnsi"/>
+        <w:ind w:left="1440" w:hanging="360"/>
+        <w:jc w:val="both"/>
+        <w:rPr>
+          <w:rFonts w:cs="Calibri" w:csTheme="minorHAnsi"/>
+        </w:rPr>
+      </w:pPr>
+      <w:r>
+        <w:rPr>
+          <w:rFonts w:ascii="Calibri" w:hAnsi="Calibri" w:eastAsia="Calibri" w:cs="Calibri" w:asciiTheme="minorHAnsi" w:hAnsiTheme="minorHAnsi" w:eastAsiaTheme="minorHAnsi" w:csTheme="minorHAnsi"/>
+          <w:kern w:val="2"/>
+          <w:sz w:val="22"/>
+          <w:szCs w:val="22"/>
         </w:rPr>
         <w:t>Comisión Mixta para la Participación de los Trabajadores en las Utilidades de la Empresa. (Fundamento Legal: CPEUM: art. 123 apartado A fracción IX. LFT: artículos del 120 al 125).</w:t>
       </w:r>
@@ -1277,26 +1360,36 @@
           <w:ilvl w:val="0"/>
           <w:numId w:val="5"/>
         </w:numPr>
-        <w:jc w:val="both"/>
-        <w:rPr>
-          <w:rFonts w:cstheme="minorHAnsi"/>
-        </w:rPr>
-      </w:pPr>
-      <w:r>
-        <w:rPr>
-          <w:rFonts w:cstheme="minorHAnsi"/>
+        <w:ind w:left="1440" w:hanging="360"/>
+        <w:jc w:val="both"/>
+        <w:rPr>
+          <w:rFonts w:cs="Calibri" w:csTheme="minorHAnsi"/>
+        </w:rPr>
+      </w:pPr>
+      <w:r>
+        <w:rPr>
+          <w:rFonts w:ascii="Calibri" w:hAnsi="Calibri" w:eastAsia="Calibri" w:cs="Calibri" w:asciiTheme="minorHAnsi" w:hAnsiTheme="minorHAnsi" w:eastAsiaTheme="minorHAnsi" w:csTheme="minorHAnsi"/>
+          <w:kern w:val="2"/>
+          <w:sz w:val="22"/>
+          <w:szCs w:val="22"/>
         </w:rPr>
         <w:t xml:space="preserve">Comisión Mixta de Seguridad e Higiene (Fundamento Legal: CPEUM: articulo 123, apartado A, fracción XV. LFT: 134 IX, 509, 510, 994 V. RFSST: 7, 8-11 Y 9 </w:t>
       </w:r>
       <w:r>
         <w:rPr>
-          <w:rFonts w:cstheme="minorHAnsi"/>
+          <w:rFonts w:ascii="Calibri" w:hAnsi="Calibri" w:eastAsia="Calibri" w:cs="Calibri" w:asciiTheme="minorHAnsi" w:hAnsiTheme="minorHAnsi" w:eastAsiaTheme="minorHAnsi" w:csTheme="minorHAnsi"/>
+          <w:kern w:val="2"/>
+          <w:sz w:val="22"/>
+          <w:szCs w:val="22"/>
         </w:rPr>
         <w:t>y NOM</w:t>
       </w:r>
       <w:r>
         <w:rPr>
-          <w:rFonts w:cstheme="minorHAnsi"/>
+          <w:rFonts w:ascii="Calibri" w:hAnsi="Calibri" w:eastAsia="Calibri" w:cs="Calibri" w:asciiTheme="minorHAnsi" w:hAnsiTheme="minorHAnsi" w:eastAsiaTheme="minorHAnsi" w:csTheme="minorHAnsi"/>
+          <w:kern w:val="2"/>
+          <w:sz w:val="22"/>
+          <w:szCs w:val="22"/>
         </w:rPr>
         <w:t>-019-STPS-2011.</w:t>
       </w:r>
@@ -1307,17 +1400,21 @@
           <w:ilvl w:val="0"/>
           <w:numId w:val="1"/>
         </w:numPr>
-        <w:rPr>
-          <w:rFonts w:cstheme="minorHAnsi"/>
-          <w:b/>
-          <w:bCs/>
-        </w:rPr>
-      </w:pPr>
-      <w:r>
-        <w:rPr>
-          <w:rFonts w:cstheme="minorHAnsi"/>
-          <w:b/>
-          <w:bCs/>
+        <w:ind w:left="720" w:hanging="360"/>
+        <w:rPr>
+          <w:rFonts w:cs="Calibri" w:csTheme="minorHAnsi"/>
+          <w:b/>
+          <w:bCs/>
+        </w:rPr>
+      </w:pPr>
+      <w:r>
+        <w:rPr>
+          <w:rFonts w:ascii="Calibri" w:hAnsi="Calibri" w:eastAsia="Calibri" w:cs="Calibri" w:asciiTheme="minorHAnsi" w:hAnsiTheme="minorHAnsi" w:eastAsiaTheme="minorHAnsi" w:csTheme="minorHAnsi"/>
+          <w:b/>
+          <w:bCs/>
+          <w:kern w:val="2"/>
+          <w:sz w:val="22"/>
+          <w:szCs w:val="22"/>
         </w:rPr>
         <w:t>PRESTACIONES DE SEGURIDAD SOCIAL:</w:t>
       </w:r>
@@ -1328,13 +1425,17 @@
           <w:ilvl w:val="1"/>
           <w:numId w:val="1"/>
         </w:numPr>
-        <w:rPr>
-          <w:rFonts w:cstheme="minorHAnsi"/>
-        </w:rPr>
-      </w:pPr>
-      <w:r>
-        <w:rPr>
-          <w:rFonts w:cstheme="minorHAnsi"/>
+        <w:ind w:left="1440" w:hanging="360"/>
+        <w:rPr>
+          <w:rFonts w:cs="Calibri" w:csTheme="minorHAnsi"/>
+        </w:rPr>
+      </w:pPr>
+      <w:r>
+        <w:rPr>
+          <w:rFonts w:ascii="Calibri" w:hAnsi="Calibri" w:eastAsia="Calibri" w:cs="Calibri" w:asciiTheme="minorHAnsi" w:hAnsiTheme="minorHAnsi" w:eastAsiaTheme="minorHAnsi" w:csTheme="minorHAnsi"/>
+          <w:kern w:val="2"/>
+          <w:sz w:val="22"/>
+          <w:szCs w:val="22"/>
         </w:rPr>
         <w:t>La empresa proporcionará a los trabajadores todas las prestaciones de seguridad social que establece la Ley Federal del Trabajo.</w:t>
       </w:r>
@@ -1346,21 +1447,28 @@
           <w:ilvl w:val="0"/>
           <w:numId w:val="1"/>
         </w:numPr>
-        <w:rPr>
-          <w:rFonts w:cstheme="minorHAnsi"/>
-        </w:rPr>
-      </w:pPr>
-      <w:r>
-        <w:rPr>
-          <w:rFonts w:cstheme="minorHAnsi"/>
-          <w:b/>
-          <w:bCs/>
+        <w:ind w:left="720" w:hanging="360"/>
+        <w:rPr>
+          <w:rFonts w:cs="Calibri" w:csTheme="minorHAnsi"/>
+        </w:rPr>
+      </w:pPr>
+      <w:r>
+        <w:rPr>
+          <w:rFonts w:ascii="Calibri" w:hAnsi="Calibri" w:eastAsia="Calibri" w:cs="Calibri" w:asciiTheme="minorHAnsi" w:hAnsiTheme="minorHAnsi" w:eastAsiaTheme="minorHAnsi" w:csTheme="minorHAnsi"/>
+          <w:b/>
+          <w:bCs/>
+          <w:kern w:val="2"/>
+          <w:sz w:val="22"/>
+          <w:szCs w:val="22"/>
         </w:rPr>
         <w:t>GARANTÍA DE LA SALUD DE LOS TRABAJADORES.</w:t>
       </w:r>
       <w:r>
         <w:rPr>
-          <w:rFonts w:cstheme="minorHAnsi"/>
+          <w:rFonts w:ascii="Calibri" w:hAnsi="Calibri" w:eastAsia="Calibri" w:cs="Calibri" w:asciiTheme="minorHAnsi" w:hAnsiTheme="minorHAnsi" w:eastAsiaTheme="minorHAnsi" w:csTheme="minorHAnsi"/>
+          <w:kern w:val="2"/>
+          <w:sz w:val="22"/>
+          <w:szCs w:val="22"/>
         </w:rPr>
         <w:t xml:space="preserve"> La empresa se compromete a garantizar la salud de los trabajadores, cumpliendo con las siguientes obligaciones:</w:t>
       </w:r>
@@ -1369,7 +1477,7 @@
       <w:pPr>
         <w:pStyle w:val="Prrafodelista"/>
         <w:rPr>
-          <w:rFonts w:cstheme="minorHAnsi"/>
+          <w:rFonts w:cs="Calibri" w:csTheme="minorHAnsi"/>
         </w:rPr>
       </w:pPr>
     </w:p>
@@ -1380,13 +1488,17 @@
           <w:ilvl w:val="0"/>
           <w:numId w:val="4"/>
         </w:numPr>
-        <w:rPr>
-          <w:rFonts w:cstheme="minorHAnsi"/>
-        </w:rPr>
-      </w:pPr>
-      <w:r>
-        <w:rPr>
-          <w:rFonts w:cstheme="minorHAnsi"/>
+        <w:ind w:left="1440" w:hanging="360"/>
+        <w:rPr>
+          <w:rFonts w:cs="Calibri" w:csTheme="minorHAnsi"/>
+        </w:rPr>
+      </w:pPr>
+      <w:r>
+        <w:rPr>
+          <w:rFonts w:ascii="Calibri" w:hAnsi="Calibri" w:eastAsia="Calibri" w:cs="Calibri" w:asciiTheme="minorHAnsi" w:hAnsiTheme="minorHAnsi" w:eastAsiaTheme="minorHAnsi" w:csTheme="minorHAnsi"/>
+          <w:kern w:val="2"/>
+          <w:sz w:val="22"/>
+          <w:szCs w:val="22"/>
         </w:rPr>
         <w:t>Realizar la evaluación del cumplimiento de las Normas Oficiales Mexicanas en materia de salud expedidas por la Secretaría del Trabajo y Previsión Social (STPS).</w:t>
       </w:r>
@@ -1398,14 +1510,18 @@
           <w:ilvl w:val="0"/>
           <w:numId w:val="4"/>
         </w:numPr>
-        <w:jc w:val="both"/>
-        <w:rPr>
-          <w:rFonts w:cstheme="minorHAnsi"/>
-        </w:rPr>
-      </w:pPr>
-      <w:r>
-        <w:rPr>
-          <w:rFonts w:cstheme="minorHAnsi"/>
+        <w:ind w:left="1440" w:hanging="360"/>
+        <w:jc w:val="both"/>
+        <w:rPr>
+          <w:rFonts w:cs="Calibri" w:csTheme="minorHAnsi"/>
+        </w:rPr>
+      </w:pPr>
+      <w:r>
+        <w:rPr>
+          <w:rFonts w:ascii="Calibri" w:hAnsi="Calibri" w:eastAsia="Calibri" w:cs="Calibri" w:asciiTheme="minorHAnsi" w:hAnsiTheme="minorHAnsi" w:eastAsiaTheme="minorHAnsi" w:csTheme="minorHAnsi"/>
+          <w:kern w:val="2"/>
+          <w:sz w:val="22"/>
+          <w:szCs w:val="22"/>
         </w:rPr>
         <w:t>Proporcionar a los trabajadores los equipos de protección personal (EPP) necesarios para realizar sus labores de forma segura.</w:t>
       </w:r>
@@ -1417,14 +1533,18 @@
           <w:ilvl w:val="0"/>
           <w:numId w:val="4"/>
         </w:numPr>
-        <w:jc w:val="both"/>
-        <w:rPr>
-          <w:rFonts w:cstheme="minorHAnsi"/>
-        </w:rPr>
-      </w:pPr>
-      <w:r>
-        <w:rPr>
-          <w:rFonts w:cstheme="minorHAnsi"/>
+        <w:ind w:left="1440" w:hanging="360"/>
+        <w:jc w:val="both"/>
+        <w:rPr>
+          <w:rFonts w:cs="Calibri" w:csTheme="minorHAnsi"/>
+        </w:rPr>
+      </w:pPr>
+      <w:r>
+        <w:rPr>
+          <w:rFonts w:ascii="Calibri" w:hAnsi="Calibri" w:eastAsia="Calibri" w:cs="Calibri" w:asciiTheme="minorHAnsi" w:hAnsiTheme="minorHAnsi" w:eastAsiaTheme="minorHAnsi" w:csTheme="minorHAnsi"/>
+          <w:kern w:val="2"/>
+          <w:sz w:val="22"/>
+          <w:szCs w:val="22"/>
         </w:rPr>
         <w:t>Implementar programas de capacitación para los trabajadores en materia de seguridad y salud en el trabajo.</w:t>
       </w:r>
@@ -1436,14 +1556,18 @@
           <w:ilvl w:val="0"/>
           <w:numId w:val="4"/>
         </w:numPr>
-        <w:jc w:val="both"/>
-        <w:rPr>
-          <w:rFonts w:cstheme="minorHAnsi"/>
-        </w:rPr>
-      </w:pPr>
-      <w:r>
-        <w:rPr>
-          <w:rFonts w:cstheme="minorHAnsi"/>
+        <w:ind w:left="1440" w:hanging="360"/>
+        <w:jc w:val="both"/>
+        <w:rPr>
+          <w:rFonts w:cs="Calibri" w:csTheme="minorHAnsi"/>
+        </w:rPr>
+      </w:pPr>
+      <w:r>
+        <w:rPr>
+          <w:rFonts w:ascii="Calibri" w:hAnsi="Calibri" w:eastAsia="Calibri" w:cs="Calibri" w:asciiTheme="minorHAnsi" w:hAnsiTheme="minorHAnsi" w:eastAsiaTheme="minorHAnsi" w:csTheme="minorHAnsi"/>
+          <w:kern w:val="2"/>
+          <w:sz w:val="22"/>
+          <w:szCs w:val="22"/>
         </w:rPr>
         <w:t>Contar con un servicio médico en caso de accidentes o enfermedades laborales.</w:t>
       </w:r>
@@ -1455,14 +1579,18 @@
           <w:ilvl w:val="0"/>
           <w:numId w:val="4"/>
         </w:numPr>
-        <w:jc w:val="both"/>
-        <w:rPr>
-          <w:rFonts w:cstheme="minorHAnsi"/>
-        </w:rPr>
-      </w:pPr>
-      <w:r>
-        <w:rPr>
-          <w:rFonts w:cstheme="minorHAnsi"/>
+        <w:ind w:left="1440" w:hanging="360"/>
+        <w:jc w:val="both"/>
+        <w:rPr>
+          <w:rFonts w:cs="Calibri" w:csTheme="minorHAnsi"/>
+        </w:rPr>
+      </w:pPr>
+      <w:r>
+        <w:rPr>
+          <w:rFonts w:ascii="Calibri" w:hAnsi="Calibri" w:eastAsia="Calibri" w:cs="Calibri" w:asciiTheme="minorHAnsi" w:hAnsiTheme="minorHAnsi" w:eastAsiaTheme="minorHAnsi" w:csTheme="minorHAnsi"/>
+          <w:kern w:val="2"/>
+          <w:sz w:val="22"/>
+          <w:szCs w:val="22"/>
         </w:rPr>
         <w:t>Cuestionarios sobre la salud de los trabajadores en relación de su trabajo.</w:t>
       </w:r>
@@ -1471,54 +1599,78 @@
       <w:pPr>
         <w:jc w:val="both"/>
         <w:rPr>
-          <w:rFonts w:cstheme="minorHAnsi"/>
-        </w:rPr>
-      </w:pPr>
-      <w:r>
-        <w:rPr>
-          <w:rFonts w:cstheme="minorHAnsi"/>
+          <w:rFonts w:cs="Calibri" w:csTheme="minorHAnsi"/>
+        </w:rPr>
+      </w:pPr>
+      <w:r>
+        <w:rPr>
+          <w:rFonts w:ascii="Calibri" w:hAnsi="Calibri" w:eastAsia="Calibri" w:cs="Calibri" w:asciiTheme="minorHAnsi" w:hAnsiTheme="minorHAnsi" w:eastAsiaTheme="minorHAnsi" w:csTheme="minorHAnsi"/>
+          <w:kern w:val="2"/>
+          <w:sz w:val="22"/>
+          <w:szCs w:val="22"/>
         </w:rPr>
         <w:t>En caso de</w:t>
       </w:r>
       <w:r>
         <w:rPr>
-          <w:rFonts w:cstheme="minorHAnsi"/>
+          <w:rFonts w:ascii="Calibri" w:hAnsi="Calibri" w:eastAsia="Calibri" w:cs="Calibri" w:asciiTheme="minorHAnsi" w:hAnsiTheme="minorHAnsi" w:eastAsiaTheme="minorHAnsi" w:csTheme="minorHAnsi"/>
+          <w:kern w:val="2"/>
+          <w:sz w:val="22"/>
+          <w:szCs w:val="22"/>
         </w:rPr>
         <w:t xml:space="preserve"> que exista algún grado de</w:t>
       </w:r>
       <w:r>
         <w:rPr>
-          <w:rFonts w:cstheme="minorHAnsi"/>
+          <w:rFonts w:ascii="Calibri" w:hAnsi="Calibri" w:eastAsia="Calibri" w:cs="Calibri" w:asciiTheme="minorHAnsi" w:hAnsiTheme="minorHAnsi" w:eastAsiaTheme="minorHAnsi" w:csTheme="minorHAnsi"/>
+          <w:kern w:val="2"/>
+          <w:sz w:val="22"/>
+          <w:szCs w:val="22"/>
         </w:rPr>
         <w:t xml:space="preserve"> incumplimiento de estas obligaciones</w:t>
       </w:r>
       <w:r>
         <w:rPr>
-          <w:rFonts w:cstheme="minorHAnsi"/>
+          <w:rFonts w:ascii="Calibri" w:hAnsi="Calibri" w:eastAsia="Calibri" w:cs="Calibri" w:asciiTheme="minorHAnsi" w:hAnsiTheme="minorHAnsi" w:eastAsiaTheme="minorHAnsi" w:csTheme="minorHAnsi"/>
+          <w:kern w:val="2"/>
+          <w:sz w:val="22"/>
+          <w:szCs w:val="22"/>
         </w:rPr>
         <w:t xml:space="preserve"> o que se detecte un nivel de riesgo de trabajo que ponga en peligro la salud de los trabajadores</w:t>
       </w:r>
       <w:r>
         <w:rPr>
-          <w:rFonts w:cstheme="minorHAnsi"/>
+          <w:rFonts w:ascii="Calibri" w:hAnsi="Calibri" w:eastAsia="Calibri" w:cs="Calibri" w:asciiTheme="minorHAnsi" w:hAnsiTheme="minorHAnsi" w:eastAsiaTheme="minorHAnsi" w:csTheme="minorHAnsi"/>
+          <w:kern w:val="2"/>
+          <w:sz w:val="22"/>
+          <w:szCs w:val="22"/>
         </w:rPr>
         <w:t>,</w:t>
       </w:r>
       <w:r>
         <w:rPr>
-          <w:rFonts w:cstheme="minorHAnsi"/>
+          <w:rFonts w:ascii="Calibri" w:hAnsi="Calibri" w:eastAsia="Calibri" w:cs="Calibri" w:asciiTheme="minorHAnsi" w:hAnsiTheme="minorHAnsi" w:eastAsiaTheme="minorHAnsi" w:csTheme="minorHAnsi"/>
+          <w:kern w:val="2"/>
+          <w:sz w:val="22"/>
+          <w:szCs w:val="22"/>
         </w:rPr>
         <w:t xml:space="preserve"> se establece la obligación la</w:t>
       </w:r>
       <w:r>
         <w:rPr>
-          <w:rFonts w:cstheme="minorHAnsi"/>
+          <w:rFonts w:ascii="Calibri" w:hAnsi="Calibri" w:eastAsia="Calibri" w:cs="Calibri" w:asciiTheme="minorHAnsi" w:hAnsiTheme="minorHAnsi" w:eastAsiaTheme="minorHAnsi" w:csTheme="minorHAnsi"/>
+          <w:kern w:val="2"/>
+          <w:sz w:val="22"/>
+          <w:szCs w:val="22"/>
         </w:rPr>
         <w:t xml:space="preserve"> empresa a pagar una indemnización a los trabajadores afectados por el daño causado</w:t>
       </w:r>
       <w:r>
         <w:rPr>
-          <w:rFonts w:cstheme="minorHAnsi"/>
+          <w:rFonts w:ascii="Calibri" w:hAnsi="Calibri" w:eastAsia="Calibri" w:cs="Calibri" w:asciiTheme="minorHAnsi" w:hAnsiTheme="minorHAnsi" w:eastAsiaTheme="minorHAnsi" w:csTheme="minorHAnsi"/>
+          <w:kern w:val="2"/>
+          <w:sz w:val="22"/>
+          <w:szCs w:val="22"/>
         </w:rPr>
         <w:t>, la cual podrá ser calculado a través de la contratación de los servicios de un tercero especializado en el tema para el cumplimiento de esta obligación.</w:t>
       </w:r>
@@ -1527,18 +1679,21 @@
       <w:pPr>
         <w:jc w:val="center"/>
         <w:rPr>
-          <w:rFonts w:cstheme="minorHAnsi"/>
-          <w:b/>
-          <w:bCs/>
-        </w:rPr>
-      </w:pPr>
-      <w:r>
-        <w:rPr>
-          <w:rFonts w:cstheme="minorHAnsi"/>
-          <w:b/>
-          <w:bCs/>
-        </w:rPr>
+          <w:rFonts w:cs="Calibri" w:csTheme="minorHAnsi"/>
+          <w:b/>
+          <w:bCs/>
+        </w:rPr>
+      </w:pPr>
+      <w:r>
         <w:lastRenderedPageBreak/>
+        <w:rPr>
+          <w:rFonts w:ascii="Calibri" w:hAnsi="Calibri" w:eastAsia="Calibri" w:cs="Calibri" w:asciiTheme="minorHAnsi" w:hAnsiTheme="minorHAnsi" w:eastAsiaTheme="minorHAnsi" w:csTheme="minorHAnsi"/>
+          <w:b/>
+          <w:bCs/>
+          <w:kern w:val="2"/>
+          <w:sz w:val="22"/>
+          <w:szCs w:val="22"/>
+        </w:rPr>
         <w:t>APORTACIÓN SINDICAL:</w:t>
       </w:r>
     </w:p>
@@ -1546,137 +1701,194 @@
       <w:pPr>
         <w:jc w:val="both"/>
         <w:rPr>
-          <w:rFonts w:cstheme="minorHAnsi"/>
+          <w:rFonts w:cs="Calibri" w:csTheme="minorHAnsi"/>
           <w:color w:val="C00000"/>
         </w:rPr>
       </w:pPr>
       <w:r>
         <w:rPr>
-          <w:rFonts w:cstheme="minorHAnsi"/>
+          <w:rFonts w:ascii="Calibri" w:hAnsi="Calibri" w:eastAsia="Calibri" w:cs="Calibri" w:asciiTheme="minorHAnsi" w:hAnsiTheme="minorHAnsi" w:eastAsiaTheme="minorHAnsi" w:csTheme="minorHAnsi"/>
+          <w:kern w:val="2"/>
+          <w:sz w:val="22"/>
+          <w:szCs w:val="22"/>
         </w:rPr>
         <w:t xml:space="preserve">La cuota sindical es una cantidad que los trabajadores afiliados al sindicato deben aportar mensualmente para financiar las actividades del sindicato. El SINDICAL propone que la cuota sindical sea de </w:t>
       </w:r>
       <w:r>
         <w:rPr>
-          <w:rFonts w:cstheme="minorHAnsi"/>
+          <w:rFonts w:ascii="Calibri" w:hAnsi="Calibri" w:eastAsia="Calibri" w:cs="Calibri" w:asciiTheme="minorHAnsi" w:hAnsiTheme="minorHAnsi" w:eastAsiaTheme="minorHAnsi" w:csTheme="minorHAnsi"/>
           <w:color w:val="C00000"/>
+          <w:kern w:val="2"/>
+          <w:sz w:val="22"/>
+          <w:szCs w:val="22"/>
         </w:rPr>
         <w:t>$</w:t>
       </w:r>
       <w:r>
         <w:rPr>
-          <w:rFonts w:cstheme="minorHAnsi"/>
+          <w:rFonts w:ascii="Calibri" w:hAnsi="Calibri" w:eastAsia="Calibri" w:cs="Calibri" w:asciiTheme="minorHAnsi" w:hAnsiTheme="minorHAnsi" w:eastAsiaTheme="minorHAnsi" w:csTheme="minorHAnsi"/>
           <w:color w:val="C00000"/>
+          <w:kern w:val="2"/>
+          <w:sz w:val="22"/>
+          <w:szCs w:val="22"/>
         </w:rPr>
         <w:t>{{CU</w:t>
       </w:r>
       <w:r>
         <w:rPr>
-          <w:rFonts w:cstheme="minorHAnsi"/>
+          <w:rFonts w:ascii="Calibri" w:hAnsi="Calibri" w:eastAsia="Calibri" w:cs="Calibri" w:asciiTheme="minorHAnsi" w:hAnsiTheme="minorHAnsi" w:eastAsiaTheme="minorHAnsi" w:csTheme="minorHAnsi"/>
           <w:color w:val="C00000"/>
+          <w:kern w:val="2"/>
+          <w:sz w:val="22"/>
+          <w:szCs w:val="22"/>
         </w:rPr>
         <w:t>OTA</w:t>
       </w:r>
       <w:r>
         <w:rPr>
-          <w:rFonts w:cstheme="minorHAnsi"/>
+          <w:rFonts w:ascii="Calibri" w:hAnsi="Calibri" w:eastAsia="Calibri" w:cs="Calibri" w:asciiTheme="minorHAnsi" w:hAnsiTheme="minorHAnsi" w:eastAsiaTheme="minorHAnsi" w:csTheme="minorHAnsi"/>
           <w:color w:val="C00000"/>
+          <w:kern w:val="2"/>
+          <w:sz w:val="22"/>
+          <w:szCs w:val="22"/>
         </w:rPr>
         <w:t>_</w:t>
       </w:r>
       <w:r>
         <w:rPr>
-          <w:rFonts w:cstheme="minorHAnsi"/>
+          <w:rFonts w:ascii="Calibri" w:hAnsi="Calibri" w:eastAsia="Calibri" w:cs="Calibri" w:asciiTheme="minorHAnsi" w:hAnsiTheme="minorHAnsi" w:eastAsiaTheme="minorHAnsi" w:csTheme="minorHAnsi"/>
           <w:color w:val="C00000"/>
+          <w:kern w:val="2"/>
+          <w:sz w:val="22"/>
+          <w:szCs w:val="22"/>
         </w:rPr>
         <w:t>SINDICAL</w:t>
       </w:r>
       <w:r>
         <w:rPr>
-          <w:rFonts w:cstheme="minorHAnsi"/>
+          <w:rFonts w:ascii="Calibri" w:hAnsi="Calibri" w:eastAsia="Calibri" w:cs="Calibri" w:asciiTheme="minorHAnsi" w:hAnsiTheme="minorHAnsi" w:eastAsiaTheme="minorHAnsi" w:csTheme="minorHAnsi"/>
           <w:color w:val="C00000"/>
+          <w:kern w:val="2"/>
+          <w:sz w:val="22"/>
+          <w:szCs w:val="22"/>
         </w:rPr>
         <w:t>_</w:t>
       </w:r>
       <w:r>
         <w:rPr>
-          <w:rFonts w:cstheme="minorHAnsi"/>
+          <w:rFonts w:ascii="Calibri" w:hAnsi="Calibri" w:eastAsia="Calibri" w:cs="Calibri" w:asciiTheme="minorHAnsi" w:hAnsiTheme="minorHAnsi" w:eastAsiaTheme="minorHAnsi" w:csTheme="minorHAnsi"/>
           <w:color w:val="C00000"/>
+          <w:kern w:val="2"/>
+          <w:sz w:val="22"/>
+          <w:szCs w:val="22"/>
         </w:rPr>
         <w:t>ANUAL}}</w:t>
       </w:r>
       <w:r>
         <w:rPr>
-          <w:rFonts w:cstheme="minorHAnsi"/>
+          <w:rFonts w:ascii="Calibri" w:hAnsi="Calibri" w:eastAsia="Calibri" w:cs="Calibri" w:asciiTheme="minorHAnsi" w:hAnsiTheme="minorHAnsi" w:eastAsiaTheme="minorHAnsi" w:csTheme="minorHAnsi"/>
           <w:color w:val="C00000"/>
+          <w:kern w:val="2"/>
+          <w:sz w:val="22"/>
+          <w:szCs w:val="22"/>
         </w:rPr>
         <w:t xml:space="preserve"> </w:t>
       </w:r>
       <w:r>
         <w:rPr>
-          <w:rFonts w:cstheme="minorHAnsi"/>
+          <w:rFonts w:ascii="Calibri" w:hAnsi="Calibri" w:eastAsia="Calibri" w:cs="Calibri" w:asciiTheme="minorHAnsi" w:hAnsiTheme="minorHAnsi" w:eastAsiaTheme="minorHAnsi" w:csTheme="minorHAnsi"/>
+          <w:kern w:val="2"/>
+          <w:sz w:val="22"/>
+          <w:szCs w:val="22"/>
         </w:rPr>
         <w:t xml:space="preserve">pesos anuales, lo que equivale a </w:t>
       </w:r>
       <w:r>
         <w:rPr>
-          <w:rFonts w:cstheme="minorHAnsi"/>
+          <w:rFonts w:ascii="Calibri" w:hAnsi="Calibri" w:eastAsia="Calibri" w:cs="Calibri" w:asciiTheme="minorHAnsi" w:hAnsiTheme="minorHAnsi" w:eastAsiaTheme="minorHAnsi" w:csTheme="minorHAnsi"/>
           <w:color w:val="C00000"/>
+          <w:kern w:val="2"/>
+          <w:sz w:val="22"/>
+          <w:szCs w:val="22"/>
         </w:rPr>
         <w:t>$</w:t>
       </w:r>
       <w:r>
         <w:rPr>
-          <w:rFonts w:cstheme="minorHAnsi"/>
+          <w:rFonts w:ascii="Calibri" w:hAnsi="Calibri" w:eastAsia="Calibri" w:cs="Calibri" w:asciiTheme="minorHAnsi" w:hAnsiTheme="minorHAnsi" w:eastAsiaTheme="minorHAnsi" w:csTheme="minorHAnsi"/>
           <w:color w:val="C00000"/>
+          <w:kern w:val="2"/>
+          <w:sz w:val="22"/>
+          <w:szCs w:val="22"/>
         </w:rPr>
         <w:t>{{CU</w:t>
       </w:r>
       <w:r>
         <w:rPr>
-          <w:rFonts w:cstheme="minorHAnsi"/>
+          <w:rFonts w:ascii="Calibri" w:hAnsi="Calibri" w:eastAsia="Calibri" w:cs="Calibri" w:asciiTheme="minorHAnsi" w:hAnsiTheme="minorHAnsi" w:eastAsiaTheme="minorHAnsi" w:csTheme="minorHAnsi"/>
           <w:color w:val="C00000"/>
+          <w:kern w:val="2"/>
+          <w:sz w:val="22"/>
+          <w:szCs w:val="22"/>
         </w:rPr>
         <w:t>OTA</w:t>
       </w:r>
       <w:r>
         <w:rPr>
-          <w:rFonts w:cstheme="minorHAnsi"/>
+          <w:rFonts w:ascii="Calibri" w:hAnsi="Calibri" w:eastAsia="Calibri" w:cs="Calibri" w:asciiTheme="minorHAnsi" w:hAnsiTheme="minorHAnsi" w:eastAsiaTheme="minorHAnsi" w:csTheme="minorHAnsi"/>
           <w:color w:val="C00000"/>
+          <w:kern w:val="2"/>
+          <w:sz w:val="22"/>
+          <w:szCs w:val="22"/>
         </w:rPr>
         <w:t>_</w:t>
       </w:r>
       <w:r>
         <w:rPr>
-          <w:rFonts w:cstheme="minorHAnsi"/>
+          <w:rFonts w:ascii="Calibri" w:hAnsi="Calibri" w:eastAsia="Calibri" w:cs="Calibri" w:asciiTheme="minorHAnsi" w:hAnsiTheme="minorHAnsi" w:eastAsiaTheme="minorHAnsi" w:csTheme="minorHAnsi"/>
           <w:color w:val="C00000"/>
+          <w:kern w:val="2"/>
+          <w:sz w:val="22"/>
+          <w:szCs w:val="22"/>
         </w:rPr>
         <w:t>SINDICAL</w:t>
       </w:r>
       <w:r>
         <w:rPr>
-          <w:rFonts w:cstheme="minorHAnsi"/>
+          <w:rFonts w:ascii="Calibri" w:hAnsi="Calibri" w:eastAsia="Calibri" w:cs="Calibri" w:asciiTheme="minorHAnsi" w:hAnsiTheme="minorHAnsi" w:eastAsiaTheme="minorHAnsi" w:csTheme="minorHAnsi"/>
           <w:color w:val="C00000"/>
+          <w:kern w:val="2"/>
+          <w:sz w:val="22"/>
+          <w:szCs w:val="22"/>
         </w:rPr>
         <w:t>_</w:t>
       </w:r>
       <w:r>
         <w:rPr>
-          <w:rFonts w:cstheme="minorHAnsi"/>
+          <w:rFonts w:ascii="Calibri" w:hAnsi="Calibri" w:eastAsia="Calibri" w:cs="Calibri" w:asciiTheme="minorHAnsi" w:hAnsiTheme="minorHAnsi" w:eastAsiaTheme="minorHAnsi" w:csTheme="minorHAnsi"/>
           <w:color w:val="C00000"/>
+          <w:kern w:val="2"/>
+          <w:sz w:val="22"/>
+          <w:szCs w:val="22"/>
         </w:rPr>
         <w:t>MENSUAL}}</w:t>
       </w:r>
       <w:r>
         <w:rPr>
-          <w:rFonts w:cstheme="minorHAnsi"/>
+          <w:rFonts w:ascii="Calibri" w:hAnsi="Calibri" w:eastAsia="Calibri" w:cs="Calibri" w:asciiTheme="minorHAnsi" w:hAnsiTheme="minorHAnsi" w:eastAsiaTheme="minorHAnsi" w:csTheme="minorHAnsi"/>
           <w:color w:val="C00000"/>
+          <w:kern w:val="2"/>
+          <w:sz w:val="22"/>
+          <w:szCs w:val="22"/>
         </w:rPr>
         <w:t xml:space="preserve"> </w:t>
       </w:r>
       <w:r>
         <w:rPr>
-          <w:rFonts w:cstheme="minorHAnsi"/>
+          <w:rFonts w:ascii="Calibri" w:hAnsi="Calibri" w:eastAsia="Calibri" w:cs="Calibri" w:asciiTheme="minorHAnsi" w:hAnsiTheme="minorHAnsi" w:eastAsiaTheme="minorHAnsi" w:csTheme="minorHAnsi"/>
+          <w:kern w:val="2"/>
+          <w:sz w:val="22"/>
+          <w:szCs w:val="22"/>
         </w:rPr>
         <w:t>pesos mensuales.</w:t>
       </w:r>
@@ -1685,12 +1897,15 @@
       <w:pPr>
         <w:jc w:val="both"/>
         <w:rPr>
-          <w:rFonts w:cstheme="minorHAnsi"/>
-        </w:rPr>
-      </w:pPr>
-      <w:r>
-        <w:rPr>
-          <w:rFonts w:cstheme="minorHAnsi"/>
+          <w:rFonts w:cs="Calibri" w:csTheme="minorHAnsi"/>
+        </w:rPr>
+      </w:pPr>
+      <w:r>
+        <w:rPr>
+          <w:rFonts w:ascii="Calibri" w:hAnsi="Calibri" w:eastAsia="Calibri" w:cs="Calibri" w:asciiTheme="minorHAnsi" w:hAnsiTheme="minorHAnsi" w:eastAsiaTheme="minorHAnsi" w:csTheme="minorHAnsi"/>
+          <w:kern w:val="2"/>
+          <w:sz w:val="22"/>
+          <w:szCs w:val="22"/>
         </w:rPr>
         <w:t>Esta cuota es necesaria para que el sindicato pueda realizar sus actividades de representación y defensa de los trabajadores, como:</w:t>
       </w:r>
@@ -1701,14 +1916,18 @@
           <w:ilvl w:val="0"/>
           <w:numId w:val="2"/>
         </w:numPr>
-        <w:jc w:val="both"/>
-        <w:rPr>
-          <w:rFonts w:cstheme="minorHAnsi"/>
-        </w:rPr>
-      </w:pPr>
-      <w:r>
-        <w:rPr>
-          <w:rFonts w:cstheme="minorHAnsi"/>
+        <w:ind w:left="720" w:hanging="360"/>
+        <w:jc w:val="both"/>
+        <w:rPr>
+          <w:rFonts w:cs="Calibri" w:csTheme="minorHAnsi"/>
+        </w:rPr>
+      </w:pPr>
+      <w:r>
+        <w:rPr>
+          <w:rFonts w:ascii="Calibri" w:hAnsi="Calibri" w:eastAsia="Calibri" w:cs="Calibri" w:asciiTheme="minorHAnsi" w:hAnsiTheme="minorHAnsi" w:eastAsiaTheme="minorHAnsi" w:csTheme="minorHAnsi"/>
+          <w:kern w:val="2"/>
+          <w:sz w:val="22"/>
+          <w:szCs w:val="22"/>
         </w:rPr>
         <w:t>Negociar contratos colectivos de trabajo.</w:t>
       </w:r>
@@ -1719,14 +1938,18 @@
           <w:ilvl w:val="0"/>
           <w:numId w:val="2"/>
         </w:numPr>
-        <w:jc w:val="both"/>
-        <w:rPr>
-          <w:rFonts w:cstheme="minorHAnsi"/>
-        </w:rPr>
-      </w:pPr>
-      <w:r>
-        <w:rPr>
-          <w:rFonts w:cstheme="minorHAnsi"/>
+        <w:ind w:left="720" w:hanging="360"/>
+        <w:jc w:val="both"/>
+        <w:rPr>
+          <w:rFonts w:cs="Calibri" w:csTheme="minorHAnsi"/>
+        </w:rPr>
+      </w:pPr>
+      <w:r>
+        <w:rPr>
+          <w:rFonts w:ascii="Calibri" w:hAnsi="Calibri" w:eastAsia="Calibri" w:cs="Calibri" w:asciiTheme="minorHAnsi" w:hAnsiTheme="minorHAnsi" w:eastAsiaTheme="minorHAnsi" w:csTheme="minorHAnsi"/>
+          <w:kern w:val="2"/>
+          <w:sz w:val="22"/>
+          <w:szCs w:val="22"/>
         </w:rPr>
         <w:t>Representar a los trabajadores ante las autoridades laborales.</w:t>
       </w:r>
@@ -1737,14 +1960,18 @@
           <w:ilvl w:val="0"/>
           <w:numId w:val="2"/>
         </w:numPr>
-        <w:jc w:val="both"/>
-        <w:rPr>
-          <w:rFonts w:cstheme="minorHAnsi"/>
-        </w:rPr>
-      </w:pPr>
-      <w:r>
-        <w:rPr>
-          <w:rFonts w:cstheme="minorHAnsi"/>
+        <w:ind w:left="720" w:hanging="360"/>
+        <w:jc w:val="both"/>
+        <w:rPr>
+          <w:rFonts w:cs="Calibri" w:csTheme="minorHAnsi"/>
+        </w:rPr>
+      </w:pPr>
+      <w:r>
+        <w:rPr>
+          <w:rFonts w:ascii="Calibri" w:hAnsi="Calibri" w:eastAsia="Calibri" w:cs="Calibri" w:asciiTheme="minorHAnsi" w:hAnsiTheme="minorHAnsi" w:eastAsiaTheme="minorHAnsi" w:csTheme="minorHAnsi"/>
+          <w:kern w:val="2"/>
+          <w:sz w:val="22"/>
+          <w:szCs w:val="22"/>
         </w:rPr>
         <w:t>Proporcionar asesoría legal y laboral a los trabajadores.</w:t>
       </w:r>
@@ -1755,14 +1982,18 @@
           <w:ilvl w:val="0"/>
           <w:numId w:val="2"/>
         </w:numPr>
-        <w:jc w:val="both"/>
-        <w:rPr>
-          <w:rFonts w:cstheme="minorHAnsi"/>
-        </w:rPr>
-      </w:pPr>
-      <w:r>
-        <w:rPr>
-          <w:rFonts w:cstheme="minorHAnsi"/>
+        <w:ind w:left="720" w:hanging="360"/>
+        <w:jc w:val="both"/>
+        <w:rPr>
+          <w:rFonts w:cs="Calibri" w:csTheme="minorHAnsi"/>
+        </w:rPr>
+      </w:pPr>
+      <w:r>
+        <w:rPr>
+          <w:rFonts w:ascii="Calibri" w:hAnsi="Calibri" w:eastAsia="Calibri" w:cs="Calibri" w:asciiTheme="minorHAnsi" w:hAnsiTheme="minorHAnsi" w:eastAsiaTheme="minorHAnsi" w:csTheme="minorHAnsi"/>
+          <w:kern w:val="2"/>
+          <w:sz w:val="22"/>
+          <w:szCs w:val="22"/>
         </w:rPr>
         <w:t>Organizar actividades culturales, deportivas y recreativas para los trabajadores.</w:t>
       </w:r>
@@ -1771,24 +2002,33 @@
       <w:pPr>
         <w:jc w:val="both"/>
         <w:rPr>
-          <w:rFonts w:cstheme="minorHAnsi"/>
-        </w:rPr>
-      </w:pPr>
-      <w:r>
-        <w:rPr>
-          <w:rFonts w:cstheme="minorHAnsi"/>
+          <w:rFonts w:cs="Calibri" w:csTheme="minorHAnsi"/>
+        </w:rPr>
+      </w:pPr>
+      <w:r>
+        <w:rPr>
+          <w:rFonts w:ascii="Calibri" w:hAnsi="Calibri" w:eastAsia="Calibri" w:cs="Calibri" w:asciiTheme="minorHAnsi" w:hAnsiTheme="minorHAnsi" w:eastAsiaTheme="minorHAnsi" w:csTheme="minorHAnsi"/>
+          <w:kern w:val="2"/>
+          <w:sz w:val="22"/>
+          <w:szCs w:val="22"/>
         </w:rPr>
         <w:t xml:space="preserve">El </w:t>
       </w:r>
       <w:r>
         <w:rPr>
-          <w:rFonts w:cstheme="minorHAnsi"/>
+          <w:rFonts w:ascii="Calibri" w:hAnsi="Calibri" w:eastAsia="Calibri" w:cs="Calibri" w:asciiTheme="minorHAnsi" w:hAnsiTheme="minorHAnsi" w:eastAsiaTheme="minorHAnsi" w:csTheme="minorHAnsi"/>
+          <w:kern w:val="2"/>
+          <w:sz w:val="22"/>
+          <w:szCs w:val="22"/>
         </w:rPr>
         <w:t>SINDICATO</w:t>
       </w:r>
       <w:r>
         <w:rPr>
-          <w:rFonts w:cstheme="minorHAnsi"/>
+          <w:rFonts w:ascii="Calibri" w:hAnsi="Calibri" w:eastAsia="Calibri" w:cs="Calibri" w:asciiTheme="minorHAnsi" w:hAnsiTheme="minorHAnsi" w:eastAsiaTheme="minorHAnsi" w:csTheme="minorHAnsi"/>
+          <w:kern w:val="2"/>
+          <w:sz w:val="22"/>
+          <w:szCs w:val="22"/>
         </w:rPr>
         <w:t xml:space="preserve"> está dispuesto a negociar el monto de la aportación sindical, pero considera que es una cantidad justa y razonable.</w:t>
       </w:r>
@@ -1797,16 +2037,19 @@
       <w:pPr>
         <w:jc w:val="center"/>
         <w:rPr>
-          <w:rFonts w:cstheme="minorHAnsi"/>
-          <w:b/>
-          <w:bCs/>
-        </w:rPr>
-      </w:pPr>
-      <w:r>
-        <w:rPr>
-          <w:rFonts w:cstheme="minorHAnsi"/>
-          <w:b/>
-          <w:bCs/>
+          <w:rFonts w:cs="Calibri" w:csTheme="minorHAnsi"/>
+          <w:b/>
+          <w:bCs/>
+        </w:rPr>
+      </w:pPr>
+      <w:r>
+        <w:rPr>
+          <w:rFonts w:ascii="Calibri" w:hAnsi="Calibri" w:eastAsia="Calibri" w:cs="Calibri" w:asciiTheme="minorHAnsi" w:hAnsiTheme="minorHAnsi" w:eastAsiaTheme="minorHAnsi" w:csTheme="minorHAnsi"/>
+          <w:b/>
+          <w:bCs/>
+          <w:kern w:val="2"/>
+          <w:sz w:val="22"/>
+          <w:szCs w:val="22"/>
         </w:rPr>
         <w:t>FUNDAMENTO LEGAL:</w:t>
       </w:r>
@@ -1817,17 +2060,21 @@
           <w:ilvl w:val="0"/>
           <w:numId w:val="3"/>
         </w:numPr>
-        <w:rPr>
-          <w:rFonts w:cstheme="minorHAnsi"/>
-          <w:b/>
-          <w:bCs/>
-        </w:rPr>
-      </w:pPr>
-      <w:r>
-        <w:rPr>
-          <w:rFonts w:cstheme="minorHAnsi"/>
-          <w:b/>
-          <w:bCs/>
+        <w:ind w:left="720" w:hanging="360"/>
+        <w:rPr>
+          <w:rFonts w:cs="Calibri" w:csTheme="minorHAnsi"/>
+          <w:b/>
+          <w:bCs/>
+        </w:rPr>
+      </w:pPr>
+      <w:r>
+        <w:rPr>
+          <w:rFonts w:ascii="Calibri" w:hAnsi="Calibri" w:eastAsia="Calibri" w:cs="Calibri" w:asciiTheme="minorHAnsi" w:hAnsiTheme="minorHAnsi" w:eastAsiaTheme="minorHAnsi" w:csTheme="minorHAnsi"/>
+          <w:b/>
+          <w:bCs/>
+          <w:kern w:val="2"/>
+          <w:sz w:val="22"/>
+          <w:szCs w:val="22"/>
         </w:rPr>
         <w:t>Ley Federal del Trabajo:</w:t>
       </w:r>
@@ -1838,22 +2085,29 @@
           <w:ilvl w:val="1"/>
           <w:numId w:val="3"/>
         </w:numPr>
-        <w:jc w:val="both"/>
-        <w:rPr>
-          <w:rFonts w:cstheme="minorHAnsi"/>
-        </w:rPr>
-      </w:pPr>
-      <w:r>
-        <w:rPr>
-          <w:rFonts w:cstheme="minorHAnsi"/>
-          <w:b/>
-          <w:bCs/>
+        <w:ind w:left="1440" w:hanging="360"/>
+        <w:jc w:val="both"/>
+        <w:rPr>
+          <w:rFonts w:cs="Calibri" w:csTheme="minorHAnsi"/>
+        </w:rPr>
+      </w:pPr>
+      <w:r>
+        <w:rPr>
+          <w:rFonts w:ascii="Calibri" w:hAnsi="Calibri" w:eastAsia="Calibri" w:cs="Calibri" w:asciiTheme="minorHAnsi" w:hAnsiTheme="minorHAnsi" w:eastAsiaTheme="minorHAnsi" w:csTheme="minorHAnsi"/>
+          <w:b/>
+          <w:bCs/>
+          <w:kern w:val="2"/>
+          <w:sz w:val="22"/>
+          <w:szCs w:val="22"/>
         </w:rPr>
         <w:t xml:space="preserve">Artículo 34: </w:t>
       </w:r>
       <w:r>
         <w:rPr>
-          <w:rFonts w:cstheme="minorHAnsi"/>
+          <w:rFonts w:ascii="Calibri" w:hAnsi="Calibri" w:eastAsia="Calibri" w:cs="Calibri" w:asciiTheme="minorHAnsi" w:hAnsiTheme="minorHAnsi" w:eastAsiaTheme="minorHAnsi" w:csTheme="minorHAnsi"/>
+          <w:kern w:val="2"/>
+          <w:sz w:val="22"/>
+          <w:szCs w:val="22"/>
         </w:rPr>
         <w:t>En los convenios celebrados entre los sindicatos y los patrones que puedan afectar derechos de los trabajadores, se observarán las normas siguientes: I. Regirán únicamente para el futuro, por lo que no podrán afectar las prestaciones ya devengadas; II. No podrán referirse a trabajadores individualmente determinados; y III. Cuando se trate de reducción de los trabajos, el reajuste se efectuará de conformidad con lo dispuesto en el artículo 437.</w:t>
       </w:r>
@@ -1865,22 +2119,29 @@
           <w:ilvl w:val="1"/>
           <w:numId w:val="3"/>
         </w:numPr>
-        <w:jc w:val="both"/>
-        <w:rPr>
-          <w:rFonts w:cstheme="minorHAnsi"/>
-        </w:rPr>
-      </w:pPr>
-      <w:r>
-        <w:rPr>
-          <w:rFonts w:cstheme="minorHAnsi"/>
-          <w:b/>
-          <w:bCs/>
+        <w:ind w:left="1440" w:hanging="360"/>
+        <w:jc w:val="both"/>
+        <w:rPr>
+          <w:rFonts w:cs="Calibri" w:csTheme="minorHAnsi"/>
+        </w:rPr>
+      </w:pPr>
+      <w:r>
+        <w:rPr>
+          <w:rFonts w:ascii="Calibri" w:hAnsi="Calibri" w:eastAsia="Calibri" w:cs="Calibri" w:asciiTheme="minorHAnsi" w:hAnsiTheme="minorHAnsi" w:eastAsiaTheme="minorHAnsi" w:csTheme="minorHAnsi"/>
+          <w:b/>
+          <w:bCs/>
+          <w:kern w:val="2"/>
+          <w:sz w:val="22"/>
+          <w:szCs w:val="22"/>
         </w:rPr>
         <w:t>Artículo 132:</w:t>
       </w:r>
       <w:r>
         <w:rPr>
-          <w:rFonts w:cstheme="minorHAnsi"/>
+          <w:rFonts w:ascii="Calibri" w:hAnsi="Calibri" w:eastAsia="Calibri" w:cs="Calibri" w:asciiTheme="minorHAnsi" w:hAnsiTheme="minorHAnsi" w:eastAsiaTheme="minorHAnsi" w:csTheme="minorHAnsi"/>
+          <w:kern w:val="2"/>
+          <w:sz w:val="22"/>
+          <w:szCs w:val="22"/>
         </w:rPr>
         <w:t xml:space="preserve"> Son obligaciones de los patrones: ... XVII. Proporcionar a los trabajadores los equipos de protección personal necesarios para su seguridad y salud en el trabajo. ... XXX. Proporcionar capacitación a los trabajadores en materia de seguridad e higiene en el trabajo.</w:t>
       </w:r>
@@ -1891,22 +2152,29 @@
           <w:ilvl w:val="1"/>
           <w:numId w:val="3"/>
         </w:numPr>
-        <w:jc w:val="both"/>
-        <w:rPr>
-          <w:rFonts w:cstheme="minorHAnsi"/>
-        </w:rPr>
-      </w:pPr>
-      <w:r>
-        <w:rPr>
-          <w:rFonts w:cstheme="minorHAnsi"/>
-          <w:b/>
-          <w:bCs/>
+        <w:ind w:left="1440" w:hanging="360"/>
+        <w:jc w:val="both"/>
+        <w:rPr>
+          <w:rFonts w:cs="Calibri" w:csTheme="minorHAnsi"/>
+        </w:rPr>
+      </w:pPr>
+      <w:r>
+        <w:rPr>
+          <w:rFonts w:ascii="Calibri" w:hAnsi="Calibri" w:eastAsia="Calibri" w:cs="Calibri" w:asciiTheme="minorHAnsi" w:hAnsiTheme="minorHAnsi" w:eastAsiaTheme="minorHAnsi" w:csTheme="minorHAnsi"/>
+          <w:b/>
+          <w:bCs/>
+          <w:kern w:val="2"/>
+          <w:sz w:val="22"/>
+          <w:szCs w:val="22"/>
         </w:rPr>
         <w:t xml:space="preserve">Artículo 357. - </w:t>
       </w:r>
       <w:r>
         <w:rPr>
-          <w:rFonts w:cstheme="minorHAnsi"/>
+          <w:rFonts w:ascii="Calibri" w:hAnsi="Calibri" w:eastAsia="Calibri" w:cs="Calibri" w:asciiTheme="minorHAnsi" w:hAnsiTheme="minorHAnsi" w:eastAsiaTheme="minorHAnsi" w:csTheme="minorHAnsi"/>
+          <w:kern w:val="2"/>
+          <w:sz w:val="22"/>
+          <w:szCs w:val="22"/>
         </w:rPr>
         <w:t>Los trabajadores y los patrones tienen el derecho de constituir sindicatos, sin necesidad de autorización previa.</w:t>
       </w:r>
@@ -1918,22 +2186,29 @@
           <w:ilvl w:val="1"/>
           <w:numId w:val="3"/>
         </w:numPr>
-        <w:jc w:val="both"/>
-        <w:rPr>
-          <w:rFonts w:cstheme="minorHAnsi"/>
-        </w:rPr>
-      </w:pPr>
-      <w:r>
-        <w:rPr>
-          <w:rFonts w:cstheme="minorHAnsi"/>
-          <w:b/>
-          <w:bCs/>
+        <w:ind w:left="1440" w:hanging="360"/>
+        <w:jc w:val="both"/>
+        <w:rPr>
+          <w:rFonts w:cs="Calibri" w:csTheme="minorHAnsi"/>
+        </w:rPr>
+      </w:pPr>
+      <w:r>
+        <w:rPr>
+          <w:rFonts w:ascii="Calibri" w:hAnsi="Calibri" w:eastAsia="Calibri" w:cs="Calibri" w:asciiTheme="minorHAnsi" w:hAnsiTheme="minorHAnsi" w:eastAsiaTheme="minorHAnsi" w:csTheme="minorHAnsi"/>
+          <w:b/>
+          <w:bCs/>
+          <w:kern w:val="2"/>
+          <w:sz w:val="22"/>
+          <w:szCs w:val="22"/>
         </w:rPr>
         <w:t>Artículo 375:</w:t>
       </w:r>
       <w:r>
         <w:rPr>
-          <w:rFonts w:cstheme="minorHAnsi"/>
+          <w:rFonts w:ascii="Calibri" w:hAnsi="Calibri" w:eastAsia="Calibri" w:cs="Calibri" w:asciiTheme="minorHAnsi" w:hAnsiTheme="minorHAnsi" w:eastAsiaTheme="minorHAnsi" w:csTheme="minorHAnsi"/>
+          <w:kern w:val="2"/>
+          <w:sz w:val="22"/>
+          <w:szCs w:val="22"/>
         </w:rPr>
         <w:t xml:space="preserve"> Los sindicatos representan a sus miembros en la defensa de los derechos individuales que les correspondan, sin perjuicio del derecho de los trabajadores para obrar o intervenir directamente, cesando entonces, a petición del trabajador, la intervención del sindicato.</w:t>
       </w:r>
@@ -1942,7 +2217,7 @@
       <w:pPr>
         <w:pStyle w:val="Prrafodelista"/>
         <w:rPr>
-          <w:rFonts w:cstheme="minorHAnsi"/>
+          <w:rFonts w:cs="Calibri" w:csTheme="minorHAnsi"/>
         </w:rPr>
       </w:pPr>
     </w:p>
@@ -1953,22 +2228,29 @@
           <w:ilvl w:val="1"/>
           <w:numId w:val="3"/>
         </w:numPr>
-        <w:jc w:val="both"/>
-        <w:rPr>
-          <w:rFonts w:cstheme="minorHAnsi"/>
-        </w:rPr>
-      </w:pPr>
-      <w:r>
-        <w:rPr>
-          <w:rFonts w:cstheme="minorHAnsi"/>
-          <w:b/>
-          <w:bCs/>
+        <w:ind w:left="1440" w:hanging="360"/>
+        <w:jc w:val="both"/>
+        <w:rPr>
+          <w:rFonts w:cs="Calibri" w:csTheme="minorHAnsi"/>
+        </w:rPr>
+      </w:pPr>
+      <w:r>
+        <w:rPr>
+          <w:rFonts w:ascii="Calibri" w:hAnsi="Calibri" w:eastAsia="Calibri" w:cs="Calibri" w:asciiTheme="minorHAnsi" w:hAnsiTheme="minorHAnsi" w:eastAsiaTheme="minorHAnsi" w:csTheme="minorHAnsi"/>
+          <w:b/>
+          <w:bCs/>
+          <w:kern w:val="2"/>
+          <w:sz w:val="22"/>
+          <w:szCs w:val="22"/>
         </w:rPr>
         <w:t>Artículo 386:</w:t>
       </w:r>
       <w:r>
         <w:rPr>
-          <w:rFonts w:cstheme="minorHAnsi"/>
+          <w:rFonts w:ascii="Calibri" w:hAnsi="Calibri" w:eastAsia="Calibri" w:cs="Calibri" w:asciiTheme="minorHAnsi" w:hAnsiTheme="minorHAnsi" w:eastAsiaTheme="minorHAnsi" w:csTheme="minorHAnsi"/>
+          <w:kern w:val="2"/>
+          <w:sz w:val="22"/>
+          <w:szCs w:val="22"/>
         </w:rPr>
         <w:t xml:space="preserve"> Contrato colectivo de trabajo es el convenio celebrado entre uno o varios sindicatos de trabajadores y uno o varios patrones, o uno o varios sindicatos de patrones, con objeto de establecer las condiciones según las cuales debe prestarse el trabajo en una o más empresas o establecimientos.</w:t>
       </w:r>
@@ -1977,7 +2259,7 @@
       <w:pPr>
         <w:pStyle w:val="Prrafodelista"/>
         <w:rPr>
-          <w:rFonts w:cstheme="minorHAnsi"/>
+          <w:rFonts w:cs="Calibri" w:csTheme="minorHAnsi"/>
         </w:rPr>
       </w:pPr>
     </w:p>
@@ -1988,23 +2270,30 @@
           <w:ilvl w:val="1"/>
           <w:numId w:val="3"/>
         </w:numPr>
-        <w:jc w:val="both"/>
-        <w:rPr>
-          <w:rFonts w:cstheme="minorHAnsi"/>
-        </w:rPr>
-      </w:pPr>
-      <w:r>
-        <w:rPr>
-          <w:rFonts w:cstheme="minorHAnsi"/>
-          <w:b/>
-          <w:bCs/>
-        </w:rPr>
+        <w:ind w:left="1440" w:hanging="360"/>
+        <w:jc w:val="both"/>
+        <w:rPr>
+          <w:rFonts w:cs="Calibri" w:csTheme="minorHAnsi"/>
+        </w:rPr>
+      </w:pPr>
+      <w:r>
         <w:lastRenderedPageBreak/>
+        <w:rPr>
+          <w:rFonts w:ascii="Calibri" w:hAnsi="Calibri" w:eastAsia="Calibri" w:cs="Calibri" w:asciiTheme="minorHAnsi" w:hAnsiTheme="minorHAnsi" w:eastAsiaTheme="minorHAnsi" w:csTheme="minorHAnsi"/>
+          <w:b/>
+          <w:bCs/>
+          <w:kern w:val="2"/>
+          <w:sz w:val="22"/>
+          <w:szCs w:val="22"/>
+        </w:rPr>
         <w:t>Artículo 386 Bis:</w:t>
       </w:r>
       <w:r>
         <w:rPr>
-          <w:rFonts w:cstheme="minorHAnsi"/>
+          <w:rFonts w:ascii="Calibri" w:hAnsi="Calibri" w:eastAsia="Calibri" w:cs="Calibri" w:asciiTheme="minorHAnsi" w:hAnsiTheme="minorHAnsi" w:eastAsiaTheme="minorHAnsi" w:csTheme="minorHAnsi"/>
+          <w:kern w:val="2"/>
+          <w:sz w:val="22"/>
+          <w:szCs w:val="22"/>
         </w:rPr>
         <w:t xml:space="preserve"> El apoyo de los trabajadores mediante el voto personal, libre y secreto constituye una garantía para la protección de la libertad de negociación colectiva y sus legítimos intereses. La demostración de dicho apoyo conforme a los procedimientos establecidos en los artículos 390 Bis y 390 Ter, es de orden público e interés social, por lo que es un requisito para la validez de los contratos colectivos de trabajo. Las autoridades, sindicatos y patrones coadyuvarán para que los procedimientos de consulta se organicen de tal forma que no se afecten las actividades laborales de los centros de trabajo</w:t>
       </w:r>
@@ -2013,7 +2302,7 @@
       <w:pPr>
         <w:pStyle w:val="Prrafodelista"/>
         <w:rPr>
-          <w:rFonts w:cstheme="minorHAnsi"/>
+          <w:rFonts w:cs="Calibri" w:csTheme="minorHAnsi"/>
         </w:rPr>
       </w:pPr>
     </w:p>
@@ -2024,22 +2313,29 @@
           <w:ilvl w:val="1"/>
           <w:numId w:val="3"/>
         </w:numPr>
-        <w:jc w:val="both"/>
-        <w:rPr>
-          <w:rFonts w:cstheme="minorHAnsi"/>
-        </w:rPr>
-      </w:pPr>
-      <w:r>
-        <w:rPr>
-          <w:rFonts w:cstheme="minorHAnsi"/>
-          <w:b/>
-          <w:bCs/>
+        <w:ind w:left="1440" w:hanging="360"/>
+        <w:jc w:val="both"/>
+        <w:rPr>
+          <w:rFonts w:cs="Calibri" w:csTheme="minorHAnsi"/>
+        </w:rPr>
+      </w:pPr>
+      <w:r>
+        <w:rPr>
+          <w:rFonts w:ascii="Calibri" w:hAnsi="Calibri" w:eastAsia="Calibri" w:cs="Calibri" w:asciiTheme="minorHAnsi" w:hAnsiTheme="minorHAnsi" w:eastAsiaTheme="minorHAnsi" w:csTheme="minorHAnsi"/>
+          <w:b/>
+          <w:bCs/>
+          <w:kern w:val="2"/>
+          <w:sz w:val="22"/>
+          <w:szCs w:val="22"/>
         </w:rPr>
         <w:t>Artículo 387:</w:t>
       </w:r>
       <w:r>
         <w:rPr>
-          <w:rFonts w:cstheme="minorHAnsi"/>
+          <w:rFonts w:ascii="Calibri" w:hAnsi="Calibri" w:eastAsia="Calibri" w:cs="Calibri" w:asciiTheme="minorHAnsi" w:hAnsiTheme="minorHAnsi" w:eastAsiaTheme="minorHAnsi" w:csTheme="minorHAnsi"/>
+          <w:kern w:val="2"/>
+          <w:sz w:val="22"/>
+          <w:szCs w:val="22"/>
         </w:rPr>
         <w:t xml:space="preserve"> El patrón que emplee trabajadores miembros de un sindicato tendrá obligación de celebrar con éste, cuando lo solicite, un contrato colectivo; para dar cumplimiento a los principios de representatividad en las organizaciones sindicales y de certeza en la firma, registro y depósito de los contratos colectivos de trabajo, el sindicato solicitante deberá contar previamente con la Constancia de Representatividad expedida por el Centro Federal de Conciliación y Registro Laboral, a que hace referencia el artículo 390 Bis (…).</w:t>
       </w:r>
@@ -2048,7 +2344,7 @@
       <w:pPr>
         <w:pStyle w:val="Prrafodelista"/>
         <w:rPr>
-          <w:rFonts w:cstheme="minorHAnsi"/>
+          <w:rFonts w:cs="Calibri" w:csTheme="minorHAnsi"/>
         </w:rPr>
       </w:pPr>
     </w:p>
@@ -2056,24 +2352,30 @@
       <w:pPr>
         <w:jc w:val="center"/>
         <w:rPr>
-          <w:rFonts w:cstheme="minorHAnsi"/>
-          <w:b/>
-          <w:bCs/>
-        </w:rPr>
-      </w:pPr>
-      <w:r>
-        <w:rPr>
-          <w:rFonts w:cstheme="minorHAnsi"/>
-          <w:b/>
-          <w:bCs/>
+          <w:rFonts w:cs="Calibri" w:csTheme="minorHAnsi"/>
+          <w:b/>
+          <w:bCs/>
+        </w:rPr>
+      </w:pPr>
+      <w:r>
+        <w:rPr>
+          <w:rFonts w:ascii="Calibri" w:hAnsi="Calibri" w:eastAsia="Calibri" w:cs="Calibri" w:asciiTheme="minorHAnsi" w:hAnsiTheme="minorHAnsi" w:eastAsiaTheme="minorHAnsi" w:csTheme="minorHAnsi"/>
+          <w:b/>
+          <w:bCs/>
+          <w:kern w:val="2"/>
+          <w:sz w:val="22"/>
+          <w:szCs w:val="22"/>
         </w:rPr>
         <w:t>ALCANCES DE LA PROPUESTA</w:t>
       </w:r>
       <w:r>
         <w:rPr>
-          <w:rFonts w:cstheme="minorHAnsi"/>
-          <w:b/>
-          <w:bCs/>
+          <w:rFonts w:ascii="Calibri" w:hAnsi="Calibri" w:eastAsia="Calibri" w:cs="Calibri" w:asciiTheme="minorHAnsi" w:hAnsiTheme="minorHAnsi" w:eastAsiaTheme="minorHAnsi" w:csTheme="minorHAnsi"/>
+          <w:b/>
+          <w:bCs/>
+          <w:kern w:val="2"/>
+          <w:sz w:val="22"/>
+          <w:szCs w:val="22"/>
         </w:rPr>
         <w:t>:</w:t>
       </w:r>
@@ -2085,101 +2387,144 @@
           <w:ilvl w:val="0"/>
           <w:numId w:val="7"/>
         </w:numPr>
-        <w:jc w:val="both"/>
-        <w:rPr>
-          <w:rFonts w:cstheme="minorHAnsi"/>
-        </w:rPr>
-      </w:pPr>
-      <w:r>
-        <w:rPr>
-          <w:rFonts w:cstheme="minorHAnsi"/>
+        <w:ind w:left="720" w:hanging="360"/>
+        <w:jc w:val="both"/>
+        <w:rPr>
+          <w:rFonts w:cs="Calibri" w:csTheme="minorHAnsi"/>
+        </w:rPr>
+      </w:pPr>
+      <w:r>
+        <w:rPr>
+          <w:rFonts w:ascii="Calibri" w:hAnsi="Calibri" w:eastAsia="Calibri" w:cs="Calibri" w:asciiTheme="minorHAnsi" w:hAnsiTheme="minorHAnsi" w:eastAsiaTheme="minorHAnsi" w:csTheme="minorHAnsi"/>
+          <w:kern w:val="2"/>
+          <w:sz w:val="22"/>
+          <w:szCs w:val="22"/>
         </w:rPr>
         <w:t>La</w:t>
       </w:r>
       <w:r>
         <w:rPr>
-          <w:rFonts w:cstheme="minorHAnsi"/>
+          <w:rFonts w:ascii="Calibri" w:hAnsi="Calibri" w:eastAsia="Calibri" w:cs="Calibri" w:asciiTheme="minorHAnsi" w:hAnsiTheme="minorHAnsi" w:eastAsiaTheme="minorHAnsi" w:csTheme="minorHAnsi"/>
+          <w:kern w:val="2"/>
+          <w:sz w:val="22"/>
+          <w:szCs w:val="22"/>
         </w:rPr>
         <w:t xml:space="preserve"> </w:t>
       </w:r>
       <w:r>
         <w:rPr>
-          <w:rFonts w:cstheme="minorHAnsi"/>
+          <w:rFonts w:ascii="Calibri" w:hAnsi="Calibri" w:eastAsia="Calibri" w:cs="Calibri" w:asciiTheme="minorHAnsi" w:hAnsiTheme="minorHAnsi" w:eastAsiaTheme="minorHAnsi" w:csTheme="minorHAnsi"/>
+          <w:kern w:val="2"/>
+          <w:sz w:val="22"/>
+          <w:szCs w:val="22"/>
         </w:rPr>
         <w:t>presente propuesta es para uso exclusivo de la</w:t>
       </w:r>
       <w:r>
         <w:rPr>
-          <w:rFonts w:cstheme="minorHAnsi"/>
+          <w:rFonts w:ascii="Calibri" w:hAnsi="Calibri" w:eastAsia="Calibri" w:cs="Calibri" w:asciiTheme="minorHAnsi" w:hAnsiTheme="minorHAnsi" w:eastAsiaTheme="minorHAnsi" w:csTheme="minorHAnsi"/>
+          <w:kern w:val="2"/>
+          <w:sz w:val="22"/>
+          <w:szCs w:val="22"/>
         </w:rPr>
         <w:t xml:space="preserve"> empresa</w:t>
       </w:r>
       <w:r>
         <w:rPr>
-          <w:rFonts w:cstheme="minorHAnsi"/>
+          <w:rFonts w:ascii="Calibri" w:hAnsi="Calibri" w:eastAsia="Calibri" w:cs="Calibri" w:asciiTheme="minorHAnsi" w:hAnsiTheme="minorHAnsi" w:eastAsiaTheme="minorHAnsi" w:csTheme="minorHAnsi"/>
+          <w:kern w:val="2"/>
+          <w:sz w:val="22"/>
+          <w:szCs w:val="22"/>
         </w:rPr>
         <w:t xml:space="preserve"> </w:t>
       </w:r>
       <w:r>
         <w:rPr>
-          <w:rFonts w:cstheme="minorHAnsi"/>
+          <w:rFonts w:ascii="Calibri" w:hAnsi="Calibri" w:eastAsia="Calibri" w:cs="Calibri" w:asciiTheme="minorHAnsi" w:hAnsiTheme="minorHAnsi" w:eastAsiaTheme="minorHAnsi" w:csTheme="minorHAnsi"/>
           <w:color w:val="FF0000"/>
+          <w:kern w:val="2"/>
+          <w:sz w:val="22"/>
+          <w:szCs w:val="22"/>
         </w:rPr>
         <w:t>“</w:t>
       </w:r>
       <w:r>
         <w:rPr>
-          <w:rFonts w:cstheme="minorHAnsi"/>
+          <w:rFonts w:ascii="Calibri" w:hAnsi="Calibri" w:eastAsia="Calibri" w:cs="Calibri" w:asciiTheme="minorHAnsi" w:hAnsiTheme="minorHAnsi" w:eastAsiaTheme="minorHAnsi" w:csTheme="minorHAnsi"/>
           <w:color w:val="FF0000"/>
+          <w:kern w:val="2"/>
+          <w:sz w:val="22"/>
+          <w:szCs w:val="22"/>
         </w:rPr>
         <w:t>{{PROPUESTA</w:t>
       </w:r>
       <w:r>
         <w:rPr>
-          <w:rFonts w:cstheme="minorHAnsi"/>
+          <w:rFonts w:ascii="Calibri" w:hAnsi="Calibri" w:eastAsia="Calibri" w:cs="Calibri" w:asciiTheme="minorHAnsi" w:hAnsiTheme="minorHAnsi" w:eastAsiaTheme="minorHAnsi" w:csTheme="minorHAnsi"/>
           <w:color w:val="FF0000"/>
+          <w:kern w:val="2"/>
+          <w:sz w:val="22"/>
+          <w:szCs w:val="22"/>
         </w:rPr>
         <w:t>_</w:t>
       </w:r>
       <w:r>
         <w:rPr>
-          <w:rFonts w:cstheme="minorHAnsi"/>
+          <w:rFonts w:ascii="Calibri" w:hAnsi="Calibri" w:eastAsia="Calibri" w:cs="Calibri" w:asciiTheme="minorHAnsi" w:hAnsiTheme="minorHAnsi" w:eastAsiaTheme="minorHAnsi" w:csTheme="minorHAnsi"/>
           <w:color w:val="FF0000"/>
+          <w:kern w:val="2"/>
+          <w:sz w:val="22"/>
+          <w:szCs w:val="22"/>
         </w:rPr>
         <w:t>PARA</w:t>
       </w:r>
       <w:r>
         <w:rPr>
-          <w:rFonts w:cstheme="minorHAnsi"/>
+          <w:rFonts w:ascii="Calibri" w:hAnsi="Calibri" w:eastAsia="Calibri" w:cs="Calibri" w:asciiTheme="minorHAnsi" w:hAnsiTheme="minorHAnsi" w:eastAsiaTheme="minorHAnsi" w:csTheme="minorHAnsi"/>
           <w:color w:val="FF0000"/>
+          <w:kern w:val="2"/>
+          <w:sz w:val="22"/>
+          <w:szCs w:val="22"/>
         </w:rPr>
         <w:t>_</w:t>
       </w:r>
       <w:r>
         <w:rPr>
-          <w:rFonts w:cstheme="minorHAnsi"/>
+          <w:rFonts w:ascii="Calibri" w:hAnsi="Calibri" w:eastAsia="Calibri" w:cs="Calibri" w:asciiTheme="minorHAnsi" w:hAnsiTheme="minorHAnsi" w:eastAsiaTheme="minorHAnsi" w:csTheme="minorHAnsi"/>
           <w:color w:val="FF0000"/>
+          <w:kern w:val="2"/>
+          <w:sz w:val="22"/>
+          <w:szCs w:val="22"/>
         </w:rPr>
         <w:t>LA</w:t>
       </w:r>
       <w:r>
         <w:rPr>
-          <w:rFonts w:cstheme="minorHAnsi"/>
+          <w:rFonts w:ascii="Calibri" w:hAnsi="Calibri" w:eastAsia="Calibri" w:cs="Calibri" w:asciiTheme="minorHAnsi" w:hAnsiTheme="minorHAnsi" w:eastAsiaTheme="minorHAnsi" w:csTheme="minorHAnsi"/>
           <w:color w:val="FF0000"/>
+          <w:kern w:val="2"/>
+          <w:sz w:val="22"/>
+          <w:szCs w:val="22"/>
         </w:rPr>
         <w:t>_</w:t>
       </w:r>
       <w:r>
         <w:rPr>
-          <w:rFonts w:cstheme="minorHAnsi"/>
+          <w:rFonts w:ascii="Calibri" w:hAnsi="Calibri" w:eastAsia="Calibri" w:cs="Calibri" w:asciiTheme="minorHAnsi" w:hAnsiTheme="minorHAnsi" w:eastAsiaTheme="minorHAnsi" w:csTheme="minorHAnsi"/>
           <w:color w:val="FF0000"/>
+          <w:kern w:val="2"/>
+          <w:sz w:val="22"/>
+          <w:szCs w:val="22"/>
         </w:rPr>
         <w:t>EMPRESA}}</w:t>
       </w:r>
       <w:r>
         <w:rPr>
-          <w:rFonts w:cstheme="minorHAnsi"/>
+          <w:rFonts w:ascii="Calibri" w:hAnsi="Calibri" w:eastAsia="Calibri" w:cs="Calibri" w:asciiTheme="minorHAnsi" w:hAnsiTheme="minorHAnsi" w:eastAsiaTheme="minorHAnsi" w:csTheme="minorHAnsi"/>
           <w:color w:val="FF0000"/>
+          <w:kern w:val="2"/>
+          <w:sz w:val="22"/>
+          <w:szCs w:val="22"/>
         </w:rPr>
         <w:t>”</w:t>
       </w:r>
@@ -2189,7 +2534,7 @@
         <w:pStyle w:val="Prrafodelista"/>
         <w:jc w:val="both"/>
         <w:rPr>
-          <w:rFonts w:cstheme="minorHAnsi"/>
+          <w:rFonts w:cs="Calibri" w:csTheme="minorHAnsi"/>
         </w:rPr>
       </w:pPr>
     </w:p>
@@ -2200,14 +2545,18 @@
           <w:ilvl w:val="0"/>
           <w:numId w:val="7"/>
         </w:numPr>
-        <w:jc w:val="both"/>
-        <w:rPr>
-          <w:rFonts w:cstheme="minorHAnsi"/>
-        </w:rPr>
-      </w:pPr>
-      <w:r>
-        <w:rPr>
-          <w:rFonts w:cstheme="minorHAnsi"/>
+        <w:ind w:left="720" w:hanging="360"/>
+        <w:jc w:val="both"/>
+        <w:rPr>
+          <w:rFonts w:cs="Calibri" w:csTheme="minorHAnsi"/>
+        </w:rPr>
+      </w:pPr>
+      <w:r>
+        <w:rPr>
+          <w:rFonts w:ascii="Calibri" w:hAnsi="Calibri" w:eastAsia="Calibri" w:cs="Calibri" w:asciiTheme="minorHAnsi" w:hAnsiTheme="minorHAnsi" w:eastAsiaTheme="minorHAnsi" w:csTheme="minorHAnsi"/>
+          <w:kern w:val="2"/>
+          <w:sz w:val="22"/>
+          <w:szCs w:val="22"/>
         </w:rPr>
         <w:t>El recurso económico solicitado es única y exclusivamente para cubrir la aportación sindical que previamente se ha mencionado.</w:t>
       </w:r>
@@ -2216,16 +2565,19 @@
       <w:pPr>
         <w:jc w:val="center"/>
         <w:rPr>
-          <w:rFonts w:cstheme="minorHAnsi"/>
-          <w:b/>
-          <w:bCs/>
-        </w:rPr>
-      </w:pPr>
-      <w:r>
-        <w:rPr>
-          <w:rFonts w:cstheme="minorHAnsi"/>
-          <w:b/>
-          <w:bCs/>
+          <w:rFonts w:cs="Calibri" w:csTheme="minorHAnsi"/>
+          <w:b/>
+          <w:bCs/>
+        </w:rPr>
+      </w:pPr>
+      <w:r>
+        <w:rPr>
+          <w:rFonts w:ascii="Calibri" w:hAnsi="Calibri" w:eastAsia="Calibri" w:cs="Calibri" w:asciiTheme="minorHAnsi" w:hAnsiTheme="minorHAnsi" w:eastAsiaTheme="minorHAnsi" w:csTheme="minorHAnsi"/>
+          <w:b/>
+          <w:bCs/>
+          <w:kern w:val="2"/>
+          <w:sz w:val="22"/>
+          <w:szCs w:val="22"/>
         </w:rPr>
         <w:t>CONCLUSIONES:</w:t>
       </w:r>
@@ -2234,60 +2586,87 @@
       <w:pPr>
         <w:jc w:val="both"/>
         <w:rPr>
-          <w:rFonts w:cstheme="minorHAnsi"/>
-        </w:rPr>
-      </w:pPr>
-      <w:r>
-        <w:rPr>
-          <w:rFonts w:cstheme="minorHAnsi"/>
+          <w:rFonts w:cs="Calibri" w:csTheme="minorHAnsi"/>
+        </w:rPr>
+      </w:pPr>
+      <w:r>
+        <w:rPr>
+          <w:rFonts w:ascii="Calibri" w:hAnsi="Calibri" w:eastAsia="Calibri" w:cs="Calibri" w:asciiTheme="minorHAnsi" w:hAnsiTheme="minorHAnsi" w:eastAsiaTheme="minorHAnsi" w:csTheme="minorHAnsi"/>
+          <w:kern w:val="2"/>
+          <w:sz w:val="22"/>
+          <w:szCs w:val="22"/>
         </w:rPr>
         <w:t xml:space="preserve">El </w:t>
       </w:r>
       <w:r>
         <w:rPr>
-          <w:rFonts w:cstheme="minorHAnsi"/>
+          <w:rFonts w:ascii="Calibri" w:hAnsi="Calibri" w:eastAsia="Calibri" w:cs="Calibri" w:asciiTheme="minorHAnsi" w:hAnsiTheme="minorHAnsi" w:eastAsiaTheme="minorHAnsi" w:csTheme="minorHAnsi"/>
+          <w:kern w:val="2"/>
+          <w:sz w:val="22"/>
+          <w:szCs w:val="22"/>
         </w:rPr>
         <w:t>SINDICATO</w:t>
       </w:r>
       <w:r>
         <w:rPr>
-          <w:rFonts w:cstheme="minorHAnsi"/>
+          <w:rFonts w:ascii="Calibri" w:hAnsi="Calibri" w:eastAsia="Calibri" w:cs="Calibri" w:asciiTheme="minorHAnsi" w:hAnsiTheme="minorHAnsi" w:eastAsiaTheme="minorHAnsi" w:csTheme="minorHAnsi"/>
+          <w:kern w:val="2"/>
+          <w:sz w:val="22"/>
+          <w:szCs w:val="22"/>
         </w:rPr>
         <w:t xml:space="preserve"> espera que la empresa considere con seriedad sus propuestas. </w:t>
       </w:r>
       <w:r>
         <w:rPr>
-          <w:rFonts w:cstheme="minorHAnsi"/>
+          <w:rFonts w:ascii="Calibri" w:hAnsi="Calibri" w:eastAsia="Calibri" w:cs="Calibri" w:asciiTheme="minorHAnsi" w:hAnsiTheme="minorHAnsi" w:eastAsiaTheme="minorHAnsi" w:csTheme="minorHAnsi"/>
+          <w:kern w:val="2"/>
+          <w:sz w:val="22"/>
+          <w:szCs w:val="22"/>
         </w:rPr>
         <w:t>Estamos</w:t>
       </w:r>
       <w:r>
         <w:rPr>
-          <w:rFonts w:cstheme="minorHAnsi"/>
+          <w:rFonts w:ascii="Calibri" w:hAnsi="Calibri" w:eastAsia="Calibri" w:cs="Calibri" w:asciiTheme="minorHAnsi" w:hAnsiTheme="minorHAnsi" w:eastAsiaTheme="minorHAnsi" w:csTheme="minorHAnsi"/>
+          <w:kern w:val="2"/>
+          <w:sz w:val="22"/>
+          <w:szCs w:val="22"/>
         </w:rPr>
         <w:t xml:space="preserve"> comprometido</w:t>
       </w:r>
       <w:r>
         <w:rPr>
-          <w:rFonts w:cstheme="minorHAnsi"/>
+          <w:rFonts w:ascii="Calibri" w:hAnsi="Calibri" w:eastAsia="Calibri" w:cs="Calibri" w:asciiTheme="minorHAnsi" w:hAnsiTheme="minorHAnsi" w:eastAsiaTheme="minorHAnsi" w:csTheme="minorHAnsi"/>
+          <w:kern w:val="2"/>
+          <w:sz w:val="22"/>
+          <w:szCs w:val="22"/>
         </w:rPr>
         <w:t>s</w:t>
       </w:r>
       <w:r>
         <w:rPr>
-          <w:rFonts w:cstheme="minorHAnsi"/>
+          <w:rFonts w:ascii="Calibri" w:hAnsi="Calibri" w:eastAsia="Calibri" w:cs="Calibri" w:asciiTheme="minorHAnsi" w:hAnsiTheme="minorHAnsi" w:eastAsiaTheme="minorHAnsi" w:csTheme="minorHAnsi"/>
+          <w:kern w:val="2"/>
+          <w:sz w:val="22"/>
+          <w:szCs w:val="22"/>
         </w:rPr>
         <w:t xml:space="preserve"> </w:t>
       </w:r>
       <w:r>
         <w:rPr>
-          <w:rFonts w:cstheme="minorHAnsi"/>
+          <w:rFonts w:ascii="Calibri" w:hAnsi="Calibri" w:eastAsia="Calibri" w:cs="Calibri" w:asciiTheme="minorHAnsi" w:hAnsiTheme="minorHAnsi" w:eastAsiaTheme="minorHAnsi" w:csTheme="minorHAnsi"/>
+          <w:kern w:val="2"/>
+          <w:sz w:val="22"/>
+          <w:szCs w:val="22"/>
         </w:rPr>
         <w:t>en</w:t>
       </w:r>
       <w:r>
         <w:rPr>
-          <w:rFonts w:cstheme="minorHAnsi"/>
+          <w:rFonts w:ascii="Calibri" w:hAnsi="Calibri" w:eastAsia="Calibri" w:cs="Calibri" w:asciiTheme="minorHAnsi" w:hAnsiTheme="minorHAnsi" w:eastAsiaTheme="minorHAnsi" w:csTheme="minorHAnsi"/>
+          <w:kern w:val="2"/>
+          <w:sz w:val="22"/>
+          <w:szCs w:val="22"/>
         </w:rPr>
         <w:t xml:space="preserve"> negociar un contrato colectivo de trabajo que beneficie a todos los trabajadores de [Nombre de la empresa].</w:t>
       </w:r>
@@ -2296,12 +2675,15 @@
       <w:pPr>
         <w:jc w:val="both"/>
         <w:rPr>
-          <w:rFonts w:cstheme="minorHAnsi"/>
-        </w:rPr>
-      </w:pPr>
-      <w:r>
-        <w:rPr>
-          <w:rFonts w:cstheme="minorHAnsi"/>
+          <w:rFonts w:cs="Calibri" w:csTheme="minorHAnsi"/>
+        </w:rPr>
+      </w:pPr>
+      <w:r>
+        <w:rPr>
+          <w:rFonts w:ascii="Calibri" w:hAnsi="Calibri" w:eastAsia="Calibri" w:cs="Calibri" w:asciiTheme="minorHAnsi" w:hAnsiTheme="minorHAnsi" w:eastAsiaTheme="minorHAnsi" w:csTheme="minorHAnsi"/>
+          <w:kern w:val="2"/>
+          <w:sz w:val="22"/>
+          <w:szCs w:val="22"/>
         </w:rPr>
         <w:t>El SINDICATO está dispuesto a negociar el monto de la aportación sindical, pero considera que es una cantidad justa y razonable. La cuota sindical se utiliza para financiar las actividades del sindicato, que son esenciales para representar y defender a los trabajadores ante la empresa y las autoridades laborales.</w:t>
       </w:r>
@@ -2310,12 +2692,15 @@
       <w:pPr>
         <w:jc w:val="both"/>
         <w:rPr>
-          <w:rFonts w:cstheme="minorHAnsi"/>
-        </w:rPr>
-      </w:pPr>
-      <w:r>
-        <w:rPr>
-          <w:rFonts w:cstheme="minorHAnsi"/>
+          <w:rFonts w:cs="Calibri" w:csTheme="minorHAnsi"/>
+        </w:rPr>
+      </w:pPr>
+      <w:r>
+        <w:rPr>
+          <w:rFonts w:ascii="Calibri" w:hAnsi="Calibri" w:eastAsia="Calibri" w:cs="Calibri" w:asciiTheme="minorHAnsi" w:hAnsiTheme="minorHAnsi" w:eastAsiaTheme="minorHAnsi" w:csTheme="minorHAnsi"/>
+          <w:kern w:val="2"/>
+          <w:sz w:val="22"/>
+          <w:szCs w:val="22"/>
         </w:rPr>
         <w:t>El SINDICATO espera que la empresa esté dispuesta a negociar de buena fe y a llegar a un acuerdo que beneficie a ambas partes.</w:t>
       </w:r>
@@ -2324,16 +2709,19 @@
       <w:pPr>
         <w:jc w:val="center"/>
         <w:rPr>
-          <w:rFonts w:cstheme="minorHAnsi"/>
-          <w:b/>
-          <w:bCs/>
-        </w:rPr>
-      </w:pPr>
-      <w:r>
-        <w:rPr>
-          <w:rFonts w:cstheme="minorHAnsi"/>
-          <w:b/>
-          <w:bCs/>
+          <w:rFonts w:cs="Calibri" w:csTheme="minorHAnsi"/>
+          <w:b/>
+          <w:bCs/>
+        </w:rPr>
+      </w:pPr>
+      <w:r>
+        <w:rPr>
+          <w:rFonts w:ascii="Calibri" w:hAnsi="Calibri" w:eastAsia="Calibri" w:cs="Calibri" w:asciiTheme="minorHAnsi" w:hAnsiTheme="minorHAnsi" w:eastAsiaTheme="minorHAnsi" w:csTheme="minorHAnsi"/>
+          <w:b/>
+          <w:bCs/>
+          <w:kern w:val="2"/>
+          <w:sz w:val="22"/>
+          <w:szCs w:val="22"/>
         </w:rPr>
         <w:t>MEDIOS DE CONTACTO:</w:t>
       </w:r>
@@ -2341,12 +2729,15 @@
     <w:p>
       <w:pPr>
         <w:rPr>
-          <w:rFonts w:cstheme="minorHAnsi"/>
-        </w:rPr>
-      </w:pPr>
-      <w:r>
-        <w:rPr>
-          <w:rFonts w:cstheme="minorHAnsi"/>
+          <w:rFonts w:cs="Calibri" w:csTheme="minorHAnsi"/>
+        </w:rPr>
+      </w:pPr>
+      <w:r>
+        <w:rPr>
+          <w:rFonts w:ascii="Calibri" w:hAnsi="Calibri" w:eastAsia="Calibri" w:cs="Calibri" w:asciiTheme="minorHAnsi" w:hAnsiTheme="minorHAnsi" w:eastAsiaTheme="minorHAnsi" w:csTheme="minorHAnsi"/>
+          <w:kern w:val="2"/>
+          <w:sz w:val="22"/>
+          <w:szCs w:val="22"/>
         </w:rPr>
         <w:t>En caso de aceptación o en caso de que tenga propuestas diversas a las establecidas en la presente, estamos abiertos a reunirnos con usted lo antes posible, por lo que ponemos a su disposición los siguientes medios de contacto:</w:t>
       </w:r>
@@ -2354,26 +2745,35 @@
     <w:p>
       <w:pPr>
         <w:rPr>
-          <w:rFonts w:cstheme="minorHAnsi"/>
+          <w:rFonts w:cs="Calibri" w:csTheme="minorHAnsi"/>
           <w:color w:val="C00000"/>
         </w:rPr>
       </w:pPr>
       <w:r>
         <w:rPr>
-          <w:rFonts w:cstheme="minorHAnsi"/>
+          <w:rFonts w:ascii="Calibri" w:hAnsi="Calibri" w:eastAsia="Calibri" w:cs="Calibri" w:asciiTheme="minorHAnsi" w:hAnsiTheme="minorHAnsi" w:eastAsiaTheme="minorHAnsi" w:csTheme="minorHAnsi"/>
+          <w:kern w:val="2"/>
+          <w:sz w:val="22"/>
+          <w:szCs w:val="22"/>
         </w:rPr>
         <w:t>Teléfono:</w:t>
       </w:r>
       <w:r>
         <w:rPr>
-          <w:rFonts w:cstheme="minorHAnsi"/>
+          <w:rFonts w:ascii="Calibri" w:hAnsi="Calibri" w:eastAsia="Calibri" w:cs="Calibri" w:asciiTheme="minorHAnsi" w:hAnsiTheme="minorHAnsi" w:eastAsiaTheme="minorHAnsi" w:csTheme="minorHAnsi"/>
+          <w:kern w:val="2"/>
+          <w:sz w:val="22"/>
+          <w:szCs w:val="22"/>
         </w:rPr>
         <w:t xml:space="preserve"> </w:t>
       </w:r>
       <w:r>
         <w:rPr>
-          <w:rFonts w:cstheme="minorHAnsi"/>
+          <w:rFonts w:ascii="Calibri" w:hAnsi="Calibri" w:eastAsia="Calibri" w:cs="Calibri" w:asciiTheme="minorHAnsi" w:hAnsiTheme="minorHAnsi" w:eastAsiaTheme="minorHAnsi" w:csTheme="minorHAnsi"/>
           <w:color w:val="FF0000"/>
+          <w:kern w:val="2"/>
+          <w:sz w:val="22"/>
+          <w:szCs w:val="22"/>
         </w:rPr>
         <w:t>{{TELEFONO}}</w:t>
       </w:r>
@@ -2381,40 +2781,55 @@
     <w:p>
       <w:pPr>
         <w:rPr>
-          <w:rFonts w:cstheme="minorHAnsi"/>
+          <w:rFonts w:cs="Calibri" w:csTheme="minorHAnsi"/>
           <w:color w:val="FF0000"/>
         </w:rPr>
       </w:pPr>
       <w:r>
         <w:rPr>
-          <w:rFonts w:cstheme="minorHAnsi"/>
+          <w:rFonts w:ascii="Calibri" w:hAnsi="Calibri" w:eastAsia="Calibri" w:cs="Calibri" w:asciiTheme="minorHAnsi" w:hAnsiTheme="minorHAnsi" w:eastAsiaTheme="minorHAnsi" w:csTheme="minorHAnsi"/>
+          <w:kern w:val="2"/>
+          <w:sz w:val="22"/>
+          <w:szCs w:val="22"/>
         </w:rPr>
         <w:t>Correo:</w:t>
       </w:r>
       <w:r>
         <w:rPr>
-          <w:rFonts w:cstheme="minorHAnsi"/>
+          <w:rFonts w:ascii="Calibri" w:hAnsi="Calibri" w:eastAsia="Calibri" w:cs="Calibri" w:asciiTheme="minorHAnsi" w:hAnsiTheme="minorHAnsi" w:eastAsiaTheme="minorHAnsi" w:csTheme="minorHAnsi"/>
+          <w:kern w:val="2"/>
+          <w:sz w:val="22"/>
+          <w:szCs w:val="22"/>
         </w:rPr>
         <w:t xml:space="preserve"> </w:t>
       </w:r>
       <w:r>
         <w:rPr>
-          <w:rFonts w:cstheme="minorHAnsi"/>
+          <w:rFonts w:ascii="Calibri" w:hAnsi="Calibri" w:eastAsia="Calibri" w:cs="Calibri" w:asciiTheme="minorHAnsi" w:hAnsiTheme="minorHAnsi" w:eastAsiaTheme="minorHAnsi" w:csTheme="minorHAnsi"/>
           <w:color w:val="FF0000"/>
+          <w:kern w:val="2"/>
+          <w:sz w:val="22"/>
+          <w:szCs w:val="22"/>
         </w:rPr>
         <w:t>{{CORREO</w:t>
       </w:r>
       <w:r>
         <w:rPr>
-          <w:rFonts w:cstheme="minorHAnsi"/>
+          <w:rFonts w:ascii="Calibri" w:hAnsi="Calibri" w:eastAsia="Calibri" w:cs="Calibri" w:asciiTheme="minorHAnsi" w:hAnsiTheme="minorHAnsi" w:eastAsiaTheme="minorHAnsi" w:csTheme="minorHAnsi"/>
           <w:color w:val="FF0000"/>
+          <w:kern w:val="2"/>
+          <w:sz w:val="22"/>
+          <w:szCs w:val="22"/>
         </w:rPr>
         <w:t>_</w:t>
       </w:r>
       <w:r>
         <w:rPr>
-          <w:rFonts w:cstheme="minorHAnsi"/>
+          <w:rFonts w:ascii="Calibri" w:hAnsi="Calibri" w:eastAsia="Calibri" w:cs="Calibri" w:asciiTheme="minorHAnsi" w:hAnsiTheme="minorHAnsi" w:eastAsiaTheme="minorHAnsi" w:csTheme="minorHAnsi"/>
           <w:color w:val="FF0000"/>
+          <w:kern w:val="2"/>
+          <w:sz w:val="22"/>
+          <w:szCs w:val="22"/>
         </w:rPr>
         <w:t>ELECTRONICO}}</w:t>
       </w:r>
@@ -2423,18 +2838,21 @@
       <w:pPr>
         <w:jc w:val="center"/>
         <w:rPr>
-          <w:rFonts w:cstheme="minorHAnsi"/>
-          <w:b/>
-          <w:bCs/>
-        </w:rPr>
-      </w:pPr>
-      <w:r>
-        <w:rPr>
-          <w:rFonts w:cstheme="minorHAnsi"/>
-          <w:b/>
-          <w:bCs/>
-        </w:rPr>
+          <w:rFonts w:cs="Calibri" w:csTheme="minorHAnsi"/>
+          <w:b/>
+          <w:bCs/>
+        </w:rPr>
+      </w:pPr>
+      <w:r>
         <w:lastRenderedPageBreak/>
+        <w:rPr>
+          <w:rFonts w:ascii="Calibri" w:hAnsi="Calibri" w:eastAsia="Calibri" w:cs="Calibri" w:asciiTheme="minorHAnsi" w:hAnsiTheme="minorHAnsi" w:eastAsiaTheme="minorHAnsi" w:csTheme="minorHAnsi"/>
+          <w:b/>
+          <w:bCs/>
+          <w:kern w:val="2"/>
+          <w:sz w:val="22"/>
+          <w:szCs w:val="22"/>
+        </w:rPr>
         <w:t>A T E N T A M E N T E</w:t>
       </w:r>
     </w:p>
@@ -2442,7 +2860,7 @@
       <w:pPr>
         <w:jc w:val="center"/>
         <w:rPr>
-          <w:rFonts w:cstheme="minorHAnsi"/>
+          <w:rFonts w:cs="Calibri" w:csTheme="minorHAnsi"/>
         </w:rPr>
       </w:pPr>
     </w:p>
@@ -2450,12 +2868,15 @@
       <w:pPr>
         <w:jc w:val="center"/>
         <w:rPr>
-          <w:rFonts w:cstheme="minorHAnsi"/>
-        </w:rPr>
-      </w:pPr>
-      <w:r>
-        <w:rPr>
-          <w:rFonts w:cstheme="minorHAnsi"/>
+          <w:rFonts w:cs="Calibri" w:csTheme="minorHAnsi"/>
+        </w:rPr>
+      </w:pPr>
+      <w:r>
+        <w:rPr>
+          <w:rFonts w:ascii="Calibri" w:hAnsi="Calibri" w:eastAsia="Calibri" w:cs="Calibri" w:asciiTheme="minorHAnsi" w:hAnsiTheme="minorHAnsi" w:eastAsiaTheme="minorHAnsi" w:csTheme="minorHAnsi"/>
+          <w:kern w:val="2"/>
+          <w:sz w:val="22"/>
+          <w:szCs w:val="22"/>
         </w:rPr>
         <w:t>_____________________</w:t>
       </w:r>
@@ -2464,18 +2885,24 @@
       <w:pPr>
         <w:jc w:val="center"/>
         <w:rPr>
-          <w:rFonts w:cstheme="minorHAnsi"/>
-        </w:rPr>
-      </w:pPr>
-      <w:r>
-        <w:rPr>
-          <w:rFonts w:cstheme="minorHAnsi"/>
+          <w:rFonts w:cs="Calibri" w:csTheme="minorHAnsi"/>
+        </w:rPr>
+      </w:pPr>
+      <w:r>
+        <w:rPr>
+          <w:rFonts w:ascii="Calibri" w:hAnsi="Calibri" w:eastAsia="Calibri" w:cs="Calibri" w:asciiTheme="minorHAnsi" w:hAnsiTheme="minorHAnsi" w:eastAsiaTheme="minorHAnsi" w:csTheme="minorHAnsi"/>
+          <w:kern w:val="2"/>
+          <w:sz w:val="22"/>
+          <w:szCs w:val="22"/>
         </w:rPr>
         <w:t>SINDICATO</w:t>
       </w:r>
       <w:r>
         <w:rPr>
-          <w:rFonts w:cstheme="minorHAnsi"/>
+          <w:rFonts w:ascii="Calibri" w:hAnsi="Calibri" w:eastAsia="Calibri" w:cs="Calibri" w:asciiTheme="minorHAnsi" w:hAnsiTheme="minorHAnsi" w:eastAsiaTheme="minorHAnsi" w:csTheme="minorHAnsi"/>
+          <w:kern w:val="2"/>
+          <w:sz w:val="22"/>
+          <w:szCs w:val="22"/>
         </w:rPr>
         <w:t>.</w:t>
       </w:r>
@@ -2484,12 +2911,15 @@
       <w:pPr>
         <w:jc w:val="center"/>
         <w:rPr>
-          <w:rFonts w:cstheme="minorHAnsi"/>
-        </w:rPr>
-      </w:pPr>
-      <w:r>
-        <w:rPr>
-          <w:rFonts w:cstheme="minorHAnsi"/>
+          <w:rFonts w:cs="Calibri" w:csTheme="minorHAnsi"/>
+        </w:rPr>
+      </w:pPr>
+      <w:r>
+        <w:rPr>
+          <w:rFonts w:ascii="Calibri" w:hAnsi="Calibri" w:eastAsia="Calibri" w:cs="Calibri" w:asciiTheme="minorHAnsi" w:hAnsiTheme="minorHAnsi" w:eastAsiaTheme="minorHAnsi" w:csTheme="minorHAnsi"/>
+          <w:kern w:val="2"/>
+          <w:sz w:val="22"/>
+          <w:szCs w:val="22"/>
         </w:rPr>
         <w:t>SECRETARIO.</w:t>
       </w:r>
@@ -2498,7 +2928,7 @@
       <w:pPr>
         <w:jc w:val="center"/>
         <w:rPr>
-          <w:rFonts w:cstheme="minorHAnsi"/>
+          <w:rFonts w:cs="Calibri" w:csTheme="minorHAnsi"/>
         </w:rPr>
       </w:pPr>
     </w:p>
@@ -2506,34 +2936,41 @@
       <w:pPr>
         <w:jc w:val="center"/>
         <w:rPr>
-          <w:rFonts w:cstheme="minorHAnsi"/>
-          <w:b/>
-          <w:bCs/>
-        </w:rPr>
-      </w:pPr>
-      <w:r>
-        <w:rPr>
-          <w:rFonts w:cstheme="minorHAnsi"/>
-          <w:b/>
-          <w:bCs/>
+          <w:rFonts w:cs="Calibri" w:csTheme="minorHAnsi"/>
+          <w:b/>
+          <w:bCs/>
+        </w:rPr>
+      </w:pPr>
+      <w:r>
+        <w:rPr>
+          <w:rFonts w:ascii="Calibri" w:hAnsi="Calibri" w:eastAsia="Calibri" w:cs="Calibri" w:asciiTheme="minorHAnsi" w:hAnsiTheme="minorHAnsi" w:eastAsiaTheme="minorHAnsi" w:csTheme="minorHAnsi"/>
+          <w:b/>
+          <w:bCs/>
+          <w:kern w:val="2"/>
+          <w:sz w:val="22"/>
+          <w:szCs w:val="22"/>
         </w:rPr>
         <w:t xml:space="preserve">A C E P T A C I </w:t>
       </w:r>
-      <w:proofErr w:type="spellStart"/>
-      <w:r>
-        <w:rPr>
-          <w:rFonts w:cstheme="minorHAnsi"/>
-          <w:b/>
-          <w:bCs/>
+      <w:r>
+        <w:rPr>
+          <w:rFonts w:ascii="Calibri" w:hAnsi="Calibri" w:eastAsia="Calibri" w:cs="Calibri" w:asciiTheme="minorHAnsi" w:hAnsiTheme="minorHAnsi" w:eastAsiaTheme="minorHAnsi" w:csTheme="minorHAnsi"/>
+          <w:b/>
+          <w:bCs/>
+          <w:kern w:val="2"/>
+          <w:sz w:val="22"/>
+          <w:szCs w:val="22"/>
         </w:rPr>
         <w:t>Ó</w:t>
       </w:r>
-      <w:proofErr w:type="spellEnd"/>
-      <w:r>
-        <w:rPr>
-          <w:rFonts w:cstheme="minorHAnsi"/>
-          <w:b/>
-          <w:bCs/>
+      <w:r>
+        <w:rPr>
+          <w:rFonts w:ascii="Calibri" w:hAnsi="Calibri" w:eastAsia="Calibri" w:cs="Calibri" w:asciiTheme="minorHAnsi" w:hAnsiTheme="minorHAnsi" w:eastAsiaTheme="minorHAnsi" w:csTheme="minorHAnsi"/>
+          <w:b/>
+          <w:bCs/>
+          <w:kern w:val="2"/>
+          <w:sz w:val="22"/>
+          <w:szCs w:val="22"/>
         </w:rPr>
         <w:t xml:space="preserve"> N:</w:t>
       </w:r>
@@ -2542,12 +2979,15 @@
       <w:pPr>
         <w:jc w:val="both"/>
         <w:rPr>
-          <w:rFonts w:cstheme="minorHAnsi"/>
-        </w:rPr>
-      </w:pPr>
-      <w:r>
-        <w:rPr>
-          <w:rFonts w:cstheme="minorHAnsi"/>
+          <w:rFonts w:cs="Calibri" w:csTheme="minorHAnsi"/>
+        </w:rPr>
+      </w:pPr>
+      <w:r>
+        <w:rPr>
+          <w:rFonts w:ascii="Calibri" w:hAnsi="Calibri" w:eastAsia="Calibri" w:cs="Calibri" w:asciiTheme="minorHAnsi" w:hAnsiTheme="minorHAnsi" w:eastAsiaTheme="minorHAnsi" w:csTheme="minorHAnsi"/>
+          <w:kern w:val="2"/>
+          <w:sz w:val="22"/>
+          <w:szCs w:val="22"/>
         </w:rPr>
         <w:t>En caso, de que las propuestas establecidas en la presente propuesta de negociación sean aceptadas por su administración favor de remitir la presente con firma en original del represente legal, anexando copia de la Identificación Oficial del mismo.</w:t>
       </w:r>
@@ -2556,7 +2996,7 @@
       <w:pPr>
         <w:jc w:val="center"/>
         <w:rPr>
-          <w:rFonts w:cstheme="minorHAnsi"/>
+          <w:rFonts w:cs="Calibri" w:csTheme="minorHAnsi"/>
         </w:rPr>
       </w:pPr>
     </w:p>
@@ -2564,130 +3004,181 @@
       <w:pPr>
         <w:jc w:val="center"/>
         <w:rPr>
-          <w:rFonts w:cstheme="minorHAnsi"/>
-        </w:rPr>
-      </w:pPr>
-      <w:r>
-        <w:rPr>
-          <w:rFonts w:cstheme="minorHAnsi"/>
+          <w:rFonts w:cs="Calibri" w:csTheme="minorHAnsi"/>
+        </w:rPr>
+      </w:pPr>
+      <w:r>
+        <w:rPr>
+          <w:rFonts w:ascii="Calibri" w:hAnsi="Calibri" w:eastAsia="Calibri" w:cs="Calibri" w:asciiTheme="minorHAnsi" w:hAnsiTheme="minorHAnsi" w:eastAsiaTheme="minorHAnsi" w:csTheme="minorHAnsi"/>
           <w:color w:val="FF0000"/>
+          <w:kern w:val="2"/>
+          <w:sz w:val="22"/>
+          <w:szCs w:val="22"/>
         </w:rPr>
         <w:t>Día</w:t>
       </w:r>
       <w:r>
         <w:rPr>
-          <w:rFonts w:cstheme="minorHAnsi"/>
+          <w:rFonts w:ascii="Calibri" w:hAnsi="Calibri" w:eastAsia="Calibri" w:cs="Calibri" w:asciiTheme="minorHAnsi" w:hAnsiTheme="minorHAnsi" w:eastAsiaTheme="minorHAnsi" w:csTheme="minorHAnsi"/>
           <w:color w:val="FF0000"/>
+          <w:kern w:val="2"/>
+          <w:sz w:val="22"/>
+          <w:szCs w:val="22"/>
         </w:rPr>
         <w:t xml:space="preserve"> </w:t>
       </w:r>
       <w:r>
         <w:rPr>
-          <w:rFonts w:cstheme="minorHAnsi"/>
+          <w:rFonts w:ascii="Calibri" w:hAnsi="Calibri" w:eastAsia="Calibri" w:cs="Calibri" w:asciiTheme="minorHAnsi" w:hAnsiTheme="minorHAnsi" w:eastAsiaTheme="minorHAnsi" w:csTheme="minorHAnsi"/>
           <w:color w:val="FF0000"/>
+          <w:kern w:val="2"/>
+          <w:sz w:val="22"/>
+          <w:szCs w:val="22"/>
         </w:rPr>
         <w:t>{{</w:t>
       </w:r>
       <w:r>
         <w:rPr>
-          <w:rFonts w:cstheme="minorHAnsi"/>
+          <w:rFonts w:ascii="Calibri" w:hAnsi="Calibri" w:eastAsia="Calibri" w:cs="Calibri" w:asciiTheme="minorHAnsi" w:hAnsiTheme="minorHAnsi" w:eastAsiaTheme="minorHAnsi" w:csTheme="minorHAnsi"/>
           <w:color w:val="FF0000"/>
+          <w:kern w:val="2"/>
+          <w:sz w:val="22"/>
+          <w:szCs w:val="22"/>
           <w:u w:val="single"/>
         </w:rPr>
         <w:t>DIA</w:t>
       </w:r>
       <w:r>
         <w:rPr>
-          <w:rFonts w:cstheme="minorHAnsi"/>
+          <w:rFonts w:ascii="Calibri" w:hAnsi="Calibri" w:eastAsia="Calibri" w:cs="Calibri" w:asciiTheme="minorHAnsi" w:hAnsiTheme="minorHAnsi" w:eastAsiaTheme="minorHAnsi" w:csTheme="minorHAnsi"/>
           <w:color w:val="FF0000"/>
+          <w:kern w:val="2"/>
+          <w:sz w:val="22"/>
+          <w:szCs w:val="22"/>
         </w:rPr>
         <w:t>}}</w:t>
       </w:r>
       <w:r>
         <w:rPr>
-          <w:rFonts w:cstheme="minorHAnsi"/>
+          <w:rFonts w:ascii="Calibri" w:hAnsi="Calibri" w:eastAsia="Calibri" w:cs="Calibri" w:asciiTheme="minorHAnsi" w:hAnsiTheme="minorHAnsi" w:eastAsiaTheme="minorHAnsi" w:csTheme="minorHAnsi"/>
           <w:color w:val="FF0000"/>
+          <w:kern w:val="2"/>
+          <w:sz w:val="22"/>
+          <w:szCs w:val="22"/>
         </w:rPr>
         <w:t xml:space="preserve"> del mes </w:t>
       </w:r>
       <w:r>
         <w:rPr>
-          <w:rFonts w:cstheme="minorHAnsi"/>
+          <w:rFonts w:ascii="Calibri" w:hAnsi="Calibri" w:eastAsia="Calibri" w:cs="Calibri" w:asciiTheme="minorHAnsi" w:hAnsiTheme="minorHAnsi" w:eastAsiaTheme="minorHAnsi" w:csTheme="minorHAnsi"/>
           <w:color w:val="FF0000"/>
+          <w:kern w:val="2"/>
+          <w:sz w:val="22"/>
+          <w:szCs w:val="22"/>
         </w:rPr>
         <w:t>{{</w:t>
       </w:r>
       <w:r>
         <w:rPr>
-          <w:rFonts w:cstheme="minorHAnsi"/>
+          <w:rFonts w:ascii="Calibri" w:hAnsi="Calibri" w:eastAsia="Calibri" w:cs="Calibri" w:asciiTheme="minorHAnsi" w:hAnsiTheme="minorHAnsi" w:eastAsiaTheme="minorHAnsi" w:csTheme="minorHAnsi"/>
           <w:color w:val="FF0000"/>
+          <w:kern w:val="2"/>
+          <w:sz w:val="22"/>
+          <w:szCs w:val="22"/>
           <w:u w:val="single"/>
         </w:rPr>
         <w:t>MES</w:t>
       </w:r>
       <w:r>
         <w:rPr>
-          <w:rFonts w:cstheme="minorHAnsi"/>
+          <w:rFonts w:ascii="Calibri" w:hAnsi="Calibri" w:eastAsia="Calibri" w:cs="Calibri" w:asciiTheme="minorHAnsi" w:hAnsiTheme="minorHAnsi" w:eastAsiaTheme="minorHAnsi" w:csTheme="minorHAnsi"/>
           <w:color w:val="FF0000"/>
+          <w:kern w:val="2"/>
+          <w:sz w:val="22"/>
+          <w:szCs w:val="22"/>
         </w:rPr>
         <w:t>}}</w:t>
       </w:r>
       <w:r>
         <w:rPr>
-          <w:rFonts w:cstheme="minorHAnsi"/>
+          <w:rFonts w:ascii="Calibri" w:hAnsi="Calibri" w:eastAsia="Calibri" w:cs="Calibri" w:asciiTheme="minorHAnsi" w:hAnsiTheme="minorHAnsi" w:eastAsiaTheme="minorHAnsi" w:csTheme="minorHAnsi"/>
           <w:color w:val="FF0000"/>
+          <w:kern w:val="2"/>
+          <w:sz w:val="22"/>
+          <w:szCs w:val="22"/>
         </w:rPr>
         <w:t xml:space="preserve"> </w:t>
       </w:r>
       <w:r>
         <w:rPr>
-          <w:rFonts w:cstheme="minorHAnsi"/>
+          <w:rFonts w:ascii="Calibri" w:hAnsi="Calibri" w:eastAsia="Calibri" w:cs="Calibri" w:asciiTheme="minorHAnsi" w:hAnsiTheme="minorHAnsi" w:eastAsiaTheme="minorHAnsi" w:csTheme="minorHAnsi"/>
           <w:color w:val="FF0000"/>
+          <w:kern w:val="2"/>
+          <w:sz w:val="22"/>
+          <w:szCs w:val="22"/>
         </w:rPr>
         <w:t xml:space="preserve">del año </w:t>
       </w:r>
       <w:r>
         <w:rPr>
-          <w:rFonts w:cstheme="minorHAnsi"/>
+          <w:rFonts w:ascii="Calibri" w:hAnsi="Calibri" w:eastAsia="Calibri" w:cs="Calibri" w:asciiTheme="minorHAnsi" w:hAnsiTheme="minorHAnsi" w:eastAsiaTheme="minorHAnsi" w:csTheme="minorHAnsi"/>
           <w:color w:val="FF0000"/>
+          <w:kern w:val="2"/>
+          <w:sz w:val="22"/>
+          <w:szCs w:val="22"/>
         </w:rPr>
         <w:t>{{</w:t>
       </w:r>
       <w:r>
         <w:rPr>
-          <w:rFonts w:cstheme="minorHAnsi"/>
+          <w:rFonts w:ascii="Calibri" w:hAnsi="Calibri" w:eastAsia="Calibri" w:cs="Calibri" w:asciiTheme="minorHAnsi" w:hAnsiTheme="minorHAnsi" w:eastAsiaTheme="minorHAnsi" w:csTheme="minorHAnsi"/>
           <w:color w:val="FF0000"/>
+          <w:kern w:val="2"/>
+          <w:sz w:val="22"/>
+          <w:szCs w:val="22"/>
           <w:u w:val="single"/>
         </w:rPr>
         <w:t>A</w:t>
       </w:r>
       <w:r>
         <w:rPr>
-          <w:rFonts w:cstheme="minorHAnsi"/>
+          <w:rFonts w:ascii="Calibri" w:hAnsi="Calibri" w:eastAsia="Calibri" w:cs="Calibri" w:asciiTheme="minorHAnsi" w:hAnsiTheme="minorHAnsi" w:eastAsiaTheme="minorHAnsi" w:csTheme="minorHAnsi"/>
           <w:color w:val="FF0000"/>
+          <w:kern w:val="2"/>
+          <w:sz w:val="22"/>
+          <w:szCs w:val="22"/>
           <w:u w:val="single"/>
         </w:rPr>
         <w:t>Ñ</w:t>
       </w:r>
       <w:r>
         <w:rPr>
-          <w:rFonts w:cstheme="minorHAnsi"/>
+          <w:rFonts w:ascii="Calibri" w:hAnsi="Calibri" w:eastAsia="Calibri" w:cs="Calibri" w:asciiTheme="minorHAnsi" w:hAnsiTheme="minorHAnsi" w:eastAsiaTheme="minorHAnsi" w:csTheme="minorHAnsi"/>
           <w:color w:val="FF0000"/>
+          <w:kern w:val="2"/>
+          <w:sz w:val="22"/>
+          <w:szCs w:val="22"/>
           <w:u w:val="single"/>
         </w:rPr>
         <w:t>O</w:t>
       </w:r>
       <w:r>
         <w:rPr>
-          <w:rFonts w:cstheme="minorHAnsi"/>
+          <w:rFonts w:ascii="Calibri" w:hAnsi="Calibri" w:eastAsia="Calibri" w:cs="Calibri" w:asciiTheme="minorHAnsi" w:hAnsiTheme="minorHAnsi" w:eastAsiaTheme="minorHAnsi" w:csTheme="minorHAnsi"/>
           <w:color w:val="FF0000"/>
+          <w:kern w:val="2"/>
+          <w:sz w:val="22"/>
+          <w:szCs w:val="22"/>
         </w:rPr>
         <w:t>}}</w:t>
       </w:r>
       <w:r>
         <w:rPr>
-          <w:rFonts w:cstheme="minorHAnsi"/>
+          <w:rFonts w:ascii="Calibri" w:hAnsi="Calibri" w:eastAsia="Calibri" w:cs="Calibri" w:asciiTheme="minorHAnsi" w:hAnsiTheme="minorHAnsi" w:eastAsiaTheme="minorHAnsi" w:csTheme="minorHAnsi"/>
           <w:color w:val="FF0000"/>
+          <w:kern w:val="2"/>
+          <w:sz w:val="22"/>
+          <w:szCs w:val="22"/>
         </w:rPr>
         <w:t>.</w:t>
       </w:r>
@@ -2696,7 +3187,7 @@
       <w:pPr>
         <w:jc w:val="center"/>
         <w:rPr>
-          <w:rFonts w:cstheme="minorHAnsi"/>
+          <w:rFonts w:cs="Calibri" w:csTheme="minorHAnsi"/>
         </w:rPr>
       </w:pPr>
     </w:p>
@@ -2704,7 +3195,7 @@
       <w:pPr>
         <w:jc w:val="center"/>
         <w:rPr>
-          <w:rFonts w:cstheme="minorHAnsi"/>
+          <w:rFonts w:cs="Calibri" w:csTheme="minorHAnsi"/>
         </w:rPr>
       </w:pPr>
     </w:p>
@@ -2712,12 +3203,15 @@
       <w:pPr>
         <w:jc w:val="center"/>
         <w:rPr>
-          <w:rFonts w:cstheme="minorHAnsi"/>
-        </w:rPr>
-      </w:pPr>
-      <w:r>
-        <w:rPr>
-          <w:rFonts w:cstheme="minorHAnsi"/>
+          <w:rFonts w:cs="Calibri" w:csTheme="minorHAnsi"/>
+        </w:rPr>
+      </w:pPr>
+      <w:r>
+        <w:rPr>
+          <w:rFonts w:ascii="Calibri" w:hAnsi="Calibri" w:eastAsia="Calibri" w:cs="Calibri" w:asciiTheme="minorHAnsi" w:hAnsiTheme="minorHAnsi" w:eastAsiaTheme="minorHAnsi" w:csTheme="minorHAnsi"/>
+          <w:kern w:val="2"/>
+          <w:sz w:val="22"/>
+          <w:szCs w:val="22"/>
         </w:rPr>
         <w:t>__________________________</w:t>
       </w:r>
@@ -2726,16 +3220,19 @@
       <w:pPr>
         <w:jc w:val="center"/>
         <w:rPr>
-          <w:rFonts w:cstheme="minorHAnsi"/>
-          <w:b/>
-          <w:bCs/>
-        </w:rPr>
-      </w:pPr>
-      <w:r>
-        <w:rPr>
-          <w:rFonts w:cstheme="minorHAnsi"/>
-          <w:b/>
-          <w:bCs/>
+          <w:rFonts w:cs="Calibri" w:csTheme="minorHAnsi"/>
+          <w:b/>
+          <w:bCs/>
+        </w:rPr>
+      </w:pPr>
+      <w:r>
+        <w:rPr>
+          <w:rFonts w:ascii="Calibri" w:hAnsi="Calibri" w:eastAsia="Calibri" w:cs="Calibri" w:asciiTheme="minorHAnsi" w:hAnsiTheme="minorHAnsi" w:eastAsiaTheme="minorHAnsi" w:csTheme="minorHAnsi"/>
+          <w:b/>
+          <w:bCs/>
+          <w:kern w:val="2"/>
+          <w:sz w:val="22"/>
+          <w:szCs w:val="22"/>
         </w:rPr>
         <w:t>NOMBRE:</w:t>
       </w:r>
@@ -2744,174 +3241,189 @@
       <w:pPr>
         <w:jc w:val="center"/>
         <w:rPr>
-          <w:rFonts w:cstheme="minorHAnsi"/>
+          <w:rFonts w:cs="Calibri" w:csTheme="minorHAnsi"/>
           <w:b/>
           <w:bCs/>
           <w:color w:val="FF0000"/>
         </w:rPr>
       </w:pPr>
       <w:r>
-        <w:rPr>
-          <w:rFonts w:cstheme="minorHAnsi"/>
+        <w:t xml:space="preserve">  </w:t>
+      </w:r>
+    </w:p>
+    <w:p>
+      <w:pPr>
+        <w:spacing w:after="160" w:line="259" w:lineRule="auto"/>
+      </w:pPr>
+      <w:r>
+        <w:tab/>
+      </w:r>
+      <w:r>
+        <w:tab/>
+      </w:r>
+      <w:r>
+        <w:tab/>
+      </w:r>
+      <w:r>
+        <w:tab/>
+      </w:r>
+      <w:r>
+        <w:tab/>
+      </w:r>
+      <w:r>
+        <w:rPr>
+          <w:rFonts w:ascii="Calibri" w:cs="Calibri"/>
           <w:color w:val="FF0000"/>
-        </w:rPr>
-        <w:t xml:space="preserve"> </w:t>
-      </w:r>
-      <w:r>
-        <w:rPr>
-          <w:rFonts w:cstheme="minorHAnsi"/>
+          <w:kern w:val="2"/>
+          <w:sz w:val="22"/>
+          <w:szCs w:val="22"/>
+        </w:rPr>
+        <w:t>{{LA_PATRONAL}}</w:t>
+      </w:r>
+    </w:p>
+    <w:p>
+      <w:pPr>
+        <w:jc w:val="center"/>
+        <w:rPr>
+          <w:rFonts w:cs="Calibri" w:csTheme="minorHAnsi"/>
+          <w:b/>
+          <w:bCs/>
+        </w:rPr>
+      </w:pPr>
+      <w:r>
+        <w:rPr>
+          <w:rFonts w:ascii="Calibri" w:hAnsi="Calibri" w:eastAsia="Calibri" w:cs="Calibri" w:asciiTheme="minorHAnsi" w:hAnsiTheme="minorHAnsi" w:eastAsiaTheme="minorHAnsi" w:csTheme="minorHAnsi"/>
+          <w:b/>
+          <w:bCs/>
+          <w:color w:val="C00000"/>
+          <w:kern w:val="2"/>
+          <w:sz w:val="22"/>
+          <w:szCs w:val="22"/>
+        </w:rPr>
+        <w:t xml:space="preserve">REPRESENTANTE/APODERADO </w:t>
+      </w:r>
+      <w:r>
+        <w:rPr>
+          <w:rFonts w:ascii="Calibri" w:hAnsi="Calibri" w:eastAsia="Calibri" w:cs="Calibri" w:asciiTheme="minorHAnsi" w:hAnsiTheme="minorHAnsi" w:eastAsiaTheme="minorHAnsi" w:csTheme="minorHAnsi"/>
+          <w:b/>
+          <w:bCs/>
+          <w:kern w:val="2"/>
+          <w:sz w:val="22"/>
+          <w:szCs w:val="22"/>
+        </w:rPr>
+        <w:t>LEGAL</w:t>
+      </w:r>
+    </w:p>
+    <w:p>
+      <w:pPr>
+        <w:jc w:val="center"/>
+        <w:rPr>
+          <w:rFonts w:cs="Calibri" w:csTheme="minorHAnsi"/>
+          <w:b/>
+          <w:bCs/>
+        </w:rPr>
+      </w:pPr>
+      <w:r>
+        <w:rPr>
+          <w:rFonts w:ascii="Calibri" w:hAnsi="Calibri" w:eastAsia="Calibri" w:cs="Calibri" w:asciiTheme="minorHAnsi" w:hAnsiTheme="minorHAnsi" w:eastAsiaTheme="minorHAnsi" w:csTheme="minorHAnsi"/>
+          <w:b/>
+          <w:bCs/>
+          <w:kern w:val="2"/>
+          <w:sz w:val="22"/>
+          <w:szCs w:val="22"/>
+        </w:rPr>
+        <w:t xml:space="preserve">DE </w:t>
+      </w:r>
+      <w:r>
+        <w:rPr>
+          <w:rFonts w:ascii="Calibri" w:hAnsi="Calibri" w:eastAsia="Calibri" w:cs="Calibri" w:asciiTheme="minorHAnsi" w:hAnsiTheme="minorHAnsi" w:eastAsiaTheme="minorHAnsi" w:csTheme="minorHAnsi"/>
           <w:color w:val="FF0000"/>
-        </w:rPr>
-        <w:t>{{NOMBRE</w:t>
-      </w:r>
-      <w:r>
-        <w:rPr>
-          <w:rFonts w:cstheme="minorHAnsi"/>
+          <w:kern w:val="2"/>
+          <w:sz w:val="22"/>
+          <w:szCs w:val="22"/>
+        </w:rPr>
+        <w:t>{{APODERADO</w:t>
+      </w:r>
+      <w:r>
+        <w:rPr>
+          <w:rFonts w:ascii="Calibri" w:hAnsi="Calibri" w:eastAsia="Calibri" w:cs="Calibri" w:asciiTheme="minorHAnsi" w:hAnsiTheme="minorHAnsi" w:eastAsiaTheme="minorHAnsi" w:csTheme="minorHAnsi"/>
           <w:color w:val="FF0000"/>
+          <w:kern w:val="2"/>
+          <w:sz w:val="22"/>
+          <w:szCs w:val="22"/>
         </w:rPr>
         <w:t>_</w:t>
       </w:r>
       <w:r>
         <w:rPr>
-          <w:rFonts w:cstheme="minorHAnsi"/>
+          <w:rFonts w:ascii="Calibri" w:hAnsi="Calibri" w:eastAsia="Calibri" w:cs="Calibri" w:asciiTheme="minorHAnsi" w:hAnsiTheme="minorHAnsi" w:eastAsiaTheme="minorHAnsi" w:csTheme="minorHAnsi"/>
           <w:color w:val="FF0000"/>
-        </w:rPr>
-        <w:t>FIRMA</w:t>
-      </w:r>
-      <w:r>
-        <w:rPr>
-          <w:rFonts w:cstheme="minorHAnsi"/>
-          <w:color w:val="FF0000"/>
-        </w:rPr>
-        <w:t xml:space="preserve">}} </w:t>
+          <w:kern w:val="2"/>
+          <w:sz w:val="22"/>
+          <w:szCs w:val="22"/>
+        </w:rPr>
+        <w:t>LEGAL}}</w:t>
       </w:r>
     </w:p>
     <w:p>
       <w:pPr>
         <w:jc w:val="center"/>
         <w:rPr>
-          <w:rFonts w:cstheme="minorHAnsi"/>
-          <w:b/>
-          <w:bCs/>
-        </w:rPr>
-      </w:pPr>
-      <w:r>
-        <w:rPr>
-          <w:rFonts w:cstheme="minorHAnsi"/>
-          <w:b/>
-          <w:bCs/>
-          <w:color w:val="C00000"/>
-        </w:rPr>
-        <w:t xml:space="preserve">REPRESENTANTE/APODERADO </w:t>
-      </w:r>
-      <w:r>
-        <w:rPr>
-          <w:rFonts w:cstheme="minorHAnsi"/>
-          <w:b/>
-          <w:bCs/>
-        </w:rPr>
-        <w:t>LEGAL</w:t>
-      </w:r>
+          <w:rFonts w:cs="Calibri" w:csTheme="minorHAnsi"/>
+        </w:rPr>
+      </w:pPr>
     </w:p>
     <w:p>
       <w:pPr>
         <w:jc w:val="center"/>
         <w:rPr>
-          <w:rFonts w:cstheme="minorHAnsi"/>
-          <w:b/>
-          <w:bCs/>
-        </w:rPr>
-      </w:pPr>
-      <w:r>
-        <w:rPr>
-          <w:rFonts w:cstheme="minorHAnsi"/>
-          <w:b/>
-          <w:bCs/>
-        </w:rPr>
-        <w:t xml:space="preserve">DE </w:t>
-      </w:r>
-      <w:r>
-        <w:rPr>
-          <w:rFonts w:cstheme="minorHAnsi"/>
-          <w:color w:val="FF0000"/>
-        </w:rPr>
-        <w:t>{{APODERADO</w:t>
-      </w:r>
-      <w:r>
-        <w:rPr>
-          <w:rFonts w:cstheme="minorHAnsi"/>
-          <w:color w:val="FF0000"/>
-        </w:rPr>
-        <w:t>_</w:t>
-      </w:r>
-      <w:r>
-        <w:rPr>
-          <w:rFonts w:cstheme="minorHAnsi"/>
-          <w:color w:val="FF0000"/>
-        </w:rPr>
-        <w:t>LEGAL}}</w:t>
-      </w:r>
+          <w:rFonts w:cs="Calibri" w:csTheme="minorHAnsi"/>
+        </w:rPr>
+      </w:pPr>
     </w:p>
     <w:p>
       <w:pPr>
         <w:jc w:val="center"/>
         <w:rPr>
-          <w:rFonts w:cstheme="minorHAnsi"/>
-        </w:rPr>
-      </w:pPr>
-    </w:p>
-    <w:p>
-      <w:pPr>
-        <w:jc w:val="center"/>
-        <w:rPr>
-          <w:rFonts w:cstheme="minorHAnsi"/>
-        </w:rPr>
-      </w:pPr>
-    </w:p>
-    <w:p>
-      <w:pPr>
-        <w:jc w:val="center"/>
-        <w:rPr>
-          <w:rFonts w:cstheme="minorHAnsi"/>
-        </w:rPr>
-      </w:pPr>
-    </w:p>
-    <w:p>
-      <w:pPr>
-        <w:jc w:val="both"/>
-        <w:rPr>
-          <w:rFonts w:cstheme="minorHAnsi"/>
-        </w:rPr>
-      </w:pPr>
-    </w:p>
-    <w:p>
-      <w:pPr>
-        <w:jc w:val="both"/>
-        <w:rPr>
-          <w:rFonts w:cstheme="minorHAnsi"/>
-        </w:rPr>
-      </w:pPr>
-    </w:p>
-    <w:p>
-      <w:pPr>
-        <w:jc w:val="both"/>
-        <w:rPr>
-          <w:rFonts w:cstheme="minorHAnsi"/>
-        </w:rPr>
-      </w:pPr>
-    </w:p>
-    <w:p>
-      <w:pPr>
-        <w:jc w:val="both"/>
-        <w:rPr>
-          <w:rFonts w:cstheme="minorHAnsi"/>
+          <w:rFonts w:cs="Calibri" w:csTheme="minorHAnsi"/>
+        </w:rPr>
+      </w:pPr>
+    </w:p>
+    <w:p>
+      <w:pPr>
+        <w:jc w:val="both"/>
+        <w:rPr>
+          <w:rFonts w:cs="Calibri" w:csTheme="minorHAnsi"/>
+        </w:rPr>
+      </w:pPr>
+    </w:p>
+    <w:p>
+      <w:pPr>
+        <w:jc w:val="both"/>
+        <w:rPr>
+          <w:rFonts w:cs="Calibri" w:csTheme="minorHAnsi"/>
+        </w:rPr>
+      </w:pPr>
+    </w:p>
+    <w:p>
+      <w:pPr>
+        <w:jc w:val="both"/>
+        <w:rPr>
+          <w:rFonts w:cs="Calibri" w:csTheme="minorHAnsi"/>
+        </w:rPr>
+      </w:pPr>
+    </w:p>
+    <w:p>
+      <w:pPr>
+        <w:jc w:val="both"/>
+        <w:rPr>
+          <w:rFonts w:cs="Calibri" w:csTheme="minorHAnsi"/>
         </w:rPr>
       </w:pPr>
     </w:p>
     <w:sectPr>
       <w:pgSz w:w="12240" w:h="15840"/>
       <w:pgMar w:top="1417" w:right="1701" w:bottom="1417" w:left="1701" w:header="708" w:footer="708" w:gutter="0"/>
-      <w:cols w:space="708"/>
       <w:docGrid w:linePitch="360"/>
     </w:sectPr>
   </w:body>

</xml_diff>